<commit_message>
Update CV template layout and fix date mapping, references, and project structure
</commit_message>
<xml_diff>
--- a/templates/cv-template.docx
+++ b/templates/cv-template.docx
@@ -411,10 +411,18 @@
       <w:r>
         <w:rPr>
           <w:rFonts w:cs="Segoe UI"/>
+          <w:sz w:val="24"/>
+          <w:szCs w:val="24"/>
+        </w:rPr>
+        <w:t>•</w:t>
+      </w:r>
+      <w:r>
+        <w:rPr>
+          <w:rFonts w:cs="Segoe UI"/>
           <w:sz w:val="21"/>
           <w:szCs w:val="21"/>
         </w:rPr>
-        <w:t>• {.}</w:t>
+        <w:t xml:space="preserve"> {.}</w:t>
       </w:r>
     </w:p>
     <w:p>
@@ -696,10 +704,18 @@
       <w:r>
         <w:rPr>
           <w:rFonts w:cs="Segoe UI"/>
+          <w:sz w:val="24"/>
+          <w:szCs w:val="24"/>
+        </w:rPr>
+        <w:t>•</w:t>
+      </w:r>
+      <w:r>
+        <w:rPr>
+          <w:rFonts w:cs="Segoe UI"/>
           <w:sz w:val="21"/>
           <w:szCs w:val="21"/>
         </w:rPr>
-        <w:t>• {.}</w:t>
+        <w:t xml:space="preserve"> {.}</w:t>
       </w:r>
     </w:p>
     <w:p>
@@ -796,7 +812,6 @@
           <w:sz w:val="24"/>
           <w:szCs w:val="24"/>
         </w:rPr>
-        <w:lastRenderedPageBreak/>
         <w:t>EDUCATION</w:t>
       </w:r>
     </w:p>
@@ -851,6 +866,7 @@
           <w:sz w:val="21"/>
           <w:szCs w:val="21"/>
         </w:rPr>
+        <w:lastRenderedPageBreak/>
         <w:t>{degree}</w:t>
       </w:r>
     </w:p>
@@ -1226,7 +1242,7 @@
           <w:sz w:val="21"/>
           <w:szCs w:val="21"/>
         </w:rPr>
-        <w:t>section_title</w:t>
+        <w:t>section_content</w:t>
       </w:r>
       <w:proofErr w:type="spellEnd"/>
       <w:r>
@@ -1253,7 +1269,7 @@
           <w:sz w:val="21"/>
           <w:szCs w:val="21"/>
         </w:rPr>
-        <w:t>{</w:t>
+        <w:t>{/</w:t>
       </w:r>
       <w:proofErr w:type="spellStart"/>
       <w:r>
@@ -1262,7 +1278,7 @@
           <w:sz w:val="21"/>
           <w:szCs w:val="21"/>
         </w:rPr>
-        <w:t>section_content</w:t>
+        <w:t>extra_sections</w:t>
       </w:r>
       <w:proofErr w:type="spellEnd"/>
       <w:r>
@@ -1289,42 +1305,6 @@
           <w:sz w:val="21"/>
           <w:szCs w:val="21"/>
         </w:rPr>
-        <w:t>{/</w:t>
-      </w:r>
-      <w:proofErr w:type="spellStart"/>
-      <w:r>
-        <w:rPr>
-          <w:rFonts w:cs="Segoe UI"/>
-          <w:sz w:val="21"/>
-          <w:szCs w:val="21"/>
-        </w:rPr>
-        <w:t>extra_sections</w:t>
-      </w:r>
-      <w:proofErr w:type="spellEnd"/>
-      <w:r>
-        <w:rPr>
-          <w:rFonts w:cs="Segoe UI"/>
-          <w:sz w:val="21"/>
-          <w:szCs w:val="21"/>
-        </w:rPr>
-        <w:t>}</w:t>
-      </w:r>
-    </w:p>
-    <w:p>
-      <w:pPr>
-        <w:spacing w:after="60" w:line="22" w:lineRule="atLeast"/>
-        <w:rPr>
-          <w:rFonts w:cs="Segoe UI"/>
-          <w:sz w:val="21"/>
-          <w:szCs w:val="21"/>
-        </w:rPr>
-      </w:pPr>
-      <w:r>
-        <w:rPr>
-          <w:rFonts w:cs="Segoe UI"/>
-          <w:sz w:val="21"/>
-          <w:szCs w:val="21"/>
-        </w:rPr>
         <w:t>{/HAS_EXTRA}</w:t>
       </w:r>
     </w:p>
@@ -1370,6 +1350,16 @@
         </w:rPr>
         <w:t>REFERENCE</w:t>
       </w:r>
+      <w:r>
+        <w:rPr>
+          <w:rFonts w:cs="Segoe UI"/>
+          <w:b/>
+          <w:bCs/>
+          <w:sz w:val="24"/>
+          <w:szCs w:val="24"/>
+        </w:rPr>
+        <w:t>S</w:t>
+      </w:r>
     </w:p>
     <w:p>
       <w:pPr>
@@ -1408,9 +1398,9 @@
       </w:r>
     </w:p>
     <w:sectPr>
-      <w:footerReference w:type="default" r:id="rId8"/>
-      <w:pgSz w:w="12240" w:h="15840"/>
-      <w:pgMar w:top="1152" w:right="1152" w:bottom="1152" w:left="1152" w:header="720" w:footer="720" w:gutter="0"/>
+      <w:headerReference w:type="default" r:id="rId8"/>
+      <w:pgSz w:w="11909" w:h="16834" w:code="9"/>
+      <w:pgMar w:top="1152" w:right="1152" w:bottom="1152" w:left="1987" w:header="720" w:footer="720" w:gutter="0"/>
       <w:cols w:space="720"/>
       <w:docGrid w:linePitch="360"/>
     </w:sectPr>
@@ -1443,16 +1433,6 @@
 </w:endnotes>
 </file>
 
-<file path=word/footer1.xml><?xml version="1.0" encoding="utf-8"?>
-<w:ftr xmlns:wpc="http://schemas.microsoft.com/office/word/2010/wordprocessingCanvas" xmlns:cx="http://schemas.microsoft.com/office/drawing/2014/chartex" xmlns:cx1="http://schemas.microsoft.com/office/drawing/2015/9/8/chartex" xmlns:cx2="http://schemas.microsoft.com/office/drawing/2015/10/21/chartex" xmlns:cx3="http://schemas.microsoft.com/office/drawing/2016/5/9/chartex" xmlns:cx4="http://schemas.microsoft.com/office/drawing/2016/5/10/chartex" xmlns:cx5="http://schemas.microsoft.com/office/drawing/2016/5/11/chartex" xmlns:cx6="http://schemas.microsoft.com/office/drawing/2016/5/12/chartex" xmlns:cx7="http://schemas.microsoft.com/office/drawing/2016/5/13/chartex" xmlns:cx8="http://schemas.microsoft.com/office/drawing/2016/5/14/chartex" xmlns:mc="http://schemas.openxmlformats.org/markup-compatibility/2006" xmlns:aink="http://schemas.microsoft.com/office/drawing/2016/ink" xmlns:am3d="http://schemas.microsoft.com/office/drawing/2017/model3d" xmlns:o="urn:schemas-microsoft-com:office:office" xmlns:r="http://schemas.openxmlformats.org/officeDocument/2006/relationships" xmlns:m="http://schemas.openxmlformats.org/officeDocument/2006/math" xmlns:v="urn:schemas-microsoft-com:vml" xmlns:wp14="http://schemas.microsoft.com/office/word/2010/wordprocessingDrawing" xmlns:wp="http://schemas.openxmlformats.org/drawingml/2006/wordprocessingDrawing" xmlns:w10="urn:schemas-microsoft-com:office:word" xmlns:w="http://schemas.openxmlformats.org/wordprocessingml/2006/main" xmlns:w14="http://schemas.microsoft.com/office/word/2010/wordml" xmlns:w15="http://schemas.microsoft.com/office/word/2012/wordml" xmlns:w16cex="http://schemas.microsoft.com/office/word/2018/wordml/cex" xmlns:w16cid="http://schemas.microsoft.com/office/word/2016/wordml/cid" xmlns:w16="http://schemas.microsoft.com/office/word/2018/wordml" xmlns:w16sdtdh="http://schemas.microsoft.com/office/word/2020/wordml/sdtdatahash" xmlns:w16se="http://schemas.microsoft.com/office/word/2015/wordml/symex" xmlns:wpg="http://schemas.microsoft.com/office/word/2010/wordprocessingGroup" xmlns:wpi="http://schemas.microsoft.com/office/word/2010/wordprocessingInk" xmlns:wne="http://schemas.microsoft.com/office/word/2006/wordml" xmlns:wps="http://schemas.microsoft.com/office/word/2010/wordprocessingShape" mc:Ignorable="w14 w15 w16se w16cid w16 w16cex w16sdtdh wp14">
-  <w:p>
-    <w:pPr>
-      <w:pStyle w:val="Footer"/>
-    </w:pPr>
-  </w:p>
-</w:ftr>
-</file>
-
 <file path=word/footnotes.xml><?xml version="1.0" encoding="utf-8"?>
 <w:footnotes xmlns:wpc="http://schemas.microsoft.com/office/word/2010/wordprocessingCanvas" xmlns:cx="http://schemas.microsoft.com/office/drawing/2014/chartex" xmlns:cx1="http://schemas.microsoft.com/office/drawing/2015/9/8/chartex" xmlns:cx2="http://schemas.microsoft.com/office/drawing/2015/10/21/chartex" xmlns:cx3="http://schemas.microsoft.com/office/drawing/2016/5/9/chartex" xmlns:cx4="http://schemas.microsoft.com/office/drawing/2016/5/10/chartex" xmlns:cx5="http://schemas.microsoft.com/office/drawing/2016/5/11/chartex" xmlns:cx6="http://schemas.microsoft.com/office/drawing/2016/5/12/chartex" xmlns:cx7="http://schemas.microsoft.com/office/drawing/2016/5/13/chartex" xmlns:cx8="http://schemas.microsoft.com/office/drawing/2016/5/14/chartex" xmlns:mc="http://schemas.openxmlformats.org/markup-compatibility/2006" xmlns:aink="http://schemas.microsoft.com/office/drawing/2016/ink" xmlns:am3d="http://schemas.microsoft.com/office/drawing/2017/model3d" xmlns:o="urn:schemas-microsoft-com:office:office" xmlns:r="http://schemas.openxmlformats.org/officeDocument/2006/relationships" xmlns:m="http://schemas.openxmlformats.org/officeDocument/2006/math" xmlns:v="urn:schemas-microsoft-com:vml" xmlns:wp14="http://schemas.microsoft.com/office/word/2010/wordprocessingDrawing" xmlns:wp="http://schemas.openxmlformats.org/drawingml/2006/wordprocessingDrawing" xmlns:w10="urn:schemas-microsoft-com:office:word" xmlns:w="http://schemas.openxmlformats.org/wordprocessingml/2006/main" xmlns:w14="http://schemas.microsoft.com/office/word/2010/wordml" xmlns:w15="http://schemas.microsoft.com/office/word/2012/wordml" xmlns:w16cex="http://schemas.microsoft.com/office/word/2018/wordml/cex" xmlns:w16cid="http://schemas.microsoft.com/office/word/2016/wordml/cid" xmlns:w16="http://schemas.microsoft.com/office/word/2018/wordml" xmlns:w16sdtdh="http://schemas.microsoft.com/office/word/2020/wordml/sdtdatahash" xmlns:w16se="http://schemas.microsoft.com/office/word/2015/wordml/symex" xmlns:wpg="http://schemas.microsoft.com/office/word/2010/wordprocessingGroup" xmlns:wpi="http://schemas.microsoft.com/office/word/2010/wordprocessingInk" xmlns:wne="http://schemas.microsoft.com/office/word/2006/wordml" xmlns:wps="http://schemas.microsoft.com/office/word/2010/wordprocessingShape" mc:Ignorable="w14 w15 w16se w16cid w16 w16cex w16sdtdh wp14">
   <w:footnote w:type="separator" w:id="-1">
@@ -1476,6 +1456,96 @@
     </w:p>
   </w:footnote>
 </w:footnotes>
+</file>
+
+<file path=word/header1.xml><?xml version="1.0" encoding="utf-8"?>
+<w:hdr xmlns:wpc="http://schemas.microsoft.com/office/word/2010/wordprocessingCanvas" xmlns:cx="http://schemas.microsoft.com/office/drawing/2014/chartex" xmlns:cx1="http://schemas.microsoft.com/office/drawing/2015/9/8/chartex" xmlns:cx2="http://schemas.microsoft.com/office/drawing/2015/10/21/chartex" xmlns:cx3="http://schemas.microsoft.com/office/drawing/2016/5/9/chartex" xmlns:cx4="http://schemas.microsoft.com/office/drawing/2016/5/10/chartex" xmlns:cx5="http://schemas.microsoft.com/office/drawing/2016/5/11/chartex" xmlns:cx6="http://schemas.microsoft.com/office/drawing/2016/5/12/chartex" xmlns:cx7="http://schemas.microsoft.com/office/drawing/2016/5/13/chartex" xmlns:cx8="http://schemas.microsoft.com/office/drawing/2016/5/14/chartex" xmlns:mc="http://schemas.openxmlformats.org/markup-compatibility/2006" xmlns:aink="http://schemas.microsoft.com/office/drawing/2016/ink" xmlns:am3d="http://schemas.microsoft.com/office/drawing/2017/model3d" xmlns:o="urn:schemas-microsoft-com:office:office" xmlns:r="http://schemas.openxmlformats.org/officeDocument/2006/relationships" xmlns:m="http://schemas.openxmlformats.org/officeDocument/2006/math" xmlns:v="urn:schemas-microsoft-com:vml" xmlns:wp14="http://schemas.microsoft.com/office/word/2010/wordprocessingDrawing" xmlns:wp="http://schemas.openxmlformats.org/drawingml/2006/wordprocessingDrawing" xmlns:w10="urn:schemas-microsoft-com:office:word" xmlns:w="http://schemas.openxmlformats.org/wordprocessingml/2006/main" xmlns:w14="http://schemas.microsoft.com/office/word/2010/wordml" xmlns:w15="http://schemas.microsoft.com/office/word/2012/wordml" xmlns:w16cex="http://schemas.microsoft.com/office/word/2018/wordml/cex" xmlns:w16cid="http://schemas.microsoft.com/office/word/2016/wordml/cid" xmlns:w16="http://schemas.microsoft.com/office/word/2018/wordml" xmlns:w16sdtdh="http://schemas.microsoft.com/office/word/2020/wordml/sdtdatahash" xmlns:w16se="http://schemas.microsoft.com/office/word/2015/wordml/symex" xmlns:wpg="http://schemas.microsoft.com/office/word/2010/wordprocessingGroup" xmlns:wpi="http://schemas.microsoft.com/office/word/2010/wordprocessingInk" xmlns:wne="http://schemas.microsoft.com/office/word/2006/wordml" xmlns:wps="http://schemas.microsoft.com/office/word/2010/wordprocessingShape" mc:Ignorable="w14 w15 w16se w16cid w16 w16cex w16sdtdh wp14">
+  <w:p>
+    <w:pPr>
+      <w:pStyle w:val="Header"/>
+    </w:pPr>
+    <w:r>
+      <w:rPr>
+        <w:noProof/>
+      </w:rPr>
+      <mc:AlternateContent>
+        <mc:Choice Requires="wps">
+          <w:drawing>
+            <wp:anchor distT="0" distB="0" distL="114300" distR="114300" simplePos="0" relativeHeight="251659264" behindDoc="0" locked="0" layoutInCell="1" allowOverlap="1" wp14:anchorId="1AFD5195" wp14:editId="28DDB54A">
+              <wp:simplePos x="0" y="0"/>
+              <wp:positionH relativeFrom="column">
+                <wp:posOffset>-1341755</wp:posOffset>
+              </wp:positionH>
+              <wp:positionV relativeFrom="paragraph">
+                <wp:posOffset>-525780</wp:posOffset>
+              </wp:positionV>
+              <wp:extent cx="1169670" cy="10782300"/>
+              <wp:effectExtent l="57150" t="19050" r="49530" b="76200"/>
+              <wp:wrapNone/>
+              <wp:docPr id="2" name="Rectangle 2"/>
+              <wp:cNvGraphicFramePr/>
+              <a:graphic xmlns:a="http://schemas.openxmlformats.org/drawingml/2006/main">
+                <a:graphicData uri="http://schemas.microsoft.com/office/word/2010/wordprocessingShape">
+                  <wps:wsp>
+                    <wps:cNvSpPr/>
+                    <wps:spPr>
+                      <a:xfrm>
+                        <a:off x="0" y="0"/>
+                        <a:ext cx="1169670" cy="10782300"/>
+                      </a:xfrm>
+                      <a:prstGeom prst="rect">
+                        <a:avLst/>
+                      </a:prstGeom>
+                      <a:solidFill>
+                        <a:srgbClr val="ECECEC"/>
+                      </a:solidFill>
+                      <a:ln>
+                        <a:noFill/>
+                      </a:ln>
+                    </wps:spPr>
+                    <wps:style>
+                      <a:lnRef idx="1">
+                        <a:schemeClr val="accent1"/>
+                      </a:lnRef>
+                      <a:fillRef idx="3">
+                        <a:schemeClr val="accent1"/>
+                      </a:fillRef>
+                      <a:effectRef idx="2">
+                        <a:schemeClr val="accent1"/>
+                      </a:effectRef>
+                      <a:fontRef idx="minor">
+                        <a:schemeClr val="lt1"/>
+                      </a:fontRef>
+                    </wps:style>
+                    <wps:bodyPr rot="0" spcFirstLastPara="0" vertOverflow="overflow" horzOverflow="overflow" vert="horz" wrap="square" lIns="91440" tIns="45720" rIns="91440" bIns="45720" numCol="1" spcCol="0" rtlCol="0" fromWordArt="0" anchor="ctr" anchorCtr="0" forceAA="0" compatLnSpc="1">
+                      <a:prstTxWarp prst="textNoShape">
+                        <a:avLst/>
+                      </a:prstTxWarp>
+                      <a:noAutofit/>
+                    </wps:bodyPr>
+                  </wps:wsp>
+                </a:graphicData>
+              </a:graphic>
+              <wp14:sizeRelH relativeFrom="margin">
+                <wp14:pctWidth>0</wp14:pctWidth>
+              </wp14:sizeRelH>
+              <wp14:sizeRelV relativeFrom="margin">
+                <wp14:pctHeight>0</wp14:pctHeight>
+              </wp14:sizeRelV>
+            </wp:anchor>
+          </w:drawing>
+        </mc:Choice>
+        <mc:Fallback>
+          <w:pict>
+            <v:rect w14:anchorId="6B95D688" id="Rectangle 2" o:spid="_x0000_s1026" style="position:absolute;margin-left:-105.65pt;margin-top:-41.4pt;width:92.1pt;height:849pt;z-index:251659264;visibility:visible;mso-wrap-style:square;mso-width-percent:0;mso-height-percent:0;mso-wrap-distance-left:9pt;mso-wrap-distance-top:0;mso-wrap-distance-right:9pt;mso-wrap-distance-bottom:0;mso-position-horizontal:absolute;mso-position-horizontal-relative:text;mso-position-vertical:absolute;mso-position-vertical-relative:text;mso-width-percent:0;mso-height-percent:0;mso-width-relative:margin;mso-height-relative:margin;v-text-anchor:middle" o:gfxdata="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" fillcolor="#ececec" stroked="f">
+              <v:shadow on="t" color="black" opacity="22937f" origin=",.5" offset="0,.63889mm"/>
+            </v:rect>
+          </w:pict>
+        </mc:Fallback>
+      </mc:AlternateContent>
+    </w:r>
+  </w:p>
+</w:hdr>
 </file>
 
 <file path=word/numbering.xml><?xml version="1.0" encoding="utf-8"?>

</xml_diff>

<commit_message>
Finalize CV reference logic, template updates, and clean server script
</commit_message>
<xml_diff>
--- a/templates/cv-template.docx
+++ b/templates/cv-template.docx
@@ -8,6 +8,7 @@
           <w:rFonts w:cs="Segoe UI"/>
           <w:b/>
           <w:bCs/>
+          <w:color w:val="1A2634"/>
           <w:sz w:val="34"/>
           <w:szCs w:val="34"/>
         </w:rPr>
@@ -17,6 +18,7 @@
           <w:rFonts w:cs="Segoe UI"/>
           <w:b/>
           <w:bCs/>
+          <w:color w:val="1A2634"/>
           <w:sz w:val="34"/>
           <w:szCs w:val="34"/>
         </w:rPr>
@@ -27,6 +29,7 @@
       <w:pPr>
         <w:rPr>
           <w:rFonts w:cs="Segoe UI"/>
+          <w:color w:val="1A2634"/>
           <w:sz w:val="21"/>
           <w:szCs w:val="21"/>
         </w:rPr>
@@ -34,6 +37,7 @@
       <w:r>
         <w:rPr>
           <w:rFonts w:cs="Segoe UI"/>
+          <w:color w:val="1A2634"/>
           <w:sz w:val="21"/>
           <w:szCs w:val="21"/>
         </w:rPr>
@@ -50,6 +54,7 @@
           <w:rFonts w:cs="Segoe UI"/>
           <w:b/>
           <w:bCs/>
+          <w:color w:val="1A2634"/>
           <w:sz w:val="24"/>
           <w:szCs w:val="24"/>
         </w:rPr>
@@ -59,6 +64,7 @@
           <w:rFonts w:cs="Segoe UI"/>
           <w:b/>
           <w:bCs/>
+          <w:color w:val="1A2634"/>
           <w:sz w:val="24"/>
           <w:szCs w:val="24"/>
         </w:rPr>
@@ -70,6 +76,7 @@
         <w:spacing w:after="60" w:line="22" w:lineRule="atLeast"/>
         <w:rPr>
           <w:rFonts w:cs="Segoe UI"/>
+          <w:color w:val="1A2634"/>
           <w:sz w:val="21"/>
           <w:szCs w:val="21"/>
         </w:rPr>
@@ -77,6 +84,7 @@
       <w:r>
         <w:rPr>
           <w:rFonts w:cs="Segoe UI"/>
+          <w:color w:val="1A2634"/>
           <w:sz w:val="21"/>
           <w:szCs w:val="21"/>
         </w:rPr>
@@ -93,6 +101,7 @@
           <w:rFonts w:cs="Segoe UI"/>
           <w:b/>
           <w:bCs/>
+          <w:color w:val="1A2634"/>
           <w:sz w:val="24"/>
           <w:szCs w:val="24"/>
         </w:rPr>
@@ -102,6 +111,7 @@
           <w:rFonts w:cs="Segoe UI"/>
           <w:b/>
           <w:bCs/>
+          <w:color w:val="1A2634"/>
           <w:sz w:val="24"/>
           <w:szCs w:val="24"/>
         </w:rPr>
@@ -113,6 +123,7 @@
         <w:spacing w:after="60" w:line="22" w:lineRule="atLeast"/>
         <w:rPr>
           <w:rFonts w:cs="Segoe UI"/>
+          <w:color w:val="1A2634"/>
           <w:sz w:val="21"/>
           <w:szCs w:val="21"/>
         </w:rPr>
@@ -120,6 +131,7 @@
       <w:r>
         <w:rPr>
           <w:rFonts w:cs="Segoe UI"/>
+          <w:color w:val="1A2634"/>
           <w:sz w:val="21"/>
           <w:szCs w:val="21"/>
         </w:rPr>
@@ -131,6 +143,7 @@
         <w:spacing w:after="0" w:line="22" w:lineRule="atLeast"/>
         <w:rPr>
           <w:rFonts w:cs="Segoe UI"/>
+          <w:color w:val="1A2634"/>
           <w:sz w:val="21"/>
           <w:szCs w:val="21"/>
         </w:rPr>
@@ -138,6 +151,7 @@
       <w:r>
         <w:rPr>
           <w:rFonts w:cs="Segoe UI"/>
+          <w:color w:val="1A2634"/>
           <w:sz w:val="21"/>
           <w:szCs w:val="21"/>
         </w:rPr>
@@ -154,6 +168,7 @@
           <w:rFonts w:cs="Segoe UI"/>
           <w:b/>
           <w:bCs/>
+          <w:color w:val="1A2634"/>
           <w:sz w:val="24"/>
           <w:szCs w:val="24"/>
         </w:rPr>
@@ -163,6 +178,7 @@
           <w:rFonts w:cs="Segoe UI"/>
           <w:b/>
           <w:bCs/>
+          <w:color w:val="1A2634"/>
           <w:sz w:val="24"/>
           <w:szCs w:val="24"/>
         </w:rPr>
@@ -174,6 +190,7 @@
         <w:spacing w:after="60" w:line="22" w:lineRule="atLeast"/>
         <w:rPr>
           <w:rFonts w:cs="Segoe UI"/>
+          <w:color w:val="1A2634"/>
           <w:sz w:val="21"/>
           <w:szCs w:val="21"/>
         </w:rPr>
@@ -181,6 +198,7 @@
       <w:r>
         <w:rPr>
           <w:rFonts w:cs="Segoe UI"/>
+          <w:color w:val="1A2634"/>
           <w:sz w:val="21"/>
           <w:szCs w:val="21"/>
         </w:rPr>
@@ -192,6 +210,7 @@
         <w:spacing w:after="60" w:line="22" w:lineRule="atLeast"/>
         <w:rPr>
           <w:rFonts w:cs="Segoe UI"/>
+          <w:color w:val="1A2634"/>
           <w:sz w:val="21"/>
           <w:szCs w:val="21"/>
         </w:rPr>
@@ -199,6 +218,7 @@
       <w:r>
         <w:rPr>
           <w:rFonts w:cs="Segoe UI"/>
+          <w:color w:val="1A2634"/>
           <w:sz w:val="21"/>
           <w:szCs w:val="21"/>
         </w:rPr>
@@ -212,6 +232,7 @@
           <w:rFonts w:cs="Segoe UI"/>
           <w:b/>
           <w:bCs/>
+          <w:color w:val="1A2634"/>
           <w:sz w:val="21"/>
           <w:szCs w:val="21"/>
         </w:rPr>
@@ -221,6 +242,7 @@
           <w:rFonts w:cs="Segoe UI"/>
           <w:b/>
           <w:bCs/>
+          <w:color w:val="1A2634"/>
           <w:sz w:val="21"/>
           <w:szCs w:val="21"/>
         </w:rPr>
@@ -232,6 +254,7 @@
         <w:spacing w:after="60" w:line="22" w:lineRule="atLeast"/>
         <w:rPr>
           <w:rFonts w:cs="Segoe UI"/>
+          <w:color w:val="1A2634"/>
           <w:sz w:val="21"/>
           <w:szCs w:val="21"/>
         </w:rPr>
@@ -241,6 +264,7 @@
           <w:rFonts w:cs="Segoe UI"/>
           <w:b/>
           <w:bCs/>
+          <w:color w:val="1A2634"/>
           <w:sz w:val="21"/>
           <w:szCs w:val="21"/>
         </w:rPr>
@@ -249,6 +273,7 @@
       <w:r>
         <w:rPr>
           <w:rFonts w:cs="Segoe UI"/>
+          <w:color w:val="1A2634"/>
           <w:sz w:val="21"/>
           <w:szCs w:val="21"/>
         </w:rPr>
@@ -260,6 +285,7 @@
         <w:spacing w:after="60" w:line="22" w:lineRule="atLeast"/>
         <w:rPr>
           <w:rFonts w:cs="Segoe UI"/>
+          <w:color w:val="1A2634"/>
           <w:sz w:val="21"/>
           <w:szCs w:val="21"/>
         </w:rPr>
@@ -267,6 +293,7 @@
       <w:r>
         <w:rPr>
           <w:rFonts w:cs="Segoe UI"/>
+          <w:color w:val="1A2634"/>
           <w:sz w:val="21"/>
           <w:szCs w:val="21"/>
         </w:rPr>
@@ -276,6 +303,7 @@
       <w:r>
         <w:rPr>
           <w:rFonts w:cs="Segoe UI"/>
+          <w:color w:val="1A2634"/>
           <w:sz w:val="21"/>
           <w:szCs w:val="21"/>
         </w:rPr>
@@ -285,6 +313,7 @@
       <w:r>
         <w:rPr>
           <w:rFonts w:cs="Segoe UI"/>
+          <w:color w:val="1A2634"/>
           <w:sz w:val="21"/>
           <w:szCs w:val="21"/>
         </w:rPr>
@@ -296,6 +325,7 @@
         <w:spacing w:after="60" w:line="22" w:lineRule="atLeast"/>
         <w:rPr>
           <w:rFonts w:cs="Segoe UI"/>
+          <w:color w:val="1A2634"/>
           <w:sz w:val="21"/>
           <w:szCs w:val="21"/>
         </w:rPr>
@@ -303,6 +333,7 @@
       <w:r>
         <w:rPr>
           <w:rFonts w:cs="Segoe UI"/>
+          <w:color w:val="1A2634"/>
           <w:sz w:val="21"/>
           <w:szCs w:val="21"/>
         </w:rPr>
@@ -314,6 +345,7 @@
         <w:spacing w:after="60" w:line="22" w:lineRule="atLeast"/>
         <w:rPr>
           <w:rFonts w:cs="Segoe UI"/>
+          <w:color w:val="1A2634"/>
           <w:sz w:val="21"/>
           <w:szCs w:val="21"/>
         </w:rPr>
@@ -321,6 +353,7 @@
       <w:r>
         <w:rPr>
           <w:rFonts w:cs="Segoe UI"/>
+          <w:color w:val="1A2634"/>
           <w:sz w:val="21"/>
           <w:szCs w:val="21"/>
         </w:rPr>
@@ -330,6 +363,7 @@
       <w:r>
         <w:rPr>
           <w:rFonts w:cs="Segoe UI"/>
+          <w:color w:val="1A2634"/>
           <w:sz w:val="21"/>
           <w:szCs w:val="21"/>
         </w:rPr>
@@ -339,6 +373,7 @@
       <w:r>
         <w:rPr>
           <w:rFonts w:cs="Segoe UI"/>
+          <w:color w:val="1A2634"/>
           <w:sz w:val="21"/>
           <w:szCs w:val="21"/>
         </w:rPr>
@@ -350,6 +385,7 @@
         <w:spacing w:after="60" w:line="22" w:lineRule="atLeast"/>
         <w:rPr>
           <w:rFonts w:cs="Segoe UI"/>
+          <w:color w:val="1A2634"/>
           <w:sz w:val="21"/>
           <w:szCs w:val="21"/>
         </w:rPr>
@@ -357,6 +393,7 @@
       <w:r>
         <w:rPr>
           <w:rFonts w:cs="Segoe UI"/>
+          <w:color w:val="1A2634"/>
           <w:sz w:val="21"/>
           <w:szCs w:val="21"/>
         </w:rPr>
@@ -366,6 +403,7 @@
       <w:r>
         <w:rPr>
           <w:rFonts w:cs="Segoe UI"/>
+          <w:color w:val="1A2634"/>
           <w:sz w:val="21"/>
           <w:szCs w:val="21"/>
         </w:rPr>
@@ -375,6 +413,7 @@
       <w:r>
         <w:rPr>
           <w:rFonts w:cs="Segoe UI"/>
+          <w:color w:val="1A2634"/>
           <w:sz w:val="21"/>
           <w:szCs w:val="21"/>
         </w:rPr>
@@ -386,6 +425,7 @@
         <w:spacing w:after="60" w:line="22" w:lineRule="atLeast"/>
         <w:rPr>
           <w:rFonts w:cs="Segoe UI"/>
+          <w:color w:val="1A2634"/>
           <w:sz w:val="21"/>
           <w:szCs w:val="21"/>
         </w:rPr>
@@ -393,6 +433,7 @@
       <w:r>
         <w:rPr>
           <w:rFonts w:cs="Segoe UI"/>
+          <w:color w:val="1A2634"/>
           <w:sz w:val="21"/>
           <w:szCs w:val="21"/>
         </w:rPr>
@@ -404,6 +445,7 @@
         <w:spacing w:after="60" w:line="22" w:lineRule="atLeast"/>
         <w:rPr>
           <w:rFonts w:cs="Segoe UI"/>
+          <w:color w:val="1A2634"/>
           <w:sz w:val="21"/>
           <w:szCs w:val="21"/>
         </w:rPr>
@@ -411,6 +453,7 @@
       <w:r>
         <w:rPr>
           <w:rFonts w:cs="Segoe UI"/>
+          <w:color w:val="1A2634"/>
           <w:sz w:val="24"/>
           <w:szCs w:val="24"/>
         </w:rPr>
@@ -419,6 +462,7 @@
       <w:r>
         <w:rPr>
           <w:rFonts w:cs="Segoe UI"/>
+          <w:color w:val="1A2634"/>
           <w:sz w:val="21"/>
           <w:szCs w:val="21"/>
         </w:rPr>
@@ -430,6 +474,7 @@
         <w:spacing w:after="60" w:line="22" w:lineRule="atLeast"/>
         <w:rPr>
           <w:rFonts w:cs="Segoe UI"/>
+          <w:color w:val="1A2634"/>
           <w:sz w:val="21"/>
           <w:szCs w:val="21"/>
         </w:rPr>
@@ -437,6 +482,7 @@
       <w:r>
         <w:rPr>
           <w:rFonts w:cs="Segoe UI"/>
+          <w:color w:val="1A2634"/>
           <w:sz w:val="21"/>
           <w:szCs w:val="21"/>
         </w:rPr>
@@ -448,6 +494,7 @@
         <w:spacing w:after="0" w:line="22" w:lineRule="atLeast"/>
         <w:rPr>
           <w:rFonts w:cs="Segoe UI"/>
+          <w:color w:val="1A2634"/>
           <w:sz w:val="21"/>
           <w:szCs w:val="21"/>
         </w:rPr>
@@ -455,6 +502,7 @@
       <w:r>
         <w:rPr>
           <w:rFonts w:cs="Segoe UI"/>
+          <w:color w:val="1A2634"/>
           <w:sz w:val="21"/>
           <w:szCs w:val="21"/>
         </w:rPr>
@@ -466,6 +514,7 @@
         <w:spacing w:after="0" w:line="22" w:lineRule="atLeast"/>
         <w:rPr>
           <w:rFonts w:cs="Segoe UI"/>
+          <w:color w:val="1A2634"/>
           <w:sz w:val="21"/>
           <w:szCs w:val="21"/>
         </w:rPr>
@@ -473,6 +522,7 @@
       <w:r>
         <w:rPr>
           <w:rFonts w:cs="Segoe UI"/>
+          <w:color w:val="1A2634"/>
           <w:sz w:val="21"/>
           <w:szCs w:val="21"/>
         </w:rPr>
@@ -489,6 +539,7 @@
           <w:rFonts w:cs="Segoe UI"/>
           <w:b/>
           <w:bCs/>
+          <w:color w:val="1A2634"/>
           <w:sz w:val="24"/>
           <w:szCs w:val="24"/>
         </w:rPr>
@@ -498,6 +549,7 @@
           <w:rFonts w:cs="Segoe UI"/>
           <w:b/>
           <w:bCs/>
+          <w:color w:val="1A2634"/>
           <w:sz w:val="24"/>
           <w:szCs w:val="24"/>
         </w:rPr>
@@ -509,6 +561,7 @@
         <w:spacing w:after="60" w:line="22" w:lineRule="atLeast"/>
         <w:rPr>
           <w:rFonts w:cs="Segoe UI"/>
+          <w:color w:val="1A2634"/>
           <w:sz w:val="21"/>
           <w:szCs w:val="21"/>
         </w:rPr>
@@ -516,6 +569,7 @@
       <w:r>
         <w:rPr>
           <w:rFonts w:cs="Segoe UI"/>
+          <w:color w:val="1A2634"/>
           <w:sz w:val="21"/>
           <w:szCs w:val="21"/>
         </w:rPr>
@@ -527,6 +581,7 @@
         <w:spacing w:after="60" w:line="22" w:lineRule="atLeast"/>
         <w:rPr>
           <w:rFonts w:cs="Segoe UI"/>
+          <w:color w:val="1A2634"/>
           <w:sz w:val="21"/>
           <w:szCs w:val="21"/>
         </w:rPr>
@@ -534,6 +589,7 @@
       <w:r>
         <w:rPr>
           <w:rFonts w:cs="Segoe UI"/>
+          <w:color w:val="1A2634"/>
           <w:sz w:val="21"/>
           <w:szCs w:val="21"/>
         </w:rPr>
@@ -547,6 +603,7 @@
           <w:rFonts w:cs="Segoe UI"/>
           <w:b/>
           <w:bCs/>
+          <w:color w:val="1A2634"/>
           <w:sz w:val="21"/>
           <w:szCs w:val="21"/>
         </w:rPr>
@@ -556,6 +613,7 @@
           <w:rFonts w:cs="Segoe UI"/>
           <w:b/>
           <w:bCs/>
+          <w:color w:val="1A2634"/>
           <w:sz w:val="21"/>
           <w:szCs w:val="21"/>
         </w:rPr>
@@ -567,6 +625,7 @@
           <w:rFonts w:cs="Segoe UI"/>
           <w:b/>
           <w:bCs/>
+          <w:color w:val="1A2634"/>
           <w:sz w:val="21"/>
           <w:szCs w:val="21"/>
         </w:rPr>
@@ -578,6 +637,7 @@
           <w:rFonts w:cs="Segoe UI"/>
           <w:b/>
           <w:bCs/>
+          <w:color w:val="1A2634"/>
           <w:sz w:val="21"/>
           <w:szCs w:val="21"/>
         </w:rPr>
@@ -589,6 +649,7 @@
         <w:spacing w:after="60" w:line="22" w:lineRule="atLeast"/>
         <w:rPr>
           <w:rFonts w:cs="Segoe UI"/>
+          <w:color w:val="1A2634"/>
           <w:sz w:val="21"/>
           <w:szCs w:val="21"/>
         </w:rPr>
@@ -596,6 +657,47 @@
       <w:r>
         <w:rPr>
           <w:rFonts w:cs="Segoe UI"/>
+          <w:color w:val="1A2634"/>
+          <w:sz w:val="21"/>
+          <w:szCs w:val="21"/>
+        </w:rPr>
+        <w:t>{start} – {</w:t>
+      </w:r>
+      <w:proofErr w:type="spellStart"/>
+      <w:r>
+        <w:rPr>
+          <w:rFonts w:cs="Segoe UI"/>
+          <w:color w:val="1A2634"/>
+          <w:sz w:val="21"/>
+          <w:szCs w:val="21"/>
+        </w:rPr>
+        <w:t>end_or_present</w:t>
+      </w:r>
+      <w:proofErr w:type="spellEnd"/>
+      <w:r>
+        <w:rPr>
+          <w:rFonts w:cs="Segoe UI"/>
+          <w:color w:val="1A2634"/>
+          <w:sz w:val="21"/>
+          <w:szCs w:val="21"/>
+        </w:rPr>
+        <w:t>}</w:t>
+      </w:r>
+    </w:p>
+    <w:p>
+      <w:pPr>
+        <w:spacing w:after="60" w:line="22" w:lineRule="atLeast"/>
+        <w:rPr>
+          <w:rFonts w:cs="Segoe UI"/>
+          <w:color w:val="1A2634"/>
+          <w:sz w:val="21"/>
+          <w:szCs w:val="21"/>
+        </w:rPr>
+      </w:pPr>
+      <w:r>
+        <w:rPr>
+          <w:rFonts w:cs="Segoe UI"/>
+          <w:color w:val="1A2634"/>
           <w:sz w:val="21"/>
           <w:szCs w:val="21"/>
         </w:rPr>
@@ -607,6 +709,7 @@
         <w:spacing w:after="60" w:line="22" w:lineRule="atLeast"/>
         <w:rPr>
           <w:rFonts w:cs="Segoe UI"/>
+          <w:color w:val="1A2634"/>
           <w:sz w:val="21"/>
           <w:szCs w:val="21"/>
         </w:rPr>
@@ -614,6 +717,7 @@
       <w:r>
         <w:rPr>
           <w:rFonts w:cs="Segoe UI"/>
+          <w:color w:val="1A2634"/>
           <w:sz w:val="21"/>
           <w:szCs w:val="21"/>
         </w:rPr>
@@ -623,6 +727,7 @@
       <w:r>
         <w:rPr>
           <w:rFonts w:cs="Segoe UI"/>
+          <w:color w:val="1A2634"/>
           <w:sz w:val="21"/>
           <w:szCs w:val="21"/>
         </w:rPr>
@@ -632,6 +737,7 @@
       <w:r>
         <w:rPr>
           <w:rFonts w:cs="Segoe UI"/>
+          <w:color w:val="1A2634"/>
           <w:sz w:val="21"/>
           <w:szCs w:val="21"/>
         </w:rPr>
@@ -643,6 +749,7 @@
         <w:spacing w:after="60" w:line="22" w:lineRule="atLeast"/>
         <w:rPr>
           <w:rFonts w:cs="Segoe UI"/>
+          <w:color w:val="1A2634"/>
           <w:sz w:val="21"/>
           <w:szCs w:val="21"/>
         </w:rPr>
@@ -650,6 +757,7 @@
       <w:r>
         <w:rPr>
           <w:rFonts w:cs="Segoe UI"/>
+          <w:color w:val="1A2634"/>
           <w:sz w:val="21"/>
           <w:szCs w:val="21"/>
         </w:rPr>
@@ -659,6 +767,7 @@
       <w:r>
         <w:rPr>
           <w:rFonts w:cs="Segoe UI"/>
+          <w:color w:val="1A2634"/>
           <w:sz w:val="21"/>
           <w:szCs w:val="21"/>
         </w:rPr>
@@ -668,6 +777,7 @@
       <w:r>
         <w:rPr>
           <w:rFonts w:cs="Segoe UI"/>
+          <w:color w:val="1A2634"/>
           <w:sz w:val="21"/>
           <w:szCs w:val="21"/>
         </w:rPr>
@@ -679,6 +789,7 @@
         <w:spacing w:after="60" w:line="22" w:lineRule="atLeast"/>
         <w:rPr>
           <w:rFonts w:cs="Segoe UI"/>
+          <w:color w:val="1A2634"/>
           <w:sz w:val="21"/>
           <w:szCs w:val="21"/>
         </w:rPr>
@@ -686,6 +797,7 @@
       <w:r>
         <w:rPr>
           <w:rFonts w:cs="Segoe UI"/>
+          <w:color w:val="1A2634"/>
           <w:sz w:val="21"/>
           <w:szCs w:val="21"/>
         </w:rPr>
@@ -697,6 +809,7 @@
         <w:spacing w:after="60" w:line="22" w:lineRule="atLeast"/>
         <w:rPr>
           <w:rFonts w:cs="Segoe UI"/>
+          <w:color w:val="1A2634"/>
           <w:sz w:val="21"/>
           <w:szCs w:val="21"/>
         </w:rPr>
@@ -704,6 +817,7 @@
       <w:r>
         <w:rPr>
           <w:rFonts w:cs="Segoe UI"/>
+          <w:color w:val="1A2634"/>
           <w:sz w:val="24"/>
           <w:szCs w:val="24"/>
         </w:rPr>
@@ -712,6 +826,7 @@
       <w:r>
         <w:rPr>
           <w:rFonts w:cs="Segoe UI"/>
+          <w:color w:val="1A2634"/>
           <w:sz w:val="21"/>
           <w:szCs w:val="21"/>
         </w:rPr>
@@ -723,6 +838,7 @@
         <w:spacing w:after="60" w:line="22" w:lineRule="atLeast"/>
         <w:rPr>
           <w:rFonts w:cs="Segoe UI"/>
+          <w:color w:val="1A2634"/>
           <w:sz w:val="21"/>
           <w:szCs w:val="21"/>
         </w:rPr>
@@ -730,6 +846,7 @@
       <w:r>
         <w:rPr>
           <w:rFonts w:cs="Segoe UI"/>
+          <w:color w:val="1A2634"/>
           <w:sz w:val="21"/>
           <w:szCs w:val="21"/>
         </w:rPr>
@@ -739,6 +856,7 @@
       <w:r>
         <w:rPr>
           <w:rFonts w:cs="Segoe UI"/>
+          <w:color w:val="1A2634"/>
           <w:sz w:val="21"/>
           <w:szCs w:val="21"/>
         </w:rPr>
@@ -748,6 +866,7 @@
       <w:r>
         <w:rPr>
           <w:rFonts w:cs="Segoe UI"/>
+          <w:color w:val="1A2634"/>
           <w:sz w:val="21"/>
           <w:szCs w:val="21"/>
         </w:rPr>
@@ -759,6 +878,7 @@
         <w:spacing w:after="0" w:line="22" w:lineRule="atLeast"/>
         <w:rPr>
           <w:rFonts w:cs="Segoe UI"/>
+          <w:color w:val="1A2634"/>
           <w:sz w:val="21"/>
           <w:szCs w:val="21"/>
         </w:rPr>
@@ -766,6 +886,7 @@
       <w:r>
         <w:rPr>
           <w:rFonts w:cs="Segoe UI"/>
+          <w:color w:val="1A2634"/>
           <w:sz w:val="21"/>
           <w:szCs w:val="21"/>
         </w:rPr>
@@ -777,6 +898,7 @@
         <w:spacing w:after="0" w:line="22" w:lineRule="atLeast"/>
         <w:rPr>
           <w:rFonts w:cs="Segoe UI"/>
+          <w:color w:val="1A2634"/>
           <w:sz w:val="21"/>
           <w:szCs w:val="21"/>
         </w:rPr>
@@ -784,6 +906,7 @@
       <w:r>
         <w:rPr>
           <w:rFonts w:cs="Segoe UI"/>
+          <w:color w:val="1A2634"/>
           <w:sz w:val="21"/>
           <w:szCs w:val="21"/>
         </w:rPr>
@@ -800,6 +923,7 @@
           <w:rFonts w:cs="Segoe UI"/>
           <w:b/>
           <w:bCs/>
+          <w:color w:val="1A2634"/>
           <w:sz w:val="24"/>
           <w:szCs w:val="24"/>
         </w:rPr>
@@ -809,6 +933,7 @@
           <w:rFonts w:cs="Segoe UI"/>
           <w:b/>
           <w:bCs/>
+          <w:color w:val="1A2634"/>
           <w:sz w:val="24"/>
           <w:szCs w:val="24"/>
         </w:rPr>
@@ -820,6 +945,7 @@
         <w:spacing w:after="60" w:line="22" w:lineRule="atLeast"/>
         <w:rPr>
           <w:rFonts w:cs="Segoe UI"/>
+          <w:color w:val="1A2634"/>
           <w:sz w:val="21"/>
           <w:szCs w:val="21"/>
         </w:rPr>
@@ -827,6 +953,7 @@
       <w:r>
         <w:rPr>
           <w:rFonts w:cs="Segoe UI"/>
+          <w:color w:val="1A2634"/>
           <w:sz w:val="21"/>
           <w:szCs w:val="21"/>
         </w:rPr>
@@ -838,6 +965,7 @@
         <w:spacing w:after="60" w:line="22" w:lineRule="atLeast"/>
         <w:rPr>
           <w:rFonts w:cs="Segoe UI"/>
+          <w:color w:val="1A2634"/>
           <w:sz w:val="21"/>
           <w:szCs w:val="21"/>
         </w:rPr>
@@ -845,9 +973,11 @@
       <w:r>
         <w:rPr>
           <w:rFonts w:cs="Segoe UI"/>
+          <w:color w:val="1A2634"/>
           <w:sz w:val="21"/>
           <w:szCs w:val="21"/>
         </w:rPr>
+        <w:lastRenderedPageBreak/>
         <w:t>{#education}</w:t>
       </w:r>
     </w:p>
@@ -856,6 +986,7 @@
         <w:spacing w:before="200" w:after="60" w:line="22" w:lineRule="atLeast"/>
         <w:rPr>
           <w:rFonts w:cs="Segoe UI"/>
+          <w:color w:val="1A2634"/>
           <w:sz w:val="21"/>
           <w:szCs w:val="21"/>
         </w:rPr>
@@ -863,10 +994,10 @@
       <w:r>
         <w:rPr>
           <w:rFonts w:cs="Segoe UI"/>
+          <w:color w:val="1A2634"/>
           <w:sz w:val="21"/>
           <w:szCs w:val="21"/>
         </w:rPr>
-        <w:lastRenderedPageBreak/>
         <w:t>{degree}</w:t>
       </w:r>
     </w:p>
@@ -875,6 +1006,7 @@
         <w:spacing w:after="60" w:line="22" w:lineRule="atLeast"/>
         <w:rPr>
           <w:rFonts w:cs="Segoe UI"/>
+          <w:color w:val="1A2634"/>
           <w:sz w:val="21"/>
           <w:szCs w:val="21"/>
         </w:rPr>
@@ -884,6 +1016,7 @@
           <w:rFonts w:cs="Segoe UI"/>
           <w:b/>
           <w:bCs/>
+          <w:color w:val="1A2634"/>
           <w:sz w:val="21"/>
           <w:szCs w:val="21"/>
         </w:rPr>
@@ -892,6 +1025,7 @@
       <w:r>
         <w:rPr>
           <w:rFonts w:cs="Segoe UI"/>
+          <w:color w:val="1A2634"/>
           <w:sz w:val="21"/>
           <w:szCs w:val="21"/>
         </w:rPr>
@@ -903,6 +1037,7 @@
         <w:spacing w:after="60" w:line="22" w:lineRule="atLeast"/>
         <w:rPr>
           <w:rFonts w:cs="Segoe UI"/>
+          <w:color w:val="1A2634"/>
           <w:sz w:val="21"/>
           <w:szCs w:val="21"/>
         </w:rPr>
@@ -910,6 +1045,7 @@
       <w:r>
         <w:rPr>
           <w:rFonts w:cs="Segoe UI"/>
+          <w:color w:val="1A2634"/>
           <w:sz w:val="21"/>
           <w:szCs w:val="21"/>
         </w:rPr>
@@ -919,6 +1055,7 @@
       <w:r>
         <w:rPr>
           <w:rFonts w:cs="Segoe UI"/>
+          <w:color w:val="1A2634"/>
           <w:sz w:val="21"/>
           <w:szCs w:val="21"/>
         </w:rPr>
@@ -928,6 +1065,7 @@
       <w:r>
         <w:rPr>
           <w:rFonts w:cs="Segoe UI"/>
+          <w:color w:val="1A2634"/>
           <w:sz w:val="21"/>
           <w:szCs w:val="21"/>
         </w:rPr>
@@ -939,6 +1077,7 @@
         <w:spacing w:after="60" w:line="22" w:lineRule="atLeast"/>
         <w:rPr>
           <w:rFonts w:cs="Segoe UI"/>
+          <w:color w:val="1A2634"/>
           <w:sz w:val="21"/>
           <w:szCs w:val="21"/>
         </w:rPr>
@@ -946,6 +1085,7 @@
       <w:r>
         <w:rPr>
           <w:rFonts w:cs="Segoe UI"/>
+          <w:color w:val="1A2634"/>
           <w:sz w:val="21"/>
           <w:szCs w:val="21"/>
         </w:rPr>
@@ -957,6 +1097,7 @@
         <w:spacing w:after="60" w:line="22" w:lineRule="atLeast"/>
         <w:rPr>
           <w:rFonts w:cs="Segoe UI"/>
+          <w:color w:val="1A2634"/>
           <w:sz w:val="21"/>
           <w:szCs w:val="21"/>
         </w:rPr>
@@ -964,6 +1105,7 @@
       <w:r>
         <w:rPr>
           <w:rFonts w:cs="Segoe UI"/>
+          <w:color w:val="1A2634"/>
           <w:sz w:val="21"/>
           <w:szCs w:val="21"/>
         </w:rPr>
@@ -973,6 +1115,7 @@
       <w:r>
         <w:rPr>
           <w:rFonts w:cs="Segoe UI"/>
+          <w:color w:val="1A2634"/>
           <w:sz w:val="21"/>
           <w:szCs w:val="21"/>
         </w:rPr>
@@ -982,6 +1125,7 @@
       <w:r>
         <w:rPr>
           <w:rFonts w:cs="Segoe UI"/>
+          <w:color w:val="1A2634"/>
           <w:sz w:val="21"/>
           <w:szCs w:val="21"/>
         </w:rPr>
@@ -993,6 +1137,7 @@
         <w:spacing w:after="60" w:line="22" w:lineRule="atLeast"/>
         <w:rPr>
           <w:rFonts w:cs="Segoe UI"/>
+          <w:color w:val="1A2634"/>
           <w:sz w:val="21"/>
           <w:szCs w:val="21"/>
         </w:rPr>
@@ -1000,6 +1145,7 @@
       <w:r>
         <w:rPr>
           <w:rFonts w:cs="Segoe UI"/>
+          <w:color w:val="1A2634"/>
           <w:sz w:val="21"/>
           <w:szCs w:val="21"/>
         </w:rPr>
@@ -1009,6 +1155,7 @@
       <w:r>
         <w:rPr>
           <w:rFonts w:cs="Segoe UI"/>
+          <w:color w:val="1A2634"/>
           <w:sz w:val="21"/>
           <w:szCs w:val="21"/>
         </w:rPr>
@@ -1018,6 +1165,7 @@
       <w:r>
         <w:rPr>
           <w:rFonts w:cs="Segoe UI"/>
+          <w:color w:val="1A2634"/>
           <w:sz w:val="21"/>
           <w:szCs w:val="21"/>
         </w:rPr>
@@ -1029,6 +1177,7 @@
         <w:spacing w:after="0" w:line="22" w:lineRule="atLeast"/>
         <w:rPr>
           <w:rFonts w:cs="Segoe UI"/>
+          <w:color w:val="1A2634"/>
           <w:sz w:val="21"/>
           <w:szCs w:val="21"/>
         </w:rPr>
@@ -1036,6 +1185,7 @@
       <w:r>
         <w:rPr>
           <w:rFonts w:cs="Segoe UI"/>
+          <w:color w:val="1A2634"/>
           <w:sz w:val="21"/>
           <w:szCs w:val="21"/>
         </w:rPr>
@@ -1047,6 +1197,7 @@
         <w:spacing w:after="0" w:line="22" w:lineRule="atLeast"/>
         <w:rPr>
           <w:rFonts w:cs="Segoe UI"/>
+          <w:color w:val="1A2634"/>
           <w:sz w:val="21"/>
           <w:szCs w:val="21"/>
         </w:rPr>
@@ -1054,6 +1205,7 @@
       <w:r>
         <w:rPr>
           <w:rFonts w:cs="Segoe UI"/>
+          <w:color w:val="1A2634"/>
           <w:sz w:val="21"/>
           <w:szCs w:val="21"/>
         </w:rPr>
@@ -1070,6 +1222,7 @@
           <w:rFonts w:cs="Segoe UI"/>
           <w:b/>
           <w:bCs/>
+          <w:color w:val="1A2634"/>
           <w:sz w:val="24"/>
           <w:szCs w:val="24"/>
         </w:rPr>
@@ -1079,6 +1232,7 @@
           <w:rFonts w:cs="Segoe UI"/>
           <w:b/>
           <w:bCs/>
+          <w:color w:val="1A2634"/>
           <w:sz w:val="24"/>
           <w:szCs w:val="24"/>
         </w:rPr>
@@ -1090,6 +1244,7 @@
         <w:spacing w:after="60" w:line="22" w:lineRule="atLeast"/>
         <w:rPr>
           <w:rFonts w:cs="Segoe UI"/>
+          <w:color w:val="1A2634"/>
           <w:sz w:val="21"/>
           <w:szCs w:val="21"/>
         </w:rPr>
@@ -1097,6 +1252,7 @@
       <w:r>
         <w:rPr>
           <w:rFonts w:cs="Segoe UI"/>
+          <w:color w:val="1A2634"/>
           <w:sz w:val="21"/>
           <w:szCs w:val="21"/>
         </w:rPr>
@@ -1108,6 +1264,7 @@
         <w:spacing w:after="60" w:line="22" w:lineRule="atLeast"/>
         <w:rPr>
           <w:rFonts w:cs="Segoe UI"/>
+          <w:color w:val="1A2634"/>
           <w:sz w:val="21"/>
           <w:szCs w:val="21"/>
         </w:rPr>
@@ -1115,6 +1272,7 @@
       <w:r>
         <w:rPr>
           <w:rFonts w:cs="Segoe UI"/>
+          <w:color w:val="1A2634"/>
           <w:sz w:val="21"/>
           <w:szCs w:val="21"/>
         </w:rPr>
@@ -1126,6 +1284,7 @@
         <w:spacing w:before="200" w:after="60" w:line="22" w:lineRule="atLeast"/>
         <w:rPr>
           <w:rFonts w:cs="Segoe UI"/>
+          <w:color w:val="1A2634"/>
           <w:sz w:val="21"/>
           <w:szCs w:val="21"/>
         </w:rPr>
@@ -1133,6 +1292,7 @@
       <w:r>
         <w:rPr>
           <w:rFonts w:cs="Segoe UI"/>
+          <w:color w:val="1A2634"/>
           <w:sz w:val="21"/>
           <w:szCs w:val="21"/>
         </w:rPr>
@@ -1144,6 +1304,7 @@
         <w:spacing w:after="60" w:line="22" w:lineRule="atLeast"/>
         <w:rPr>
           <w:rFonts w:cs="Segoe UI"/>
+          <w:color w:val="1A2634"/>
           <w:sz w:val="21"/>
           <w:szCs w:val="21"/>
         </w:rPr>
@@ -1151,6 +1312,7 @@
       <w:r>
         <w:rPr>
           <w:rFonts w:cs="Segoe UI"/>
+          <w:color w:val="1A2634"/>
           <w:sz w:val="21"/>
           <w:szCs w:val="21"/>
         </w:rPr>
@@ -1162,6 +1324,7 @@
         <w:spacing w:after="0" w:line="22" w:lineRule="atLeast"/>
         <w:rPr>
           <w:rFonts w:cs="Segoe UI"/>
+          <w:color w:val="1A2634"/>
           <w:sz w:val="21"/>
           <w:szCs w:val="21"/>
         </w:rPr>
@@ -1169,6 +1332,7 @@
       <w:r>
         <w:rPr>
           <w:rFonts w:cs="Segoe UI"/>
+          <w:color w:val="1A2634"/>
           <w:sz w:val="21"/>
           <w:szCs w:val="21"/>
         </w:rPr>
@@ -1185,6 +1349,7 @@
           <w:rFonts w:cs="Segoe UI"/>
           <w:b/>
           <w:bCs/>
+          <w:color w:val="1A2634"/>
           <w:sz w:val="24"/>
           <w:szCs w:val="24"/>
         </w:rPr>
@@ -1194,6 +1359,7 @@
           <w:rFonts w:cs="Segoe UI"/>
           <w:b/>
           <w:bCs/>
+          <w:color w:val="1A2634"/>
           <w:sz w:val="24"/>
           <w:szCs w:val="24"/>
         </w:rPr>
@@ -1205,6 +1371,7 @@
         <w:spacing w:after="60" w:line="22" w:lineRule="atLeast"/>
         <w:rPr>
           <w:rFonts w:cs="Segoe UI"/>
+          <w:color w:val="1A2634"/>
           <w:sz w:val="21"/>
           <w:szCs w:val="21"/>
         </w:rPr>
@@ -1212,6 +1379,7 @@
       <w:r>
         <w:rPr>
           <w:rFonts w:cs="Segoe UI"/>
+          <w:color w:val="1A2634"/>
           <w:sz w:val="21"/>
           <w:szCs w:val="21"/>
         </w:rPr>
@@ -1223,6 +1391,7 @@
         <w:spacing w:after="60" w:line="22" w:lineRule="atLeast"/>
         <w:rPr>
           <w:rFonts w:cs="Segoe UI"/>
+          <w:color w:val="1A2634"/>
           <w:sz w:val="21"/>
           <w:szCs w:val="21"/>
         </w:rPr>
@@ -1230,6 +1399,7 @@
       <w:r>
         <w:rPr>
           <w:rFonts w:cs="Segoe UI"/>
+          <w:color w:val="1A2634"/>
           <w:sz w:val="21"/>
           <w:szCs w:val="21"/>
         </w:rPr>
@@ -1239,6 +1409,7 @@
       <w:r>
         <w:rPr>
           <w:rFonts w:cs="Segoe UI"/>
+          <w:color w:val="1A2634"/>
           <w:sz w:val="21"/>
           <w:szCs w:val="21"/>
         </w:rPr>
@@ -1248,6 +1419,7 @@
       <w:r>
         <w:rPr>
           <w:rFonts w:cs="Segoe UI"/>
+          <w:color w:val="1A2634"/>
           <w:sz w:val="21"/>
           <w:szCs w:val="21"/>
         </w:rPr>
@@ -1259,6 +1431,7 @@
         <w:spacing w:after="60" w:line="22" w:lineRule="atLeast"/>
         <w:rPr>
           <w:rFonts w:cs="Segoe UI"/>
+          <w:color w:val="1A2634"/>
           <w:sz w:val="21"/>
           <w:szCs w:val="21"/>
         </w:rPr>
@@ -1266,6 +1439,7 @@
       <w:r>
         <w:rPr>
           <w:rFonts w:cs="Segoe UI"/>
+          <w:color w:val="1A2634"/>
           <w:sz w:val="21"/>
           <w:szCs w:val="21"/>
         </w:rPr>
@@ -1275,6 +1449,7 @@
       <w:r>
         <w:rPr>
           <w:rFonts w:cs="Segoe UI"/>
+          <w:color w:val="1A2634"/>
           <w:sz w:val="21"/>
           <w:szCs w:val="21"/>
         </w:rPr>
@@ -1284,6 +1459,7 @@
       <w:r>
         <w:rPr>
           <w:rFonts w:cs="Segoe UI"/>
+          <w:color w:val="1A2634"/>
           <w:sz w:val="21"/>
           <w:szCs w:val="21"/>
         </w:rPr>
@@ -1295,6 +1471,7 @@
         <w:spacing w:after="60" w:line="22" w:lineRule="atLeast"/>
         <w:rPr>
           <w:rFonts w:cs="Segoe UI"/>
+          <w:color w:val="1A2634"/>
           <w:sz w:val="21"/>
           <w:szCs w:val="21"/>
         </w:rPr>
@@ -1302,6 +1479,7 @@
       <w:r>
         <w:rPr>
           <w:rFonts w:cs="Segoe UI"/>
+          <w:color w:val="1A2634"/>
           <w:sz w:val="21"/>
           <w:szCs w:val="21"/>
         </w:rPr>
@@ -1313,6 +1491,7 @@
         <w:spacing w:after="0" w:line="22" w:lineRule="atLeast"/>
         <w:rPr>
           <w:rFonts w:cs="Segoe UI"/>
+          <w:color w:val="1A2634"/>
           <w:sz w:val="21"/>
           <w:szCs w:val="21"/>
         </w:rPr>
@@ -1320,6 +1499,7 @@
       <w:r>
         <w:rPr>
           <w:rFonts w:cs="Segoe UI"/>
+          <w:color w:val="1A2634"/>
           <w:sz w:val="21"/>
           <w:szCs w:val="21"/>
         </w:rPr>
@@ -1336,6 +1516,7 @@
           <w:rFonts w:cs="Segoe UI"/>
           <w:b/>
           <w:bCs/>
+          <w:color w:val="1A2634"/>
           <w:sz w:val="24"/>
           <w:szCs w:val="24"/>
         </w:rPr>
@@ -1345,6 +1526,7 @@
           <w:rFonts w:cs="Segoe UI"/>
           <w:b/>
           <w:bCs/>
+          <w:color w:val="1A2634"/>
           <w:sz w:val="24"/>
           <w:szCs w:val="24"/>
         </w:rPr>
@@ -1355,6 +1537,7 @@
           <w:rFonts w:cs="Segoe UI"/>
           <w:b/>
           <w:bCs/>
+          <w:color w:val="1A2634"/>
           <w:sz w:val="24"/>
           <w:szCs w:val="24"/>
         </w:rPr>
@@ -1366,6 +1549,7 @@
         <w:spacing w:after="60" w:line="22" w:lineRule="atLeast"/>
         <w:rPr>
           <w:rFonts w:cs="Segoe UI"/>
+          <w:color w:val="1A2634"/>
           <w:sz w:val="21"/>
           <w:szCs w:val="21"/>
         </w:rPr>
@@ -1373,6 +1557,7 @@
       <w:r>
         <w:rPr>
           <w:rFonts w:cs="Segoe UI"/>
+          <w:color w:val="1A2634"/>
           <w:sz w:val="21"/>
           <w:szCs w:val="21"/>
         </w:rPr>
@@ -1384,6 +1569,7 @@
         <w:spacing w:after="60" w:line="22" w:lineRule="atLeast"/>
         <w:rPr>
           <w:rFonts w:cs="Segoe UI"/>
+          <w:color w:val="1A2634"/>
           <w:sz w:val="21"/>
           <w:szCs w:val="21"/>
         </w:rPr>
@@ -1391,6 +1577,7 @@
       <w:r>
         <w:rPr>
           <w:rFonts w:cs="Segoe UI"/>
+          <w:color w:val="1A2634"/>
           <w:sz w:val="21"/>
           <w:szCs w:val="21"/>
         </w:rPr>
@@ -2140,7 +2327,7 @@
   <w:style w:type="paragraph" w:default="1" w:styleId="Normal">
     <w:name w:val="Normal"/>
     <w:qFormat/>
-    <w:rsid w:val="00FC693F"/>
+    <w:rsid w:val="002104E8"/>
     <w:rPr>
       <w:rFonts w:ascii="Segoe UI" w:hAnsi="Segoe UI"/>
     </w:rPr>

</xml_diff>

<commit_message>
Update CV prompt and simplify template design
</commit_message>
<xml_diff>
--- a/templates/cv-template.docx
+++ b/templates/cv-template.docx
@@ -47,7 +47,7 @@
     <w:p>
       <w:pPr>
         <w:pBdr>
-          <w:bottom w:val="single" w:sz="4" w:space="1" w:color="FBD4B4" w:themeColor="accent6" w:themeTint="66"/>
+          <w:bottom w:val="single" w:sz="8" w:space="1" w:color="auto"/>
         </w:pBdr>
         <w:spacing w:before="200" w:after="120"/>
         <w:rPr>
@@ -94,7 +94,7 @@
     <w:p>
       <w:pPr>
         <w:pBdr>
-          <w:bottom w:val="single" w:sz="4" w:space="1" w:color="FBD4B4" w:themeColor="accent6" w:themeTint="66"/>
+          <w:bottom w:val="single" w:sz="8" w:space="1" w:color="auto"/>
         </w:pBdr>
         <w:spacing w:before="200" w:after="120"/>
         <w:rPr>
@@ -161,7 +161,7 @@
     <w:p>
       <w:pPr>
         <w:pBdr>
-          <w:bottom w:val="single" w:sz="4" w:space="1" w:color="FBD4B4" w:themeColor="accent6" w:themeTint="66"/>
+          <w:bottom w:val="single" w:sz="8" w:space="1" w:color="auto"/>
         </w:pBdr>
         <w:spacing w:before="200" w:after="120"/>
         <w:rPr>
@@ -532,7 +532,7 @@
     <w:p>
       <w:pPr>
         <w:pBdr>
-          <w:bottom w:val="single" w:sz="4" w:space="1" w:color="FBD4B4" w:themeColor="accent6" w:themeTint="66"/>
+          <w:bottom w:val="single" w:sz="8" w:space="1" w:color="auto"/>
         </w:pBdr>
         <w:spacing w:before="200" w:after="120"/>
         <w:rPr>
@@ -916,7 +916,7 @@
     <w:p>
       <w:pPr>
         <w:pBdr>
-          <w:bottom w:val="single" w:sz="4" w:space="1" w:color="FBD4B4" w:themeColor="accent6" w:themeTint="66"/>
+          <w:bottom w:val="single" w:sz="8" w:space="1" w:color="auto"/>
         </w:pBdr>
         <w:spacing w:before="200" w:after="120"/>
         <w:rPr>
@@ -957,6 +957,7 @@
           <w:sz w:val="21"/>
           <w:szCs w:val="21"/>
         </w:rPr>
+        <w:lastRenderedPageBreak/>
         <w:t>{/HAS_EDUCATION}</w:t>
       </w:r>
     </w:p>
@@ -977,7 +978,6 @@
           <w:sz w:val="21"/>
           <w:szCs w:val="21"/>
         </w:rPr>
-        <w:lastRenderedPageBreak/>
         <w:t>{#education}</w:t>
       </w:r>
     </w:p>
@@ -1215,7 +1215,7 @@
     <w:p>
       <w:pPr>
         <w:pBdr>
-          <w:bottom w:val="single" w:sz="4" w:space="1" w:color="FBD4B4" w:themeColor="accent6" w:themeTint="66"/>
+          <w:bottom w:val="single" w:sz="8" w:space="1" w:color="auto"/>
         </w:pBdr>
         <w:spacing w:before="200" w:after="120"/>
         <w:rPr>
@@ -1342,7 +1342,7 @@
     <w:p>
       <w:pPr>
         <w:pBdr>
-          <w:bottom w:val="single" w:sz="4" w:space="1" w:color="FBD4B4" w:themeColor="accent6" w:themeTint="66"/>
+          <w:bottom w:val="single" w:sz="8" w:space="1" w:color="auto"/>
         </w:pBdr>
         <w:spacing w:before="200" w:after="120"/>
         <w:rPr>
@@ -1509,7 +1509,7 @@
     <w:p>
       <w:pPr>
         <w:pBdr>
-          <w:bottom w:val="single" w:sz="4" w:space="1" w:color="FBD4B4" w:themeColor="accent6" w:themeTint="66"/>
+          <w:bottom w:val="single" w:sz="8" w:space="1" w:color="auto"/>
         </w:pBdr>
         <w:spacing w:before="200" w:after="120"/>
         <w:rPr>
@@ -1585,9 +1585,8 @@
       </w:r>
     </w:p>
     <w:sectPr>
-      <w:headerReference w:type="default" r:id="rId8"/>
       <w:pgSz w:w="11909" w:h="16834" w:code="9"/>
-      <w:pgMar w:top="1152" w:right="1152" w:bottom="1152" w:left="1987" w:header="720" w:footer="720" w:gutter="0"/>
+      <w:pgMar w:top="1440" w:right="1152" w:bottom="1152" w:left="1440" w:header="720" w:footer="720" w:gutter="0"/>
       <w:cols w:space="720"/>
       <w:docGrid w:linePitch="360"/>
     </w:sectPr>
@@ -1643,96 +1642,6 @@
     </w:p>
   </w:footnote>
 </w:footnotes>
-</file>
-
-<file path=word/header1.xml><?xml version="1.0" encoding="utf-8"?>
-<w:hdr xmlns:wpc="http://schemas.microsoft.com/office/word/2010/wordprocessingCanvas" xmlns:cx="http://schemas.microsoft.com/office/drawing/2014/chartex" xmlns:cx1="http://schemas.microsoft.com/office/drawing/2015/9/8/chartex" xmlns:cx2="http://schemas.microsoft.com/office/drawing/2015/10/21/chartex" xmlns:cx3="http://schemas.microsoft.com/office/drawing/2016/5/9/chartex" xmlns:cx4="http://schemas.microsoft.com/office/drawing/2016/5/10/chartex" xmlns:cx5="http://schemas.microsoft.com/office/drawing/2016/5/11/chartex" xmlns:cx6="http://schemas.microsoft.com/office/drawing/2016/5/12/chartex" xmlns:cx7="http://schemas.microsoft.com/office/drawing/2016/5/13/chartex" xmlns:cx8="http://schemas.microsoft.com/office/drawing/2016/5/14/chartex" xmlns:mc="http://schemas.openxmlformats.org/markup-compatibility/2006" xmlns:aink="http://schemas.microsoft.com/office/drawing/2016/ink" xmlns:am3d="http://schemas.microsoft.com/office/drawing/2017/model3d" xmlns:o="urn:schemas-microsoft-com:office:office" xmlns:r="http://schemas.openxmlformats.org/officeDocument/2006/relationships" xmlns:m="http://schemas.openxmlformats.org/officeDocument/2006/math" xmlns:v="urn:schemas-microsoft-com:vml" xmlns:wp14="http://schemas.microsoft.com/office/word/2010/wordprocessingDrawing" xmlns:wp="http://schemas.openxmlformats.org/drawingml/2006/wordprocessingDrawing" xmlns:w10="urn:schemas-microsoft-com:office:word" xmlns:w="http://schemas.openxmlformats.org/wordprocessingml/2006/main" xmlns:w14="http://schemas.microsoft.com/office/word/2010/wordml" xmlns:w15="http://schemas.microsoft.com/office/word/2012/wordml" xmlns:w16cex="http://schemas.microsoft.com/office/word/2018/wordml/cex" xmlns:w16cid="http://schemas.microsoft.com/office/word/2016/wordml/cid" xmlns:w16="http://schemas.microsoft.com/office/word/2018/wordml" xmlns:w16sdtdh="http://schemas.microsoft.com/office/word/2020/wordml/sdtdatahash" xmlns:w16se="http://schemas.microsoft.com/office/word/2015/wordml/symex" xmlns:wpg="http://schemas.microsoft.com/office/word/2010/wordprocessingGroup" xmlns:wpi="http://schemas.microsoft.com/office/word/2010/wordprocessingInk" xmlns:wne="http://schemas.microsoft.com/office/word/2006/wordml" xmlns:wps="http://schemas.microsoft.com/office/word/2010/wordprocessingShape" mc:Ignorable="w14 w15 w16se w16cid w16 w16cex w16sdtdh wp14">
-  <w:p>
-    <w:pPr>
-      <w:pStyle w:val="Header"/>
-    </w:pPr>
-    <w:r>
-      <w:rPr>
-        <w:noProof/>
-      </w:rPr>
-      <mc:AlternateContent>
-        <mc:Choice Requires="wps">
-          <w:drawing>
-            <wp:anchor distT="0" distB="0" distL="114300" distR="114300" simplePos="0" relativeHeight="251659264" behindDoc="0" locked="0" layoutInCell="1" allowOverlap="1" wp14:anchorId="1AFD5195" wp14:editId="70A3800F">
-              <wp:simplePos x="0" y="0"/>
-              <wp:positionH relativeFrom="column">
-                <wp:posOffset>-1341755</wp:posOffset>
-              </wp:positionH>
-              <wp:positionV relativeFrom="paragraph">
-                <wp:posOffset>-525780</wp:posOffset>
-              </wp:positionV>
-              <wp:extent cx="1169670" cy="10782300"/>
-              <wp:effectExtent l="57150" t="19050" r="49530" b="76200"/>
-              <wp:wrapNone/>
-              <wp:docPr id="2" name="Rectangle 2"/>
-              <wp:cNvGraphicFramePr/>
-              <a:graphic xmlns:a="http://schemas.openxmlformats.org/drawingml/2006/main">
-                <a:graphicData uri="http://schemas.microsoft.com/office/word/2010/wordprocessingShape">
-                  <wps:wsp>
-                    <wps:cNvSpPr/>
-                    <wps:spPr>
-                      <a:xfrm>
-                        <a:off x="0" y="0"/>
-                        <a:ext cx="1169670" cy="10782300"/>
-                      </a:xfrm>
-                      <a:prstGeom prst="rect">
-                        <a:avLst/>
-                      </a:prstGeom>
-                      <a:solidFill>
-                        <a:srgbClr val="F2F2F2"/>
-                      </a:solidFill>
-                      <a:ln>
-                        <a:noFill/>
-                      </a:ln>
-                    </wps:spPr>
-                    <wps:style>
-                      <a:lnRef idx="1">
-                        <a:schemeClr val="accent1"/>
-                      </a:lnRef>
-                      <a:fillRef idx="3">
-                        <a:schemeClr val="accent1"/>
-                      </a:fillRef>
-                      <a:effectRef idx="2">
-                        <a:schemeClr val="accent1"/>
-                      </a:effectRef>
-                      <a:fontRef idx="minor">
-                        <a:schemeClr val="lt1"/>
-                      </a:fontRef>
-                    </wps:style>
-                    <wps:bodyPr rot="0" spcFirstLastPara="0" vertOverflow="overflow" horzOverflow="overflow" vert="horz" wrap="square" lIns="91440" tIns="45720" rIns="91440" bIns="45720" numCol="1" spcCol="0" rtlCol="0" fromWordArt="0" anchor="ctr" anchorCtr="0" forceAA="0" compatLnSpc="1">
-                      <a:prstTxWarp prst="textNoShape">
-                        <a:avLst/>
-                      </a:prstTxWarp>
-                      <a:noAutofit/>
-                    </wps:bodyPr>
-                  </wps:wsp>
-                </a:graphicData>
-              </a:graphic>
-              <wp14:sizeRelH relativeFrom="margin">
-                <wp14:pctWidth>0</wp14:pctWidth>
-              </wp14:sizeRelH>
-              <wp14:sizeRelV relativeFrom="margin">
-                <wp14:pctHeight>0</wp14:pctHeight>
-              </wp14:sizeRelV>
-            </wp:anchor>
-          </w:drawing>
-        </mc:Choice>
-        <mc:Fallback>
-          <w:pict>
-            <v:rect w14:anchorId="291936A7" id="Rectangle 2" o:spid="_x0000_s1026" style="position:absolute;margin-left:-105.65pt;margin-top:-41.4pt;width:92.1pt;height:849pt;z-index:251659264;visibility:visible;mso-wrap-style:square;mso-width-percent:0;mso-height-percent:0;mso-wrap-distance-left:9pt;mso-wrap-distance-top:0;mso-wrap-distance-right:9pt;mso-wrap-distance-bottom:0;mso-position-horizontal:absolute;mso-position-horizontal-relative:text;mso-position-vertical:absolute;mso-position-vertical-relative:text;mso-width-percent:0;mso-height-percent:0;mso-width-relative:margin;mso-height-relative:margin;v-text-anchor:middle" o:gfxdata="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" fillcolor="#f2f2f2" stroked="f">
-              <v:shadow on="t" color="black" opacity="22937f" origin=",.5" offset="0,.63889mm"/>
-            </v:rect>
-          </w:pict>
-        </mc:Fallback>
-      </mc:AlternateContent>
-    </w:r>
-  </w:p>
-</w:hdr>
 </file>
 
 <file path=word/numbering.xml><?xml version="1.0" encoding="utf-8"?>

</xml_diff>

<commit_message>
updating extra section and template output quality
</commit_message>
<xml_diff>
--- a/templates/cv-template.docx
+++ b/templates/cv-template.docx
@@ -340,75 +340,73 @@
           <w:sz w:val="21"/>
           <w:szCs w:val="21"/>
         </w:rPr>
-        <w:t>{#start}{start}{/start}{#end_or_present} – {</w:t>
-      </w:r>
-      <w:proofErr w:type="spellStart"/>
-      <w:r>
-        <w:rPr>
-          <w:rFonts w:cs="Segoe UI"/>
-          <w:color w:val="1A2634"/>
-          <w:sz w:val="21"/>
-          <w:szCs w:val="21"/>
-        </w:rPr>
-        <w:t>end_or_present</w:t>
-      </w:r>
-      <w:proofErr w:type="spellEnd"/>
-      <w:r>
-        <w:rPr>
-          <w:rFonts w:cs="Segoe UI"/>
-          <w:color w:val="1A2634"/>
-          <w:sz w:val="21"/>
-          <w:szCs w:val="21"/>
-        </w:rPr>
-        <w:t>}{/</w:t>
-      </w:r>
-      <w:proofErr w:type="spellStart"/>
-      <w:r>
-        <w:rPr>
-          <w:rFonts w:cs="Segoe UI"/>
-          <w:color w:val="1A2634"/>
-          <w:sz w:val="21"/>
-          <w:szCs w:val="21"/>
-        </w:rPr>
-        <w:t>end_or_present</w:t>
-      </w:r>
-      <w:proofErr w:type="spellEnd"/>
-      <w:r>
-        <w:rPr>
-          <w:rFonts w:cs="Segoe UI"/>
-          <w:color w:val="1A2634"/>
-          <w:sz w:val="21"/>
-          <w:szCs w:val="21"/>
-        </w:rPr>
-        <w:t>}</w:t>
-      </w:r>
-    </w:p>
-    <w:p>
-      <w:pPr>
-        <w:spacing w:after="0" w:line="22" w:lineRule="atLeast"/>
-      </w:pPr>
-      <w:r>
-        <w:t>{#edu_competencies}</w:t>
-      </w:r>
-    </w:p>
-    <w:p>
-      <w:pPr>
-        <w:spacing w:after="0" w:line="22" w:lineRule="atLeast"/>
-        <w:rPr>
-          <w:rFonts w:cs="Segoe UI"/>
-          <w:color w:val="1A2634"/>
-          <w:sz w:val="21"/>
-          <w:szCs w:val="21"/>
-        </w:rPr>
-      </w:pPr>
-      <w:r>
-        <w:rPr>
-          <w:rFonts w:cs="Segoe UI"/>
-          <w:color w:val="1A2634"/>
-          <w:sz w:val="21"/>
-          <w:szCs w:val="21"/>
-        </w:rPr>
-        <w:t>• {.}</w:t>
+        <w:t>{#</w:t>
+      </w:r>
+      <w:proofErr w:type="gramStart"/>
+      <w:r>
+        <w:rPr>
+          <w:rFonts w:cs="Segoe UI"/>
+          <w:color w:val="1A2634"/>
+          <w:sz w:val="21"/>
+          <w:szCs w:val="21"/>
+        </w:rPr>
+        <w:t>start}{</w:t>
+      </w:r>
+      <w:proofErr w:type="gramEnd"/>
+      <w:r>
+        <w:rPr>
+          <w:rFonts w:cs="Segoe UI"/>
+          <w:color w:val="1A2634"/>
+          <w:sz w:val="21"/>
+          <w:szCs w:val="21"/>
+        </w:rPr>
+        <w:t>start}{/start}{#end_or_present} – {end_or_present}{/end_or_present}</w:t>
+      </w:r>
+    </w:p>
+    <w:p>
+      <w:pPr>
+        <w:spacing w:after="0" w:line="22" w:lineRule="atLeast"/>
+        <w:rPr>
+          <w:rFonts w:cs="Segoe UI"/>
+          <w:color w:val="1A2634"/>
+          <w:sz w:val="21"/>
+          <w:szCs w:val="21"/>
+        </w:rPr>
+      </w:pPr>
+      <w:r>
+        <w:t>{#edu_</w:t>
+      </w:r>
+      <w:proofErr w:type="gramStart"/>
+      <w:r>
+        <w:t>competencies}</w:t>
+      </w:r>
+      <w:r>
+        <w:rPr>
+          <w:rFonts w:cs="Segoe UI"/>
+          <w:color w:val="1A2634"/>
+          <w:sz w:val="21"/>
+          <w:szCs w:val="21"/>
+        </w:rPr>
+        <w:t>•</w:t>
+      </w:r>
+      <w:proofErr w:type="gramEnd"/>
+      <w:r>
+        <w:rPr>
+          <w:rFonts w:cs="Segoe UI"/>
+          <w:color w:val="1A2634"/>
+          <w:sz w:val="21"/>
+          <w:szCs w:val="21"/>
+        </w:rPr>
+        <w:t xml:space="preserve"> {.}</w:t>
+      </w:r>
+      <w:r>
+        <w:rPr>
+          <w:rFonts w:cs="Segoe UI"/>
+          <w:color w:val="1A2634"/>
+          <w:sz w:val="21"/>
+          <w:szCs w:val="21"/>
+        </w:rPr>
+        <w:t>{/edu_competencies}</w:t>
       </w:r>
       <w:r>
         <w:rPr>
@@ -418,105 +416,7 @@
           <w:szCs w:val="21"/>
         </w:rPr>
         <w:br/>
-      </w:r>
-      <w:r>
-        <w:rPr>
-          <w:rFonts w:cs="Segoe UI"/>
-          <w:color w:val="1A2634"/>
-          <w:sz w:val="21"/>
-          <w:szCs w:val="21"/>
-        </w:rPr>
-        <w:t>{/</w:t>
-      </w:r>
-      <w:proofErr w:type="spellStart"/>
-      <w:r>
-        <w:rPr>
-          <w:rFonts w:cs="Segoe UI"/>
-          <w:color w:val="1A2634"/>
-          <w:sz w:val="21"/>
-          <w:szCs w:val="21"/>
-        </w:rPr>
-        <w:t>edu_competencies</w:t>
-      </w:r>
-      <w:proofErr w:type="spellEnd"/>
-      <w:r>
-        <w:rPr>
-          <w:rFonts w:cs="Segoe UI"/>
-          <w:color w:val="1A2634"/>
-          <w:sz w:val="21"/>
-          <w:szCs w:val="21"/>
-        </w:rPr>
-        <w:t>}</w:t>
-      </w:r>
-      <w:r>
-        <w:rPr>
-          <w:rFonts w:cs="Segoe UI"/>
-          <w:color w:val="1A2634"/>
-          <w:sz w:val="21"/>
-          <w:szCs w:val="21"/>
-        </w:rPr>
-        <w:br/>
-        <w:t>{#edu_detail}</w:t>
-      </w:r>
-      <w:r>
-        <w:rPr>
-          <w:rFonts w:cs="Segoe UI"/>
-          <w:color w:val="1A2634"/>
-          <w:sz w:val="21"/>
-          <w:szCs w:val="21"/>
-        </w:rPr>
-        <w:br/>
-        <w:t>{</w:t>
-      </w:r>
-      <w:proofErr w:type="spellStart"/>
-      <w:r>
-        <w:rPr>
-          <w:rFonts w:cs="Segoe UI"/>
-          <w:color w:val="1A2634"/>
-          <w:sz w:val="21"/>
-          <w:szCs w:val="21"/>
-        </w:rPr>
-        <w:t>edu_detail</w:t>
-      </w:r>
-      <w:proofErr w:type="spellEnd"/>
-      <w:r>
-        <w:rPr>
-          <w:rFonts w:cs="Segoe UI"/>
-          <w:color w:val="1A2634"/>
-          <w:sz w:val="21"/>
-          <w:szCs w:val="21"/>
-        </w:rPr>
-        <w:t>}</w:t>
-      </w:r>
-      <w:r>
-        <w:rPr>
-          <w:rFonts w:cs="Segoe UI"/>
-          <w:color w:val="1A2634"/>
-          <w:sz w:val="21"/>
-          <w:szCs w:val="21"/>
-        </w:rPr>
-        <w:br/>
-        <w:t>{/</w:t>
-      </w:r>
-      <w:proofErr w:type="spellStart"/>
-      <w:r>
-        <w:rPr>
-          <w:rFonts w:cs="Segoe UI"/>
-          <w:color w:val="1A2634"/>
-          <w:sz w:val="21"/>
-          <w:szCs w:val="21"/>
-        </w:rPr>
-        <w:t>edu_detail</w:t>
-      </w:r>
-      <w:proofErr w:type="spellEnd"/>
-      <w:r>
-        <w:rPr>
-          <w:rFonts w:cs="Segoe UI"/>
-          <w:color w:val="1A2634"/>
-          <w:sz w:val="21"/>
-          <w:szCs w:val="21"/>
-        </w:rPr>
-        <w:t>}</w:t>
+        <w:t>{#edu_detail}{edu_detail}{/edu_detail}</w:t>
       </w:r>
       <w:r>
         <w:rPr>
@@ -642,271 +542,127 @@
           <w:sz w:val="21"/>
           <w:szCs w:val="21"/>
         </w:rPr>
-        <w:t>{</w:t>
-      </w:r>
-      <w:proofErr w:type="spellStart"/>
-      <w:r>
-        <w:rPr>
-          <w:rFonts w:cs="Segoe UI"/>
-          <w:b/>
-          <w:bCs/>
-          <w:color w:val="1A2634"/>
-          <w:sz w:val="21"/>
-          <w:szCs w:val="21"/>
-        </w:rPr>
-        <w:t>project_title</w:t>
-      </w:r>
-      <w:proofErr w:type="spellEnd"/>
-      <w:r>
-        <w:rPr>
-          <w:rFonts w:cs="Segoe UI"/>
-          <w:b/>
-          <w:bCs/>
-          <w:color w:val="1A2634"/>
-          <w:sz w:val="21"/>
-          <w:szCs w:val="21"/>
-        </w:rPr>
-        <w:t>}</w:t>
-      </w:r>
-    </w:p>
-    <w:p>
-      <w:pPr>
-        <w:spacing w:after="0" w:line="22" w:lineRule="atLeast"/>
-        <w:rPr>
-          <w:rFonts w:cs="Segoe UI"/>
-          <w:color w:val="1A2634"/>
-          <w:sz w:val="21"/>
-          <w:szCs w:val="21"/>
-        </w:rPr>
-      </w:pPr>
-      <w:r>
-        <w:rPr>
-          <w:rFonts w:cs="Segoe UI"/>
-          <w:color w:val="1A2634"/>
-          <w:sz w:val="21"/>
-          <w:szCs w:val="21"/>
-        </w:rPr>
-        <w:t>{#start}{start}{/start}{#end_or_present} – {</w:t>
-      </w:r>
-      <w:proofErr w:type="spellStart"/>
-      <w:r>
-        <w:rPr>
-          <w:rFonts w:cs="Segoe UI"/>
-          <w:color w:val="1A2634"/>
-          <w:sz w:val="21"/>
-          <w:szCs w:val="21"/>
-        </w:rPr>
-        <w:t>end_or_present</w:t>
-      </w:r>
-      <w:proofErr w:type="spellEnd"/>
-      <w:r>
-        <w:rPr>
-          <w:rFonts w:cs="Segoe UI"/>
-          <w:color w:val="1A2634"/>
-          <w:sz w:val="21"/>
-          <w:szCs w:val="21"/>
-        </w:rPr>
-        <w:t>}{/</w:t>
-      </w:r>
-      <w:proofErr w:type="spellStart"/>
-      <w:r>
-        <w:rPr>
-          <w:rFonts w:cs="Segoe UI"/>
-          <w:color w:val="1A2634"/>
-          <w:sz w:val="21"/>
-          <w:szCs w:val="21"/>
-        </w:rPr>
-        <w:t>end_or_present</w:t>
-      </w:r>
-      <w:proofErr w:type="spellEnd"/>
-      <w:r>
-        <w:rPr>
-          <w:rFonts w:cs="Segoe UI"/>
-          <w:color w:val="1A2634"/>
-          <w:sz w:val="21"/>
-          <w:szCs w:val="21"/>
-        </w:rPr>
-        <w:t>}</w:t>
-      </w:r>
-    </w:p>
-    <w:p>
-      <w:pPr>
-        <w:spacing w:after="0" w:line="22" w:lineRule="atLeast"/>
-        <w:rPr>
-          <w:rFonts w:cs="Segoe UI"/>
-          <w:color w:val="1A2634"/>
-          <w:sz w:val="21"/>
-          <w:szCs w:val="21"/>
-        </w:rPr>
-      </w:pPr>
-      <w:r>
-        <w:rPr>
-          <w:rFonts w:cs="Segoe UI"/>
-          <w:color w:val="1A2634"/>
-          <w:sz w:val="21"/>
-          <w:szCs w:val="21"/>
-        </w:rPr>
-        <w:t>{#project_description}</w:t>
-      </w:r>
-    </w:p>
-    <w:p>
-      <w:pPr>
-        <w:spacing w:after="0" w:line="22" w:lineRule="atLeast"/>
-        <w:rPr>
-          <w:rFonts w:cs="Segoe UI"/>
-          <w:color w:val="1A2634"/>
-          <w:sz w:val="21"/>
-          <w:szCs w:val="21"/>
-        </w:rPr>
-      </w:pPr>
-      <w:r>
-        <w:rPr>
-          <w:rFonts w:cs="Segoe UI"/>
-          <w:color w:val="1A2634"/>
-          <w:sz w:val="21"/>
-          <w:szCs w:val="21"/>
-        </w:rPr>
-        <w:t>{</w:t>
-      </w:r>
-      <w:proofErr w:type="spellStart"/>
-      <w:r>
-        <w:rPr>
-          <w:rFonts w:cs="Segoe UI"/>
-          <w:color w:val="1A2634"/>
-          <w:sz w:val="21"/>
-          <w:szCs w:val="21"/>
-        </w:rPr>
-        <w:t>project_description</w:t>
-      </w:r>
-      <w:proofErr w:type="spellEnd"/>
-      <w:r>
-        <w:rPr>
-          <w:rFonts w:cs="Segoe UI"/>
-          <w:color w:val="1A2634"/>
-          <w:sz w:val="21"/>
-          <w:szCs w:val="21"/>
-        </w:rPr>
-        <w:t>}</w:t>
-      </w:r>
-    </w:p>
-    <w:p>
-      <w:pPr>
-        <w:spacing w:after="0" w:line="22" w:lineRule="atLeast"/>
-        <w:rPr>
-          <w:rFonts w:cs="Segoe UI"/>
-          <w:color w:val="1A2634"/>
-          <w:sz w:val="21"/>
-          <w:szCs w:val="21"/>
-        </w:rPr>
-      </w:pPr>
-      <w:r>
-        <w:rPr>
-          <w:rFonts w:cs="Segoe UI"/>
-          <w:color w:val="1A2634"/>
-          <w:sz w:val="21"/>
-          <w:szCs w:val="21"/>
-        </w:rPr>
-        <w:t>{/</w:t>
-      </w:r>
-      <w:proofErr w:type="spellStart"/>
-      <w:r>
-        <w:rPr>
-          <w:rFonts w:cs="Segoe UI"/>
-          <w:color w:val="1A2634"/>
-          <w:sz w:val="21"/>
-          <w:szCs w:val="21"/>
-        </w:rPr>
-        <w:t>project_description</w:t>
-      </w:r>
-      <w:proofErr w:type="spellEnd"/>
-      <w:r>
-        <w:rPr>
-          <w:rFonts w:cs="Segoe UI"/>
-          <w:color w:val="1A2634"/>
-          <w:sz w:val="21"/>
-          <w:szCs w:val="21"/>
-        </w:rPr>
-        <w:t>}</w:t>
-      </w:r>
-    </w:p>
-    <w:p>
-      <w:pPr>
-        <w:spacing w:after="0" w:line="22" w:lineRule="atLeast"/>
-        <w:rPr>
-          <w:rFonts w:cs="Segoe UI"/>
-          <w:color w:val="1A2634"/>
-          <w:sz w:val="21"/>
-          <w:szCs w:val="21"/>
-        </w:rPr>
-      </w:pPr>
-      <w:r>
-        <w:rPr>
-          <w:rFonts w:cs="Segoe UI"/>
-          <w:color w:val="1A2634"/>
-          <w:sz w:val="21"/>
-          <w:szCs w:val="21"/>
-        </w:rPr>
-        <w:t>{#project_tasks}</w:t>
-      </w:r>
-    </w:p>
-    <w:p>
-      <w:pPr>
-        <w:spacing w:after="0" w:line="22" w:lineRule="atLeast"/>
-        <w:rPr>
-          <w:rFonts w:cs="Segoe UI"/>
-          <w:color w:val="1A2634"/>
-          <w:sz w:val="21"/>
-          <w:szCs w:val="21"/>
-        </w:rPr>
-      </w:pPr>
-      <w:r>
-        <w:rPr>
-          <w:rFonts w:cs="Segoe UI"/>
-          <w:color w:val="1A2634"/>
-          <w:sz w:val="21"/>
-          <w:szCs w:val="21"/>
-        </w:rPr>
-        <w:t>• {.}</w:t>
-      </w:r>
-    </w:p>
-    <w:p>
-      <w:pPr>
-        <w:spacing w:after="0" w:line="22" w:lineRule="atLeast"/>
-        <w:rPr>
-          <w:rFonts w:cs="Segoe UI"/>
-          <w:color w:val="1A2634"/>
-          <w:sz w:val="21"/>
-          <w:szCs w:val="21"/>
-        </w:rPr>
-      </w:pPr>
-      <w:r>
-        <w:rPr>
-          <w:rFonts w:cs="Segoe UI"/>
-          <w:color w:val="1A2634"/>
-          <w:sz w:val="21"/>
-          <w:szCs w:val="21"/>
-        </w:rPr>
-        <w:t>{/</w:t>
-      </w:r>
-      <w:proofErr w:type="spellStart"/>
-      <w:r>
-        <w:rPr>
-          <w:rFonts w:cs="Segoe UI"/>
-          <w:color w:val="1A2634"/>
-          <w:sz w:val="21"/>
-          <w:szCs w:val="21"/>
-        </w:rPr>
-        <w:t>project_tasks</w:t>
-      </w:r>
-      <w:proofErr w:type="spellEnd"/>
-      <w:r>
-        <w:rPr>
-          <w:rFonts w:cs="Segoe UI"/>
-          <w:color w:val="1A2634"/>
-          <w:sz w:val="21"/>
-          <w:szCs w:val="21"/>
-        </w:rPr>
-        <w:t>}</w:t>
+        <w:t>{project_title}</w:t>
+      </w:r>
+    </w:p>
+    <w:p>
+      <w:pPr>
+        <w:spacing w:after="0" w:line="22" w:lineRule="atLeast"/>
+        <w:rPr>
+          <w:rFonts w:cs="Segoe UI"/>
+          <w:color w:val="1A2634"/>
+          <w:sz w:val="21"/>
+          <w:szCs w:val="21"/>
+        </w:rPr>
+      </w:pPr>
+      <w:r>
+        <w:rPr>
+          <w:rFonts w:cs="Segoe UI"/>
+          <w:color w:val="1A2634"/>
+          <w:sz w:val="21"/>
+          <w:szCs w:val="21"/>
+        </w:rPr>
+        <w:t>{#</w:t>
+      </w:r>
+      <w:proofErr w:type="gramStart"/>
+      <w:r>
+        <w:rPr>
+          <w:rFonts w:cs="Segoe UI"/>
+          <w:color w:val="1A2634"/>
+          <w:sz w:val="21"/>
+          <w:szCs w:val="21"/>
+        </w:rPr>
+        <w:t>start}{</w:t>
+      </w:r>
+      <w:proofErr w:type="gramEnd"/>
+      <w:r>
+        <w:rPr>
+          <w:rFonts w:cs="Segoe UI"/>
+          <w:color w:val="1A2634"/>
+          <w:sz w:val="21"/>
+          <w:szCs w:val="21"/>
+        </w:rPr>
+        <w:t>start}{/start}{#end_or_present} – {end_or_present}{/end_or_present}</w:t>
+      </w:r>
+    </w:p>
+    <w:p>
+      <w:pPr>
+        <w:spacing w:after="0" w:line="22" w:lineRule="atLeast"/>
+        <w:rPr>
+          <w:rFonts w:cs="Segoe UI"/>
+          <w:color w:val="1A2634"/>
+          <w:sz w:val="21"/>
+          <w:szCs w:val="21"/>
+        </w:rPr>
+      </w:pPr>
+      <w:r>
+        <w:rPr>
+          <w:rFonts w:cs="Segoe UI"/>
+          <w:color w:val="1A2634"/>
+          <w:sz w:val="21"/>
+          <w:szCs w:val="21"/>
+        </w:rPr>
+        <w:t>{#project_</w:t>
+      </w:r>
+      <w:proofErr w:type="gramStart"/>
+      <w:r>
+        <w:rPr>
+          <w:rFonts w:cs="Segoe UI"/>
+          <w:color w:val="1A2634"/>
+          <w:sz w:val="21"/>
+          <w:szCs w:val="21"/>
+        </w:rPr>
+        <w:t>description}{</w:t>
+      </w:r>
+      <w:proofErr w:type="gramEnd"/>
+      <w:r>
+        <w:rPr>
+          <w:rFonts w:cs="Segoe UI"/>
+          <w:color w:val="1A2634"/>
+          <w:sz w:val="21"/>
+          <w:szCs w:val="21"/>
+        </w:rPr>
+        <w:t>project_description}{/project_description}</w:t>
+      </w:r>
+    </w:p>
+    <w:p>
+      <w:pPr>
+        <w:spacing w:after="0" w:line="22" w:lineRule="atLeast"/>
+        <w:rPr>
+          <w:rFonts w:cs="Segoe UI"/>
+          <w:color w:val="1A2634"/>
+          <w:sz w:val="21"/>
+          <w:szCs w:val="21"/>
+        </w:rPr>
+      </w:pPr>
+      <w:r>
+        <w:rPr>
+          <w:rFonts w:cs="Segoe UI"/>
+          <w:color w:val="1A2634"/>
+          <w:sz w:val="21"/>
+          <w:szCs w:val="21"/>
+        </w:rPr>
+        <w:t>{#project_</w:t>
+      </w:r>
+      <w:proofErr w:type="gramStart"/>
+      <w:r>
+        <w:rPr>
+          <w:rFonts w:cs="Segoe UI"/>
+          <w:color w:val="1A2634"/>
+          <w:sz w:val="21"/>
+          <w:szCs w:val="21"/>
+        </w:rPr>
+        <w:t>tasks}•</w:t>
+      </w:r>
+      <w:proofErr w:type="gramEnd"/>
+      <w:r>
+        <w:rPr>
+          <w:rFonts w:cs="Segoe UI"/>
+          <w:color w:val="1A2634"/>
+          <w:sz w:val="21"/>
+          <w:szCs w:val="21"/>
+        </w:rPr>
+        <w:t xml:space="preserve"> {.}{/project_tasks}</w:t>
       </w:r>
     </w:p>
     <w:p>
@@ -1097,208 +853,116 @@
           <w:sz w:val="21"/>
           <w:szCs w:val="21"/>
         </w:rPr>
-        <w:t>{#start}{start}{/start}{#end_or_present} – {</w:t>
-      </w:r>
-      <w:proofErr w:type="spellStart"/>
-      <w:r>
-        <w:rPr>
-          <w:rFonts w:cs="Segoe UI"/>
-          <w:color w:val="1A2634"/>
-          <w:sz w:val="21"/>
-          <w:szCs w:val="21"/>
-        </w:rPr>
-        <w:t>end_or_present</w:t>
-      </w:r>
-      <w:proofErr w:type="spellEnd"/>
-      <w:r>
-        <w:rPr>
-          <w:rFonts w:cs="Segoe UI"/>
-          <w:color w:val="1A2634"/>
-          <w:sz w:val="21"/>
-          <w:szCs w:val="21"/>
-        </w:rPr>
-        <w:t>}{/</w:t>
-      </w:r>
-      <w:proofErr w:type="spellStart"/>
-      <w:r>
-        <w:rPr>
-          <w:rFonts w:cs="Segoe UI"/>
-          <w:color w:val="1A2634"/>
-          <w:sz w:val="21"/>
-          <w:szCs w:val="21"/>
-        </w:rPr>
-        <w:t>end_or_present</w:t>
-      </w:r>
-      <w:proofErr w:type="spellEnd"/>
-      <w:r>
-        <w:rPr>
-          <w:rFonts w:cs="Segoe UI"/>
-          <w:color w:val="1A2634"/>
-          <w:sz w:val="21"/>
-          <w:szCs w:val="21"/>
-        </w:rPr>
-        <w:t>}</w:t>
-      </w:r>
-    </w:p>
-    <w:p>
-      <w:pPr>
-        <w:spacing w:after="0" w:line="22" w:lineRule="atLeast"/>
-        <w:rPr>
-          <w:rFonts w:cs="Segoe UI"/>
-          <w:color w:val="1A2634"/>
-          <w:sz w:val="21"/>
-          <w:szCs w:val="21"/>
-        </w:rPr>
-      </w:pPr>
-      <w:r>
-        <w:rPr>
-          <w:rFonts w:cs="Segoe UI"/>
-          <w:color w:val="1A2634"/>
-          <w:sz w:val="21"/>
-          <w:szCs w:val="21"/>
-        </w:rPr>
-        <w:lastRenderedPageBreak/>
-        <w:t>{#role_summary}</w:t>
-      </w:r>
-    </w:p>
-    <w:p>
-      <w:pPr>
-        <w:spacing w:after="0" w:line="22" w:lineRule="atLeast"/>
-        <w:rPr>
-          <w:rFonts w:cs="Segoe UI"/>
-          <w:color w:val="1A2634"/>
-          <w:sz w:val="21"/>
-          <w:szCs w:val="21"/>
-        </w:rPr>
-      </w:pPr>
-      <w:r>
-        <w:rPr>
-          <w:rFonts w:cs="Segoe UI"/>
-          <w:color w:val="1A2634"/>
-          <w:sz w:val="21"/>
-          <w:szCs w:val="21"/>
-        </w:rPr>
-        <w:t>{</w:t>
-      </w:r>
-      <w:proofErr w:type="spellStart"/>
-      <w:r>
-        <w:rPr>
-          <w:rFonts w:cs="Segoe UI"/>
-          <w:color w:val="1A2634"/>
-          <w:sz w:val="21"/>
-          <w:szCs w:val="21"/>
-        </w:rPr>
-        <w:t>role_summary</w:t>
-      </w:r>
-      <w:proofErr w:type="spellEnd"/>
-      <w:r>
-        <w:rPr>
-          <w:rFonts w:cs="Segoe UI"/>
-          <w:color w:val="1A2634"/>
-          <w:sz w:val="21"/>
-          <w:szCs w:val="21"/>
-        </w:rPr>
-        <w:t>}</w:t>
-      </w:r>
-    </w:p>
-    <w:p>
-      <w:pPr>
-        <w:spacing w:after="0" w:line="22" w:lineRule="atLeast"/>
-        <w:rPr>
-          <w:rFonts w:cs="Segoe UI"/>
-          <w:color w:val="1A2634"/>
-          <w:sz w:val="21"/>
-          <w:szCs w:val="21"/>
-        </w:rPr>
-      </w:pPr>
-      <w:r>
-        <w:rPr>
-          <w:rFonts w:cs="Segoe UI"/>
-          <w:color w:val="1A2634"/>
-          <w:sz w:val="21"/>
-          <w:szCs w:val="21"/>
-        </w:rPr>
-        <w:t>{/</w:t>
-      </w:r>
-      <w:proofErr w:type="spellStart"/>
-      <w:r>
-        <w:rPr>
-          <w:rFonts w:cs="Segoe UI"/>
-          <w:color w:val="1A2634"/>
-          <w:sz w:val="21"/>
-          <w:szCs w:val="21"/>
-        </w:rPr>
-        <w:t>role_summary</w:t>
-      </w:r>
-      <w:proofErr w:type="spellEnd"/>
-      <w:r>
-        <w:rPr>
-          <w:rFonts w:cs="Segoe UI"/>
-          <w:color w:val="1A2634"/>
-          <w:sz w:val="21"/>
-          <w:szCs w:val="21"/>
-        </w:rPr>
-        <w:t>}</w:t>
-      </w:r>
-    </w:p>
-    <w:p>
-      <w:pPr>
-        <w:spacing w:after="0" w:line="22" w:lineRule="atLeast"/>
-        <w:rPr>
-          <w:rFonts w:cs="Segoe UI"/>
-          <w:color w:val="1A2634"/>
-          <w:sz w:val="21"/>
-          <w:szCs w:val="21"/>
-        </w:rPr>
-      </w:pPr>
-      <w:r>
-        <w:rPr>
-          <w:rFonts w:cs="Segoe UI"/>
-          <w:color w:val="1A2634"/>
-          <w:sz w:val="21"/>
-          <w:szCs w:val="21"/>
-        </w:rPr>
-        <w:t>{#tasks}</w:t>
-      </w:r>
-    </w:p>
-    <w:p>
-      <w:pPr>
-        <w:spacing w:after="0" w:line="22" w:lineRule="atLeast"/>
-        <w:rPr>
-          <w:rFonts w:cs="Segoe UI"/>
-          <w:color w:val="1A2634"/>
-          <w:sz w:val="21"/>
-          <w:szCs w:val="21"/>
-        </w:rPr>
-      </w:pPr>
-      <w:r>
-        <w:rPr>
-          <w:rFonts w:cs="Segoe UI"/>
-          <w:color w:val="1A2634"/>
-          <w:sz w:val="21"/>
-          <w:szCs w:val="21"/>
-        </w:rPr>
-        <w:t>• {.}</w:t>
-      </w:r>
-    </w:p>
-    <w:p>
-      <w:pPr>
-        <w:spacing w:after="0" w:line="22" w:lineRule="atLeast"/>
-        <w:rPr>
-          <w:rFonts w:cs="Segoe UI"/>
-          <w:color w:val="1A2634"/>
-          <w:sz w:val="21"/>
-          <w:szCs w:val="21"/>
-        </w:rPr>
-      </w:pPr>
-      <w:r>
-        <w:rPr>
-          <w:rFonts w:cs="Segoe UI"/>
-          <w:color w:val="1A2634"/>
-          <w:sz w:val="21"/>
-          <w:szCs w:val="21"/>
-        </w:rPr>
-        <w:t>{/tasks}</w:t>
+        <w:t>{#</w:t>
+      </w:r>
+      <w:proofErr w:type="gramStart"/>
+      <w:r>
+        <w:rPr>
+          <w:rFonts w:cs="Segoe UI"/>
+          <w:color w:val="1A2634"/>
+          <w:sz w:val="21"/>
+          <w:szCs w:val="21"/>
+        </w:rPr>
+        <w:t>start}{</w:t>
+      </w:r>
+      <w:proofErr w:type="gramEnd"/>
+      <w:r>
+        <w:rPr>
+          <w:rFonts w:cs="Segoe UI"/>
+          <w:color w:val="1A2634"/>
+          <w:sz w:val="21"/>
+          <w:szCs w:val="21"/>
+        </w:rPr>
+        <w:t>start}{/start}{#end_or_present} – {end_or_present}{/end_or_present}</w:t>
+      </w:r>
+    </w:p>
+    <w:p>
+      <w:pPr>
+        <w:spacing w:after="0" w:line="22" w:lineRule="atLeast"/>
+        <w:rPr>
+          <w:rFonts w:cs="Segoe UI"/>
+          <w:color w:val="1A2634"/>
+          <w:sz w:val="21"/>
+          <w:szCs w:val="21"/>
+        </w:rPr>
+      </w:pPr>
+      <w:r>
+        <w:rPr>
+          <w:rFonts w:cs="Segoe UI"/>
+          <w:color w:val="1A2634"/>
+          <w:sz w:val="21"/>
+          <w:szCs w:val="21"/>
+        </w:rPr>
+        <w:t>{#role_</w:t>
+      </w:r>
+      <w:proofErr w:type="gramStart"/>
+      <w:r>
+        <w:rPr>
+          <w:rFonts w:cs="Segoe UI"/>
+          <w:color w:val="1A2634"/>
+          <w:sz w:val="21"/>
+          <w:szCs w:val="21"/>
+        </w:rPr>
+        <w:t>summary}{</w:t>
+      </w:r>
+      <w:proofErr w:type="gramEnd"/>
+      <w:r>
+        <w:rPr>
+          <w:rFonts w:cs="Segoe UI"/>
+          <w:color w:val="1A2634"/>
+          <w:sz w:val="21"/>
+          <w:szCs w:val="21"/>
+        </w:rPr>
+        <w:t>role_summary}</w:t>
+      </w:r>
+      <w:r>
+        <w:rPr>
+          <w:rFonts w:cs="Segoe UI"/>
+          <w:color w:val="1A2634"/>
+          <w:sz w:val="21"/>
+          <w:szCs w:val="21"/>
+        </w:rPr>
+        <w:t>{/role_summary}</w:t>
+      </w:r>
+    </w:p>
+    <w:p>
+      <w:pPr>
+        <w:spacing w:after="0" w:line="22" w:lineRule="atLeast"/>
+        <w:rPr>
+          <w:rFonts w:cs="Segoe UI"/>
+          <w:color w:val="1A2634"/>
+          <w:sz w:val="21"/>
+          <w:szCs w:val="21"/>
+        </w:rPr>
+      </w:pPr>
+      <w:r>
+        <w:rPr>
+          <w:rFonts w:cs="Segoe UI"/>
+          <w:color w:val="1A2634"/>
+          <w:sz w:val="21"/>
+          <w:szCs w:val="21"/>
+        </w:rPr>
+        <w:t>{#</w:t>
+      </w:r>
+      <w:proofErr w:type="gramStart"/>
+      <w:r>
+        <w:rPr>
+          <w:rFonts w:cs="Segoe UI"/>
+          <w:color w:val="1A2634"/>
+          <w:sz w:val="21"/>
+          <w:szCs w:val="21"/>
+        </w:rPr>
+        <w:t>tasks}•</w:t>
+      </w:r>
+      <w:proofErr w:type="gramEnd"/>
+      <w:r>
+        <w:rPr>
+          <w:rFonts w:cs="Segoe UI"/>
+          <w:color w:val="1A2634"/>
+          <w:sz w:val="21"/>
+          <w:szCs w:val="21"/>
+        </w:rPr>
+        <w:t xml:space="preserve"> {.}{/tasks}</w:t>
       </w:r>
     </w:p>
     <w:p>
@@ -1387,44 +1051,43 @@
       <w:pPr>
         <w:spacing w:after="0" w:line="22" w:lineRule="atLeast"/>
         <w:rPr>
-          <w:sz w:val="21"/>
-          <w:szCs w:val="21"/>
-        </w:rPr>
-      </w:pPr>
-      <w:r>
-        <w:rPr>
-          <w:sz w:val="21"/>
-          <w:szCs w:val="21"/>
-        </w:rPr>
-        <w:t>{#certifications}</w:t>
-      </w:r>
-    </w:p>
-    <w:p>
-      <w:pPr>
-        <w:spacing w:after="0" w:line="22" w:lineRule="atLeast"/>
-        <w:rPr>
-          <w:sz w:val="21"/>
-          <w:szCs w:val="21"/>
-        </w:rPr>
-      </w:pPr>
-      <w:r>
-        <w:rPr>
-          <w:sz w:val="21"/>
-          <w:szCs w:val="21"/>
-        </w:rPr>
-        <w:t>• {.}</w:t>
-      </w:r>
-    </w:p>
-    <w:p>
-      <w:pPr>
-        <w:spacing w:after="0" w:line="22" w:lineRule="atLeast"/>
-        <w:rPr>
-          <w:rFonts w:cs="Segoe UI"/>
-          <w:color w:val="1A2634"/>
-          <w:sz w:val="21"/>
-          <w:szCs w:val="21"/>
-        </w:rPr>
-      </w:pPr>
+          <w:rFonts w:cs="Segoe UI"/>
+          <w:color w:val="1A2634"/>
+          <w:sz w:val="21"/>
+          <w:szCs w:val="21"/>
+        </w:rPr>
+      </w:pPr>
+      <w:r>
+        <w:rPr>
+          <w:sz w:val="21"/>
+          <w:szCs w:val="21"/>
+        </w:rPr>
+        <w:lastRenderedPageBreak/>
+        <w:t>{#</w:t>
+      </w:r>
+      <w:proofErr w:type="gramStart"/>
+      <w:r>
+        <w:rPr>
+          <w:sz w:val="21"/>
+          <w:szCs w:val="21"/>
+        </w:rPr>
+        <w:t>certifications}</w:t>
+      </w:r>
+      <w:r>
+        <w:rPr>
+          <w:sz w:val="21"/>
+          <w:szCs w:val="21"/>
+        </w:rPr>
+        <w:t>•</w:t>
+      </w:r>
+      <w:proofErr w:type="gramEnd"/>
+      <w:r>
+        <w:rPr>
+          <w:sz w:val="21"/>
+          <w:szCs w:val="21"/>
+        </w:rPr>
+        <w:t xml:space="preserve"> {.}</w:t>
+      </w:r>
       <w:r>
         <w:rPr>
           <w:rFonts w:cs="Segoe UI"/>
@@ -1483,7 +1146,7 @@
     </w:p>
     <w:p>
       <w:pPr>
-        <w:spacing w:before="200" w:after="0" w:line="22" w:lineRule="atLeast"/>
+        <w:spacing w:after="0" w:line="22" w:lineRule="atLeast"/>
         <w:rPr>
           <w:rFonts w:cs="Segoe UI"/>
           <w:color w:val="1A2634"/>
@@ -1509,207 +1172,135 @@
           <w:szCs w:val="21"/>
         </w:rPr>
         <w:br/>
+      </w:r>
+      <w:r>
+        <w:rPr>
+          <w:rFonts w:cs="Segoe UI"/>
+          <w:color w:val="1A2634"/>
+          <w:sz w:val="21"/>
+          <w:szCs w:val="21"/>
+        </w:rPr>
         <w:t>{#extra_sections}</w:t>
       </w:r>
-      <w:r>
-        <w:rPr>
-          <w:rFonts w:cs="Segoe UI"/>
-          <w:color w:val="1A2634"/>
-          <w:sz w:val="21"/>
-          <w:szCs w:val="21"/>
-        </w:rPr>
-        <w:br/>
-        <w:t>{#section_title}</w:t>
-      </w:r>
-      <w:r>
-        <w:rPr>
-          <w:rFonts w:cs="Segoe UI"/>
-          <w:color w:val="1A2634"/>
-          <w:sz w:val="21"/>
-          <w:szCs w:val="21"/>
-        </w:rPr>
-        <w:br/>
-        <w:t>{</w:t>
-      </w:r>
-      <w:proofErr w:type="spellStart"/>
-      <w:r>
-        <w:rPr>
-          <w:rFonts w:cs="Segoe UI"/>
-          <w:color w:val="1A2634"/>
-          <w:sz w:val="21"/>
-          <w:szCs w:val="21"/>
-        </w:rPr>
-        <w:t>section_title</w:t>
-      </w:r>
-      <w:proofErr w:type="spellEnd"/>
-      <w:r>
-        <w:rPr>
-          <w:rFonts w:cs="Segoe UI"/>
-          <w:color w:val="1A2634"/>
-          <w:sz w:val="21"/>
-          <w:szCs w:val="21"/>
-        </w:rPr>
-        <w:t>}</w:t>
-      </w:r>
-      <w:r>
-        <w:rPr>
-          <w:rFonts w:cs="Segoe UI"/>
-          <w:color w:val="1A2634"/>
-          <w:sz w:val="21"/>
-          <w:szCs w:val="21"/>
-        </w:rPr>
-        <w:br/>
-        <w:t>{/</w:t>
-      </w:r>
-      <w:proofErr w:type="spellStart"/>
-      <w:r>
-        <w:rPr>
-          <w:rFonts w:cs="Segoe UI"/>
-          <w:color w:val="1A2634"/>
-          <w:sz w:val="21"/>
-          <w:szCs w:val="21"/>
-        </w:rPr>
-        <w:t>section_title</w:t>
-      </w:r>
-      <w:proofErr w:type="spellEnd"/>
-      <w:r>
-        <w:rPr>
-          <w:rFonts w:cs="Segoe UI"/>
-          <w:color w:val="1A2634"/>
-          <w:sz w:val="21"/>
-          <w:szCs w:val="21"/>
-        </w:rPr>
-        <w:t>}</w:t>
-      </w:r>
-      <w:r>
-        <w:rPr>
-          <w:rFonts w:cs="Segoe UI"/>
-          <w:color w:val="1A2634"/>
-          <w:sz w:val="21"/>
-          <w:szCs w:val="21"/>
-        </w:rPr>
-        <w:br/>
-        <w:t>{#items}</w:t>
-      </w:r>
-      <w:r>
-        <w:rPr>
-          <w:rFonts w:cs="Segoe UI"/>
-          <w:color w:val="1A2634"/>
-          <w:sz w:val="21"/>
-          <w:szCs w:val="21"/>
-        </w:rPr>
-        <w:br/>
-        <w:t>• {.}</w:t>
-      </w:r>
-      <w:r>
-        <w:rPr>
-          <w:rFonts w:cs="Segoe UI"/>
-          <w:color w:val="1A2634"/>
-          <w:sz w:val="21"/>
-          <w:szCs w:val="21"/>
-        </w:rPr>
-        <w:br/>
-        <w:t>{/items}</w:t>
-      </w:r>
-      <w:r>
-        <w:rPr>
-          <w:rFonts w:cs="Segoe UI"/>
-          <w:color w:val="1A2634"/>
-          <w:sz w:val="21"/>
-          <w:szCs w:val="21"/>
-        </w:rPr>
-        <w:br/>
-        <w:t>{#section_content}</w:t>
-      </w:r>
-      <w:r>
-        <w:rPr>
-          <w:rFonts w:cs="Segoe UI"/>
-          <w:color w:val="1A2634"/>
-          <w:sz w:val="21"/>
-          <w:szCs w:val="21"/>
-        </w:rPr>
-        <w:br/>
-        <w:t>{</w:t>
-      </w:r>
-      <w:proofErr w:type="spellStart"/>
-      <w:r>
-        <w:rPr>
-          <w:rFonts w:cs="Segoe UI"/>
-          <w:color w:val="1A2634"/>
-          <w:sz w:val="21"/>
-          <w:szCs w:val="21"/>
-        </w:rPr>
-        <w:t>section_content</w:t>
-      </w:r>
-      <w:proofErr w:type="spellEnd"/>
-      <w:r>
-        <w:rPr>
-          <w:rFonts w:cs="Segoe UI"/>
-          <w:color w:val="1A2634"/>
-          <w:sz w:val="21"/>
-          <w:szCs w:val="21"/>
-        </w:rPr>
-        <w:t>}</w:t>
-      </w:r>
-      <w:r>
-        <w:rPr>
-          <w:rFonts w:cs="Segoe UI"/>
-          <w:color w:val="1A2634"/>
-          <w:sz w:val="21"/>
-          <w:szCs w:val="21"/>
-        </w:rPr>
-        <w:br/>
-        <w:t>{/</w:t>
-      </w:r>
-      <w:proofErr w:type="spellStart"/>
-      <w:r>
-        <w:rPr>
-          <w:rFonts w:cs="Segoe UI"/>
-          <w:color w:val="1A2634"/>
-          <w:sz w:val="21"/>
-          <w:szCs w:val="21"/>
-        </w:rPr>
-        <w:t>section_content</w:t>
-      </w:r>
-      <w:proofErr w:type="spellEnd"/>
-      <w:r>
-        <w:rPr>
-          <w:rFonts w:cs="Segoe UI"/>
-          <w:color w:val="1A2634"/>
-          <w:sz w:val="21"/>
-          <w:szCs w:val="21"/>
-        </w:rPr>
-        <w:t>}</w:t>
-      </w:r>
-      <w:r>
-        <w:rPr>
-          <w:rFonts w:cs="Segoe UI"/>
-          <w:color w:val="1A2634"/>
-          <w:sz w:val="21"/>
-          <w:szCs w:val="21"/>
-        </w:rPr>
-        <w:br/>
-        <w:t>{/</w:t>
-      </w:r>
-      <w:proofErr w:type="spellStart"/>
-      <w:r>
-        <w:rPr>
-          <w:rFonts w:cs="Segoe UI"/>
-          <w:color w:val="1A2634"/>
-          <w:sz w:val="21"/>
-          <w:szCs w:val="21"/>
-        </w:rPr>
-        <w:t>extra_sections</w:t>
-      </w:r>
-      <w:proofErr w:type="spellEnd"/>
-      <w:r>
-        <w:rPr>
-          <w:rFonts w:cs="Segoe UI"/>
-          <w:color w:val="1A2634"/>
-          <w:sz w:val="21"/>
-          <w:szCs w:val="21"/>
-        </w:rPr>
-        <w:t>}</w:t>
+    </w:p>
+    <w:p>
+      <w:pPr>
+        <w:spacing w:after="0" w:line="22" w:lineRule="atLeast"/>
+        <w:rPr>
+          <w:rFonts w:cs="Segoe UI"/>
+          <w:color w:val="1A2634"/>
+          <w:sz w:val="21"/>
+          <w:szCs w:val="21"/>
+        </w:rPr>
+      </w:pPr>
+      <w:r>
+        <w:rPr>
+          <w:rFonts w:cs="Segoe UI"/>
+          <w:color w:val="1A2634"/>
+          <w:sz w:val="21"/>
+          <w:szCs w:val="21"/>
+        </w:rPr>
+        <w:t>{section_title}</w:t>
+      </w:r>
+    </w:p>
+    <w:p>
+      <w:pPr>
+        <w:spacing w:after="0" w:line="22" w:lineRule="atLeast"/>
+        <w:rPr>
+          <w:rFonts w:cs="Segoe UI"/>
+          <w:color w:val="1A2634"/>
+          <w:sz w:val="21"/>
+          <w:szCs w:val="21"/>
+        </w:rPr>
+      </w:pPr>
+      <w:r>
+        <w:rPr>
+          <w:rFonts w:cs="Segoe UI"/>
+          <w:color w:val="1A2634"/>
+          <w:sz w:val="21"/>
+          <w:szCs w:val="21"/>
+        </w:rPr>
+        <w:t>{#</w:t>
+      </w:r>
+      <w:proofErr w:type="gramStart"/>
+      <w:r>
+        <w:rPr>
+          <w:rFonts w:cs="Segoe UI"/>
+          <w:color w:val="1A2634"/>
+          <w:sz w:val="21"/>
+          <w:szCs w:val="21"/>
+        </w:rPr>
+        <w:t>items}•</w:t>
+      </w:r>
+      <w:proofErr w:type="gramEnd"/>
+      <w:r>
+        <w:rPr>
+          <w:rFonts w:cs="Segoe UI"/>
+          <w:color w:val="1A2634"/>
+          <w:sz w:val="21"/>
+          <w:szCs w:val="21"/>
+        </w:rPr>
+        <w:t xml:space="preserve"> {.}{/items}</w:t>
+      </w:r>
+    </w:p>
+    <w:p>
+      <w:pPr>
+        <w:spacing w:after="0" w:line="22" w:lineRule="atLeast"/>
+        <w:rPr>
+          <w:rFonts w:cs="Segoe UI"/>
+          <w:color w:val="1A2634"/>
+          <w:sz w:val="21"/>
+          <w:szCs w:val="21"/>
+        </w:rPr>
+      </w:pPr>
+      <w:r>
+        <w:rPr>
+          <w:rFonts w:cs="Segoe UI"/>
+          <w:color w:val="1A2634"/>
+          <w:sz w:val="21"/>
+          <w:szCs w:val="21"/>
+        </w:rPr>
+        <w:t>{#section_</w:t>
+      </w:r>
+      <w:proofErr w:type="gramStart"/>
+      <w:r>
+        <w:rPr>
+          <w:rFonts w:cs="Segoe UI"/>
+          <w:color w:val="1A2634"/>
+          <w:sz w:val="21"/>
+          <w:szCs w:val="21"/>
+        </w:rPr>
+        <w:t>content}{</w:t>
+      </w:r>
+      <w:proofErr w:type="gramEnd"/>
+      <w:r>
+        <w:rPr>
+          <w:rFonts w:cs="Segoe UI"/>
+          <w:color w:val="1A2634"/>
+          <w:sz w:val="21"/>
+          <w:szCs w:val="21"/>
+        </w:rPr>
+        <w:t>section_content}{/section_content}</w:t>
+      </w:r>
+    </w:p>
+    <w:p>
+      <w:pPr>
+        <w:spacing w:after="0" w:line="22" w:lineRule="atLeast"/>
+        <w:rPr>
+          <w:rFonts w:cs="Segoe UI"/>
+          <w:color w:val="1A2634"/>
+          <w:sz w:val="21"/>
+          <w:szCs w:val="21"/>
+        </w:rPr>
+      </w:pPr>
+      <w:r>
+        <w:rPr>
+          <w:rFonts w:cs="Segoe UI"/>
+          <w:color w:val="1A2634"/>
+          <w:sz w:val="21"/>
+          <w:szCs w:val="21"/>
+        </w:rPr>
+        <w:t>{/extra_sections}</w:t>
       </w:r>
     </w:p>
     <w:p>
@@ -1763,18 +1354,35 @@
       <w:pPr>
         <w:spacing w:after="0" w:line="22" w:lineRule="atLeast"/>
         <w:rPr>
-          <w:rFonts w:cs="Segoe UI"/>
-          <w:color w:val="1A2634"/>
-          <w:sz w:val="21"/>
-          <w:szCs w:val="21"/>
-        </w:rPr>
-      </w:pPr>
-      <w:r>
-        <w:rPr>
-          <w:sz w:val="21"/>
-          <w:szCs w:val="21"/>
-        </w:rPr>
-        <w:t>{#references_list}</w:t>
+          <w:sz w:val="21"/>
+          <w:szCs w:val="21"/>
+        </w:rPr>
+      </w:pPr>
+      <w:r>
+        <w:rPr>
+          <w:sz w:val="21"/>
+          <w:szCs w:val="21"/>
+        </w:rPr>
+        <w:t>{REFERENCE_SECTION}</w:t>
+      </w:r>
+    </w:p>
+    <w:bookmarkEnd w:id="0"/>
+    <w:p>
+      <w:pPr>
+        <w:spacing w:after="0" w:line="22" w:lineRule="atLeast"/>
+        <w:rPr>
+          <w:rFonts w:cs="Segoe UI"/>
+          <w:color w:val="1A2634"/>
+          <w:sz w:val="21"/>
+          <w:szCs w:val="21"/>
+        </w:rPr>
+      </w:pPr>
+      <w:r>
+        <w:rPr>
+          <w:sz w:val="21"/>
+          <w:szCs w:val="21"/>
+        </w:rPr>
+        <w:t>{#HAS_REFERENCES_LIST}</w:t>
       </w:r>
       <w:r>
         <w:rPr>
@@ -1806,45 +1414,16 @@
           <w:szCs w:val="21"/>
         </w:rPr>
         <w:br/>
-        <w:t>{/</w:t>
-      </w:r>
-      <w:proofErr w:type="spellStart"/>
-      <w:r>
-        <w:rPr>
-          <w:sz w:val="21"/>
-          <w:szCs w:val="21"/>
-        </w:rPr>
-        <w:t>references_list</w:t>
-      </w:r>
-      <w:proofErr w:type="spellEnd"/>
-      <w:r>
-        <w:rPr>
-          <w:sz w:val="21"/>
-          <w:szCs w:val="21"/>
-        </w:rPr>
-        <w:t>}</w:t>
-      </w:r>
-    </w:p>
-    <w:p>
-      <w:pPr>
-        <w:spacing w:after="0" w:line="22" w:lineRule="atLeast"/>
-        <w:rPr>
-          <w:rFonts w:cs="Segoe UI"/>
-          <w:color w:val="1A2634"/>
-          <w:sz w:val="21"/>
-          <w:szCs w:val="21"/>
-        </w:rPr>
-      </w:pPr>
-      <w:r>
-        <w:rPr>
-          <w:rFonts w:cs="Segoe UI"/>
-          <w:color w:val="1A2634"/>
-          <w:sz w:val="21"/>
-          <w:szCs w:val="21"/>
-        </w:rPr>
+        <w:t>{/HAS_REFERENCES_LIST}</w:t>
+      </w:r>
+      <w:r>
+        <w:rPr>
+          <w:sz w:val="21"/>
+          <w:szCs w:val="21"/>
+        </w:rPr>
+        <w:br/>
         <w:t>{/HAS_REFERENCE}</w:t>
       </w:r>
-      <w:bookmarkEnd w:id="0"/>
     </w:p>
     <w:sectPr>
       <w:pgSz w:w="11909" w:h="16834" w:code="9"/>
@@ -2265,7 +1844,6 @@
   <w:style w:type="character" w:default="1" w:styleId="DefaultParagraphFont">
     <w:name w:val="Default Paragraph Font"/>
     <w:uiPriority w:val="1"/>
-    <w:semiHidden/>
     <w:unhideWhenUsed/>
   </w:style>
   <w:style w:type="table" w:default="1" w:styleId="TableNormal">

</xml_diff>

<commit_message>
Improve CV generation pipeline and validation
</commit_message>
<xml_diff>
--- a/templates/cv-template.docx
+++ b/templates/cv-template.docx
@@ -360,34 +360,148 @@
           <w:sz w:val="21"/>
           <w:szCs w:val="21"/>
         </w:rPr>
-        <w:t>start}{/start}{#end_or_present} – {end_or_present}{/end_or_present}</w:t>
-      </w:r>
-    </w:p>
-    <w:p>
-      <w:pPr>
-        <w:spacing w:after="0" w:line="22" w:lineRule="atLeast"/>
-        <w:rPr>
-          <w:rFonts w:cs="Segoe UI"/>
-          <w:color w:val="1A2634"/>
-          <w:sz w:val="21"/>
-          <w:szCs w:val="21"/>
-        </w:rPr>
-      </w:pPr>
-      <w:r>
+        <w:t>start}{/start}{#end_or_present} – {</w:t>
+      </w:r>
+      <w:proofErr w:type="spellStart"/>
+      <w:r>
+        <w:rPr>
+          <w:rFonts w:cs="Segoe UI"/>
+          <w:color w:val="1A2634"/>
+          <w:sz w:val="21"/>
+          <w:szCs w:val="21"/>
+        </w:rPr>
+        <w:t>end_or_present</w:t>
+      </w:r>
+      <w:proofErr w:type="spellEnd"/>
+      <w:r>
+        <w:rPr>
+          <w:rFonts w:cs="Segoe UI"/>
+          <w:color w:val="1A2634"/>
+          <w:sz w:val="21"/>
+          <w:szCs w:val="21"/>
+        </w:rPr>
+        <w:t>}{/</w:t>
+      </w:r>
+      <w:proofErr w:type="spellStart"/>
+      <w:r>
+        <w:rPr>
+          <w:rFonts w:cs="Segoe UI"/>
+          <w:color w:val="1A2634"/>
+          <w:sz w:val="21"/>
+          <w:szCs w:val="21"/>
+        </w:rPr>
+        <w:t>end_or_present</w:t>
+      </w:r>
+      <w:proofErr w:type="spellEnd"/>
+      <w:r>
+        <w:rPr>
+          <w:rFonts w:cs="Segoe UI"/>
+          <w:color w:val="1A2634"/>
+          <w:sz w:val="21"/>
+          <w:szCs w:val="21"/>
+        </w:rPr>
+        <w:t>}</w:t>
+      </w:r>
+    </w:p>
+    <w:p>
+      <w:pPr>
+        <w:spacing w:after="0" w:line="22" w:lineRule="atLeast"/>
+      </w:pPr>
+      <w:r>
+        <w:t>{#edu_competencies}</w:t>
+      </w:r>
+    </w:p>
+    <w:p>
+      <w:pPr>
+        <w:spacing w:after="0" w:line="22" w:lineRule="atLeast"/>
+        <w:ind w:left="270" w:hanging="270"/>
+        <w:rPr>
+          <w:rFonts w:cs="Segoe UI"/>
+          <w:color w:val="1A2634"/>
+          <w:sz w:val="21"/>
+          <w:szCs w:val="21"/>
+        </w:rPr>
+      </w:pPr>
+      <w:r>
+        <w:rPr>
+          <w:rFonts w:cs="Segoe UI"/>
+          <w:color w:val="1A2634"/>
+          <w:sz w:val="21"/>
+          <w:szCs w:val="21"/>
+        </w:rPr>
+        <w:t>• {.}</w:t>
+      </w:r>
+    </w:p>
+    <w:p>
+      <w:pPr>
+        <w:spacing w:after="0" w:line="22" w:lineRule="atLeast"/>
+        <w:ind w:left="270" w:hanging="270"/>
+        <w:rPr>
+          <w:rFonts w:cs="Segoe UI"/>
+          <w:color w:val="1A2634"/>
+          <w:sz w:val="21"/>
+          <w:szCs w:val="21"/>
+        </w:rPr>
+      </w:pPr>
+      <w:r>
+        <w:rPr>
+          <w:rFonts w:cs="Segoe UI"/>
+          <w:color w:val="1A2634"/>
+          <w:sz w:val="21"/>
+          <w:szCs w:val="21"/>
+        </w:rPr>
+        <w:t>{/</w:t>
+      </w:r>
+      <w:proofErr w:type="spellStart"/>
+      <w:r>
+        <w:rPr>
+          <w:rFonts w:cs="Segoe UI"/>
+          <w:color w:val="1A2634"/>
+          <w:sz w:val="21"/>
+          <w:szCs w:val="21"/>
+        </w:rPr>
+        <w:t>edu_competencies</w:t>
+      </w:r>
+      <w:proofErr w:type="spellEnd"/>
+      <w:r>
+        <w:rPr>
+          <w:rFonts w:cs="Segoe UI"/>
+          <w:color w:val="1A2634"/>
+          <w:sz w:val="21"/>
+          <w:szCs w:val="21"/>
+        </w:rPr>
+        <w:t>}</w:t>
+      </w:r>
+    </w:p>
+    <w:p>
+      <w:pPr>
+        <w:spacing w:after="0" w:line="22" w:lineRule="atLeast"/>
+        <w:ind w:left="270" w:hanging="270"/>
+        <w:rPr>
+          <w:rFonts w:cs="Segoe UI"/>
+          <w:color w:val="1A2634"/>
+          <w:sz w:val="21"/>
+          <w:szCs w:val="21"/>
+        </w:rPr>
+      </w:pPr>
+      <w:r>
+        <w:rPr>
+          <w:rFonts w:cs="Segoe UI"/>
+          <w:color w:val="1A2634"/>
+          <w:sz w:val="21"/>
+          <w:szCs w:val="21"/>
+        </w:rPr>
         <w:t>{#edu_</w:t>
       </w:r>
       <w:proofErr w:type="gramStart"/>
       <w:r>
-        <w:t>competencies}</w:t>
-      </w:r>
-      <w:r>
-        <w:rPr>
-          <w:rFonts w:cs="Segoe UI"/>
-          <w:color w:val="1A2634"/>
-          <w:sz w:val="21"/>
-          <w:szCs w:val="21"/>
-        </w:rPr>
-        <w:t>•</w:t>
+        <w:rPr>
+          <w:rFonts w:cs="Segoe UI"/>
+          <w:color w:val="1A2634"/>
+          <w:sz w:val="21"/>
+          <w:szCs w:val="21"/>
+        </w:rPr>
+        <w:t>detail}{</w:t>
       </w:r>
       <w:proofErr w:type="gramEnd"/>
       <w:r>
@@ -397,35 +511,68 @@
           <w:sz w:val="21"/>
           <w:szCs w:val="21"/>
         </w:rPr>
-        <w:t xml:space="preserve"> {.}</w:t>
-      </w:r>
-      <w:r>
-        <w:rPr>
-          <w:rFonts w:cs="Segoe UI"/>
-          <w:color w:val="1A2634"/>
-          <w:sz w:val="21"/>
-          <w:szCs w:val="21"/>
-        </w:rPr>
-        <w:t>{/edu_competencies}</w:t>
-      </w:r>
-      <w:r>
-        <w:rPr>
-          <w:rFonts w:cs="Segoe UI"/>
-          <w:color w:val="1A2634"/>
-          <w:sz w:val="21"/>
-          <w:szCs w:val="21"/>
-        </w:rPr>
-        <w:br/>
-        <w:t>{#edu_detail}{edu_detail}{/edu_detail}</w:t>
-      </w:r>
-      <w:r>
-        <w:rPr>
-          <w:rFonts w:cs="Segoe UI"/>
-          <w:color w:val="1A2634"/>
-          <w:sz w:val="21"/>
-          <w:szCs w:val="21"/>
-        </w:rPr>
-        <w:br/>
+        <w:t>edu_detail}</w:t>
+      </w:r>
+    </w:p>
+    <w:p>
+      <w:pPr>
+        <w:spacing w:after="0" w:line="22" w:lineRule="atLeast"/>
+        <w:ind w:left="270" w:hanging="270"/>
+        <w:rPr>
+          <w:rFonts w:cs="Segoe UI"/>
+          <w:color w:val="1A2634"/>
+          <w:sz w:val="21"/>
+          <w:szCs w:val="21"/>
+        </w:rPr>
+      </w:pPr>
+      <w:r>
+        <w:rPr>
+          <w:rFonts w:cs="Segoe UI"/>
+          <w:color w:val="1A2634"/>
+          <w:sz w:val="21"/>
+          <w:szCs w:val="21"/>
+        </w:rPr>
+        <w:t>{/</w:t>
+      </w:r>
+      <w:proofErr w:type="spellStart"/>
+      <w:r>
+        <w:rPr>
+          <w:rFonts w:cs="Segoe UI"/>
+          <w:color w:val="1A2634"/>
+          <w:sz w:val="21"/>
+          <w:szCs w:val="21"/>
+        </w:rPr>
+        <w:t>edu_detail</w:t>
+      </w:r>
+      <w:proofErr w:type="spellEnd"/>
+      <w:r>
+        <w:rPr>
+          <w:rFonts w:cs="Segoe UI"/>
+          <w:color w:val="1A2634"/>
+          <w:sz w:val="21"/>
+          <w:szCs w:val="21"/>
+        </w:rPr>
+        <w:t>}</w:t>
+      </w:r>
+    </w:p>
+    <w:p>
+      <w:pPr>
+        <w:spacing w:after="0" w:line="22" w:lineRule="atLeast"/>
+        <w:ind w:left="270" w:hanging="270"/>
+        <w:rPr>
+          <w:rFonts w:cs="Segoe UI"/>
+          <w:color w:val="1A2634"/>
+          <w:sz w:val="21"/>
+          <w:szCs w:val="21"/>
+        </w:rPr>
+      </w:pPr>
+      <w:r>
+        <w:rPr>
+          <w:rFonts w:cs="Segoe UI"/>
+          <w:color w:val="1A2634"/>
+          <w:sz w:val="21"/>
+          <w:szCs w:val="21"/>
+        </w:rPr>
         <w:t>{/education}</w:t>
       </w:r>
     </w:p>
@@ -542,7 +689,31 @@
           <w:sz w:val="21"/>
           <w:szCs w:val="21"/>
         </w:rPr>
-        <w:t>{project_title}</w:t>
+        <w:t>{</w:t>
+      </w:r>
+      <w:proofErr w:type="spellStart"/>
+      <w:r>
+        <w:rPr>
+          <w:rFonts w:cs="Segoe UI"/>
+          <w:b/>
+          <w:bCs/>
+          <w:color w:val="1A2634"/>
+          <w:sz w:val="21"/>
+          <w:szCs w:val="21"/>
+        </w:rPr>
+        <w:t>project_title</w:t>
+      </w:r>
+      <w:proofErr w:type="spellEnd"/>
+      <w:r>
+        <w:rPr>
+          <w:rFonts w:cs="Segoe UI"/>
+          <w:b/>
+          <w:bCs/>
+          <w:color w:val="1A2634"/>
+          <w:sz w:val="21"/>
+          <w:szCs w:val="21"/>
+        </w:rPr>
+        <w:t>}</w:t>
       </w:r>
     </w:p>
     <w:p>
@@ -582,87 +753,229 @@
           <w:sz w:val="21"/>
           <w:szCs w:val="21"/>
         </w:rPr>
-        <w:t>start}{/start}{#end_or_present} – {end_or_present}{/end_or_present}</w:t>
-      </w:r>
-    </w:p>
-    <w:p>
-      <w:pPr>
-        <w:spacing w:after="0" w:line="22" w:lineRule="atLeast"/>
-        <w:rPr>
-          <w:rFonts w:cs="Segoe UI"/>
-          <w:color w:val="1A2634"/>
-          <w:sz w:val="21"/>
-          <w:szCs w:val="21"/>
-        </w:rPr>
-      </w:pPr>
-      <w:r>
-        <w:rPr>
-          <w:rFonts w:cs="Segoe UI"/>
-          <w:color w:val="1A2634"/>
-          <w:sz w:val="21"/>
-          <w:szCs w:val="21"/>
-        </w:rPr>
-        <w:t>{#project_</w:t>
-      </w:r>
-      <w:proofErr w:type="gramStart"/>
-      <w:r>
-        <w:rPr>
-          <w:rFonts w:cs="Segoe UI"/>
-          <w:color w:val="1A2634"/>
-          <w:sz w:val="21"/>
-          <w:szCs w:val="21"/>
-        </w:rPr>
-        <w:t>description}{</w:t>
-      </w:r>
-      <w:proofErr w:type="gramEnd"/>
-      <w:r>
-        <w:rPr>
-          <w:rFonts w:cs="Segoe UI"/>
-          <w:color w:val="1A2634"/>
-          <w:sz w:val="21"/>
-          <w:szCs w:val="21"/>
-        </w:rPr>
-        <w:t>project_description}{/project_description}</w:t>
-      </w:r>
-    </w:p>
-    <w:p>
-      <w:pPr>
-        <w:spacing w:after="0" w:line="22" w:lineRule="atLeast"/>
-        <w:rPr>
-          <w:rFonts w:cs="Segoe UI"/>
-          <w:color w:val="1A2634"/>
-          <w:sz w:val="21"/>
-          <w:szCs w:val="21"/>
-        </w:rPr>
-      </w:pPr>
-      <w:r>
-        <w:rPr>
-          <w:rFonts w:cs="Segoe UI"/>
-          <w:color w:val="1A2634"/>
-          <w:sz w:val="21"/>
-          <w:szCs w:val="21"/>
-        </w:rPr>
-        <w:t>{#project_</w:t>
-      </w:r>
-      <w:proofErr w:type="gramStart"/>
-      <w:r>
-        <w:rPr>
-          <w:rFonts w:cs="Segoe UI"/>
-          <w:color w:val="1A2634"/>
-          <w:sz w:val="21"/>
-          <w:szCs w:val="21"/>
-        </w:rPr>
-        <w:t>tasks}•</w:t>
-      </w:r>
-      <w:proofErr w:type="gramEnd"/>
-      <w:r>
-        <w:rPr>
-          <w:rFonts w:cs="Segoe UI"/>
-          <w:color w:val="1A2634"/>
-          <w:sz w:val="21"/>
-          <w:szCs w:val="21"/>
-        </w:rPr>
-        <w:t xml:space="preserve"> {.}{/project_tasks}</w:t>
+        <w:t>start}{/start}{#end_or_present} – {</w:t>
+      </w:r>
+      <w:proofErr w:type="spellStart"/>
+      <w:r>
+        <w:rPr>
+          <w:rFonts w:cs="Segoe UI"/>
+          <w:color w:val="1A2634"/>
+          <w:sz w:val="21"/>
+          <w:szCs w:val="21"/>
+        </w:rPr>
+        <w:t>end_or_present</w:t>
+      </w:r>
+      <w:proofErr w:type="spellEnd"/>
+      <w:r>
+        <w:rPr>
+          <w:rFonts w:cs="Segoe UI"/>
+          <w:color w:val="1A2634"/>
+          <w:sz w:val="21"/>
+          <w:szCs w:val="21"/>
+        </w:rPr>
+        <w:t>}{/</w:t>
+      </w:r>
+      <w:proofErr w:type="spellStart"/>
+      <w:r>
+        <w:rPr>
+          <w:rFonts w:cs="Segoe UI"/>
+          <w:color w:val="1A2634"/>
+          <w:sz w:val="21"/>
+          <w:szCs w:val="21"/>
+        </w:rPr>
+        <w:t>end_or_present</w:t>
+      </w:r>
+      <w:proofErr w:type="spellEnd"/>
+      <w:r>
+        <w:rPr>
+          <w:rFonts w:cs="Segoe UI"/>
+          <w:color w:val="1A2634"/>
+          <w:sz w:val="21"/>
+          <w:szCs w:val="21"/>
+        </w:rPr>
+        <w:t>}</w:t>
+      </w:r>
+    </w:p>
+    <w:p>
+      <w:pPr>
+        <w:spacing w:after="0" w:line="22" w:lineRule="atLeast"/>
+        <w:rPr>
+          <w:rFonts w:cs="Segoe UI"/>
+          <w:color w:val="1A2634"/>
+          <w:sz w:val="21"/>
+          <w:szCs w:val="21"/>
+        </w:rPr>
+      </w:pPr>
+      <w:r>
+        <w:rPr>
+          <w:rFonts w:cs="Segoe UI"/>
+          <w:color w:val="1A2634"/>
+          <w:sz w:val="21"/>
+          <w:szCs w:val="21"/>
+        </w:rPr>
+        <w:t>{#project_description}</w:t>
+      </w:r>
+    </w:p>
+    <w:p>
+      <w:pPr>
+        <w:spacing w:after="0" w:line="22" w:lineRule="atLeast"/>
+        <w:rPr>
+          <w:rFonts w:cs="Segoe UI"/>
+          <w:color w:val="1A2634"/>
+          <w:sz w:val="21"/>
+          <w:szCs w:val="21"/>
+        </w:rPr>
+      </w:pPr>
+      <w:r>
+        <w:rPr>
+          <w:rFonts w:cs="Segoe UI"/>
+          <w:color w:val="1A2634"/>
+          <w:sz w:val="21"/>
+          <w:szCs w:val="21"/>
+        </w:rPr>
+        <w:t>{</w:t>
+      </w:r>
+      <w:proofErr w:type="spellStart"/>
+      <w:r>
+        <w:rPr>
+          <w:rFonts w:cs="Segoe UI"/>
+          <w:color w:val="1A2634"/>
+          <w:sz w:val="21"/>
+          <w:szCs w:val="21"/>
+        </w:rPr>
+        <w:t>project_description</w:t>
+      </w:r>
+      <w:proofErr w:type="spellEnd"/>
+      <w:r>
+        <w:rPr>
+          <w:rFonts w:cs="Segoe UI"/>
+          <w:color w:val="1A2634"/>
+          <w:sz w:val="21"/>
+          <w:szCs w:val="21"/>
+        </w:rPr>
+        <w:t>}</w:t>
+      </w:r>
+    </w:p>
+    <w:p>
+      <w:pPr>
+        <w:spacing w:after="0" w:line="22" w:lineRule="atLeast"/>
+        <w:rPr>
+          <w:rFonts w:cs="Segoe UI"/>
+          <w:color w:val="1A2634"/>
+          <w:sz w:val="21"/>
+          <w:szCs w:val="21"/>
+        </w:rPr>
+      </w:pPr>
+      <w:r>
+        <w:rPr>
+          <w:rFonts w:cs="Segoe UI"/>
+          <w:color w:val="1A2634"/>
+          <w:sz w:val="21"/>
+          <w:szCs w:val="21"/>
+        </w:rPr>
+        <w:t>{/</w:t>
+      </w:r>
+      <w:proofErr w:type="spellStart"/>
+      <w:r>
+        <w:rPr>
+          <w:rFonts w:cs="Segoe UI"/>
+          <w:color w:val="1A2634"/>
+          <w:sz w:val="21"/>
+          <w:szCs w:val="21"/>
+        </w:rPr>
+        <w:t>project_description</w:t>
+      </w:r>
+      <w:proofErr w:type="spellEnd"/>
+      <w:r>
+        <w:rPr>
+          <w:rFonts w:cs="Segoe UI"/>
+          <w:color w:val="1A2634"/>
+          <w:sz w:val="21"/>
+          <w:szCs w:val="21"/>
+        </w:rPr>
+        <w:t>}</w:t>
+      </w:r>
+    </w:p>
+    <w:p>
+      <w:pPr>
+        <w:spacing w:after="0" w:line="22" w:lineRule="atLeast"/>
+        <w:rPr>
+          <w:rFonts w:cs="Segoe UI"/>
+          <w:color w:val="1A2634"/>
+          <w:sz w:val="21"/>
+          <w:szCs w:val="21"/>
+        </w:rPr>
+      </w:pPr>
+      <w:r>
+        <w:rPr>
+          <w:rFonts w:cs="Segoe UI"/>
+          <w:color w:val="1A2634"/>
+          <w:sz w:val="21"/>
+          <w:szCs w:val="21"/>
+        </w:rPr>
+        <w:t>{#project_tasks}</w:t>
+      </w:r>
+    </w:p>
+    <w:p>
+      <w:pPr>
+        <w:spacing w:after="0" w:line="22" w:lineRule="atLeast"/>
+        <w:ind w:left="360" w:hanging="360"/>
+        <w:rPr>
+          <w:rFonts w:cs="Segoe UI"/>
+          <w:color w:val="1A2634"/>
+          <w:sz w:val="21"/>
+          <w:szCs w:val="21"/>
+        </w:rPr>
+      </w:pPr>
+      <w:r>
+        <w:rPr>
+          <w:rFonts w:cs="Segoe UI"/>
+          <w:color w:val="1A2634"/>
+          <w:sz w:val="21"/>
+          <w:szCs w:val="21"/>
+        </w:rPr>
+        <w:t>• {.}</w:t>
+      </w:r>
+    </w:p>
+    <w:p>
+      <w:pPr>
+        <w:spacing w:after="0" w:line="22" w:lineRule="atLeast"/>
+        <w:ind w:left="360" w:hanging="360"/>
+        <w:rPr>
+          <w:rFonts w:cs="Segoe UI"/>
+          <w:color w:val="1A2634"/>
+          <w:sz w:val="21"/>
+          <w:szCs w:val="21"/>
+        </w:rPr>
+      </w:pPr>
+      <w:r>
+        <w:rPr>
+          <w:rFonts w:cs="Segoe UI"/>
+          <w:color w:val="1A2634"/>
+          <w:sz w:val="21"/>
+          <w:szCs w:val="21"/>
+        </w:rPr>
+        <w:t>{/</w:t>
+      </w:r>
+      <w:proofErr w:type="spellStart"/>
+      <w:r>
+        <w:rPr>
+          <w:rFonts w:cs="Segoe UI"/>
+          <w:color w:val="1A2634"/>
+          <w:sz w:val="21"/>
+          <w:szCs w:val="21"/>
+        </w:rPr>
+        <w:t>project_tasks</w:t>
+      </w:r>
+      <w:proofErr w:type="spellEnd"/>
+      <w:r>
+        <w:rPr>
+          <w:rFonts w:cs="Segoe UI"/>
+          <w:color w:val="1A2634"/>
+          <w:sz w:val="21"/>
+          <w:szCs w:val="21"/>
+        </w:rPr>
+        <w:t>}</w:t>
       </w:r>
     </w:p>
     <w:p>
@@ -873,96 +1186,189 @@
           <w:sz w:val="21"/>
           <w:szCs w:val="21"/>
         </w:rPr>
-        <w:t>start}{/start}{#end_or_present} – {end_or_present}{/end_or_present}</w:t>
-      </w:r>
-    </w:p>
-    <w:p>
-      <w:pPr>
-        <w:spacing w:after="0" w:line="22" w:lineRule="atLeast"/>
-        <w:rPr>
-          <w:rFonts w:cs="Segoe UI"/>
-          <w:color w:val="1A2634"/>
-          <w:sz w:val="21"/>
-          <w:szCs w:val="21"/>
-        </w:rPr>
-      </w:pPr>
-      <w:r>
-        <w:rPr>
-          <w:rFonts w:cs="Segoe UI"/>
-          <w:color w:val="1A2634"/>
-          <w:sz w:val="21"/>
-          <w:szCs w:val="21"/>
-        </w:rPr>
-        <w:t>{#role_</w:t>
-      </w:r>
-      <w:proofErr w:type="gramStart"/>
-      <w:r>
-        <w:rPr>
-          <w:rFonts w:cs="Segoe UI"/>
-          <w:color w:val="1A2634"/>
-          <w:sz w:val="21"/>
-          <w:szCs w:val="21"/>
-        </w:rPr>
-        <w:t>summary}{</w:t>
-      </w:r>
-      <w:proofErr w:type="gramEnd"/>
-      <w:r>
-        <w:rPr>
-          <w:rFonts w:cs="Segoe UI"/>
-          <w:color w:val="1A2634"/>
-          <w:sz w:val="21"/>
-          <w:szCs w:val="21"/>
-        </w:rPr>
-        <w:t>role_summary}</w:t>
-      </w:r>
-      <w:r>
-        <w:rPr>
-          <w:rFonts w:cs="Segoe UI"/>
-          <w:color w:val="1A2634"/>
-          <w:sz w:val="21"/>
-          <w:szCs w:val="21"/>
-        </w:rPr>
-        <w:t>{/role_summary}</w:t>
-      </w:r>
-    </w:p>
-    <w:p>
-      <w:pPr>
-        <w:spacing w:after="0" w:line="22" w:lineRule="atLeast"/>
-        <w:rPr>
-          <w:rFonts w:cs="Segoe UI"/>
-          <w:color w:val="1A2634"/>
-          <w:sz w:val="21"/>
-          <w:szCs w:val="21"/>
-        </w:rPr>
-      </w:pPr>
-      <w:r>
-        <w:rPr>
-          <w:rFonts w:cs="Segoe UI"/>
-          <w:color w:val="1A2634"/>
-          <w:sz w:val="21"/>
-          <w:szCs w:val="21"/>
-        </w:rPr>
-        <w:t>{#</w:t>
-      </w:r>
-      <w:proofErr w:type="gramStart"/>
-      <w:r>
-        <w:rPr>
-          <w:rFonts w:cs="Segoe UI"/>
-          <w:color w:val="1A2634"/>
-          <w:sz w:val="21"/>
-          <w:szCs w:val="21"/>
-        </w:rPr>
-        <w:t>tasks}•</w:t>
-      </w:r>
-      <w:proofErr w:type="gramEnd"/>
-      <w:r>
-        <w:rPr>
-          <w:rFonts w:cs="Segoe UI"/>
-          <w:color w:val="1A2634"/>
-          <w:sz w:val="21"/>
-          <w:szCs w:val="21"/>
-        </w:rPr>
-        <w:t xml:space="preserve"> {.}{/tasks}</w:t>
+        <w:t>start}{/start}{#end_or_present} – {</w:t>
+      </w:r>
+      <w:proofErr w:type="spellStart"/>
+      <w:r>
+        <w:rPr>
+          <w:rFonts w:cs="Segoe UI"/>
+          <w:color w:val="1A2634"/>
+          <w:sz w:val="21"/>
+          <w:szCs w:val="21"/>
+        </w:rPr>
+        <w:t>end_or_present</w:t>
+      </w:r>
+      <w:proofErr w:type="spellEnd"/>
+      <w:r>
+        <w:rPr>
+          <w:rFonts w:cs="Segoe UI"/>
+          <w:color w:val="1A2634"/>
+          <w:sz w:val="21"/>
+          <w:szCs w:val="21"/>
+        </w:rPr>
+        <w:t>}{/</w:t>
+      </w:r>
+      <w:proofErr w:type="spellStart"/>
+      <w:r>
+        <w:rPr>
+          <w:rFonts w:cs="Segoe UI"/>
+          <w:color w:val="1A2634"/>
+          <w:sz w:val="21"/>
+          <w:szCs w:val="21"/>
+        </w:rPr>
+        <w:t>end_or_present</w:t>
+      </w:r>
+      <w:proofErr w:type="spellEnd"/>
+      <w:r>
+        <w:rPr>
+          <w:rFonts w:cs="Segoe UI"/>
+          <w:color w:val="1A2634"/>
+          <w:sz w:val="21"/>
+          <w:szCs w:val="21"/>
+        </w:rPr>
+        <w:t>}</w:t>
+      </w:r>
+    </w:p>
+    <w:p>
+      <w:pPr>
+        <w:spacing w:after="0" w:line="22" w:lineRule="atLeast"/>
+        <w:rPr>
+          <w:rFonts w:cs="Segoe UI"/>
+          <w:color w:val="1A2634"/>
+          <w:sz w:val="21"/>
+          <w:szCs w:val="21"/>
+        </w:rPr>
+      </w:pPr>
+      <w:r>
+        <w:rPr>
+          <w:rFonts w:cs="Segoe UI"/>
+          <w:color w:val="1A2634"/>
+          <w:sz w:val="21"/>
+          <w:szCs w:val="21"/>
+        </w:rPr>
+        <w:t>{#role_summary}</w:t>
+      </w:r>
+    </w:p>
+    <w:p>
+      <w:pPr>
+        <w:spacing w:after="0" w:line="22" w:lineRule="atLeast"/>
+        <w:rPr>
+          <w:rFonts w:cs="Segoe UI"/>
+          <w:color w:val="1A2634"/>
+          <w:sz w:val="21"/>
+          <w:szCs w:val="21"/>
+        </w:rPr>
+      </w:pPr>
+      <w:r>
+        <w:rPr>
+          <w:rFonts w:cs="Segoe UI"/>
+          <w:color w:val="1A2634"/>
+          <w:sz w:val="21"/>
+          <w:szCs w:val="21"/>
+        </w:rPr>
+        <w:lastRenderedPageBreak/>
+        <w:t>{</w:t>
+      </w:r>
+      <w:proofErr w:type="spellStart"/>
+      <w:r>
+        <w:rPr>
+          <w:rFonts w:cs="Segoe UI"/>
+          <w:color w:val="1A2634"/>
+          <w:sz w:val="21"/>
+          <w:szCs w:val="21"/>
+        </w:rPr>
+        <w:t>role_summary</w:t>
+      </w:r>
+      <w:proofErr w:type="spellEnd"/>
+      <w:r>
+        <w:rPr>
+          <w:rFonts w:cs="Segoe UI"/>
+          <w:color w:val="1A2634"/>
+          <w:sz w:val="21"/>
+          <w:szCs w:val="21"/>
+        </w:rPr>
+        <w:t>}</w:t>
+      </w:r>
+    </w:p>
+    <w:p>
+      <w:pPr>
+        <w:spacing w:after="0" w:line="22" w:lineRule="atLeast"/>
+        <w:rPr>
+          <w:rFonts w:cs="Segoe UI"/>
+          <w:color w:val="1A2634"/>
+          <w:sz w:val="21"/>
+          <w:szCs w:val="21"/>
+        </w:rPr>
+      </w:pPr>
+      <w:r>
+        <w:rPr>
+          <w:rFonts w:cs="Segoe UI"/>
+          <w:color w:val="1A2634"/>
+          <w:sz w:val="21"/>
+          <w:szCs w:val="21"/>
+        </w:rPr>
+        <w:t>{/</w:t>
+      </w:r>
+      <w:proofErr w:type="spellStart"/>
+      <w:r>
+        <w:rPr>
+          <w:rFonts w:cs="Segoe UI"/>
+          <w:color w:val="1A2634"/>
+          <w:sz w:val="21"/>
+          <w:szCs w:val="21"/>
+        </w:rPr>
+        <w:t>role_summary</w:t>
+      </w:r>
+      <w:proofErr w:type="spellEnd"/>
+      <w:r>
+        <w:rPr>
+          <w:rFonts w:cs="Segoe UI"/>
+          <w:color w:val="1A2634"/>
+          <w:sz w:val="21"/>
+          <w:szCs w:val="21"/>
+        </w:rPr>
+        <w:t>}</w:t>
+      </w:r>
+    </w:p>
+    <w:p>
+      <w:pPr>
+        <w:spacing w:after="0" w:line="22" w:lineRule="atLeast"/>
+        <w:rPr>
+          <w:rFonts w:cs="Segoe UI"/>
+          <w:color w:val="1A2634"/>
+          <w:sz w:val="21"/>
+          <w:szCs w:val="21"/>
+        </w:rPr>
+      </w:pPr>
+      <w:r>
+        <w:rPr>
+          <w:rFonts w:cs="Segoe UI"/>
+          <w:color w:val="1A2634"/>
+          <w:sz w:val="21"/>
+          <w:szCs w:val="21"/>
+        </w:rPr>
+        <w:t>{#tasks}</w:t>
+      </w:r>
+    </w:p>
+    <w:p>
+      <w:pPr>
+        <w:spacing w:after="0" w:line="22" w:lineRule="atLeast"/>
+        <w:ind w:left="360" w:hanging="360"/>
+        <w:rPr>
+          <w:rFonts w:cs="Segoe UI"/>
+          <w:color w:val="1A2634"/>
+          <w:sz w:val="21"/>
+          <w:szCs w:val="21"/>
+        </w:rPr>
+      </w:pPr>
+      <w:r>
+        <w:rPr>
+          <w:rFonts w:cs="Segoe UI"/>
+          <w:color w:val="1A2634"/>
+          <w:sz w:val="21"/>
+          <w:szCs w:val="21"/>
+        </w:rPr>
+        <w:t>• {.}{/tasks}</w:t>
       </w:r>
     </w:p>
     <w:p>
@@ -1051,42 +1457,35 @@
       <w:pPr>
         <w:spacing w:after="0" w:line="22" w:lineRule="atLeast"/>
         <w:rPr>
-          <w:rFonts w:cs="Segoe UI"/>
-          <w:color w:val="1A2634"/>
-          <w:sz w:val="21"/>
-          <w:szCs w:val="21"/>
-        </w:rPr>
-      </w:pPr>
-      <w:r>
-        <w:rPr>
-          <w:sz w:val="21"/>
-          <w:szCs w:val="21"/>
-        </w:rPr>
-        <w:lastRenderedPageBreak/>
-        <w:t>{#</w:t>
-      </w:r>
-      <w:proofErr w:type="gramStart"/>
-      <w:r>
-        <w:rPr>
-          <w:sz w:val="21"/>
-          <w:szCs w:val="21"/>
-        </w:rPr>
-        <w:t>certifications}</w:t>
-      </w:r>
-      <w:r>
-        <w:rPr>
-          <w:sz w:val="21"/>
-          <w:szCs w:val="21"/>
-        </w:rPr>
-        <w:t>•</w:t>
-      </w:r>
-      <w:proofErr w:type="gramEnd"/>
-      <w:r>
-        <w:rPr>
-          <w:sz w:val="21"/>
-          <w:szCs w:val="21"/>
-        </w:rPr>
-        <w:t xml:space="preserve"> {.}</w:t>
+          <w:sz w:val="21"/>
+          <w:szCs w:val="21"/>
+        </w:rPr>
+      </w:pPr>
+      <w:r>
+        <w:rPr>
+          <w:sz w:val="21"/>
+          <w:szCs w:val="21"/>
+        </w:rPr>
+        <w:t>{#certifications}</w:t>
+      </w:r>
+    </w:p>
+    <w:p>
+      <w:pPr>
+        <w:spacing w:after="0" w:line="22" w:lineRule="atLeast"/>
+        <w:ind w:left="360" w:hanging="360"/>
+        <w:rPr>
+          <w:rFonts w:cs="Segoe UI"/>
+          <w:color w:val="1A2634"/>
+          <w:sz w:val="21"/>
+          <w:szCs w:val="21"/>
+        </w:rPr>
+      </w:pPr>
+      <w:r>
+        <w:rPr>
+          <w:sz w:val="21"/>
+          <w:szCs w:val="21"/>
+        </w:rPr>
+        <w:t>• {.}</w:t>
       </w:r>
       <w:r>
         <w:rPr>
@@ -1200,107 +1599,229 @@
           <w:sz w:val="21"/>
           <w:szCs w:val="21"/>
         </w:rPr>
-        <w:t>{section_title}</w:t>
-      </w:r>
-    </w:p>
-    <w:p>
-      <w:pPr>
-        <w:spacing w:after="0" w:line="22" w:lineRule="atLeast"/>
-        <w:rPr>
-          <w:rFonts w:cs="Segoe UI"/>
-          <w:color w:val="1A2634"/>
-          <w:sz w:val="21"/>
-          <w:szCs w:val="21"/>
-        </w:rPr>
-      </w:pPr>
-      <w:r>
-        <w:rPr>
-          <w:rFonts w:cs="Segoe UI"/>
-          <w:color w:val="1A2634"/>
-          <w:sz w:val="21"/>
-          <w:szCs w:val="21"/>
-        </w:rPr>
-        <w:t>{#</w:t>
-      </w:r>
-      <w:proofErr w:type="gramStart"/>
-      <w:r>
-        <w:rPr>
-          <w:rFonts w:cs="Segoe UI"/>
-          <w:color w:val="1A2634"/>
-          <w:sz w:val="21"/>
-          <w:szCs w:val="21"/>
-        </w:rPr>
-        <w:t>items}•</w:t>
-      </w:r>
-      <w:proofErr w:type="gramEnd"/>
-      <w:r>
-        <w:rPr>
-          <w:rFonts w:cs="Segoe UI"/>
-          <w:color w:val="1A2634"/>
-          <w:sz w:val="21"/>
-          <w:szCs w:val="21"/>
-        </w:rPr>
-        <w:t xml:space="preserve"> {.}{/items}</w:t>
-      </w:r>
-    </w:p>
-    <w:p>
-      <w:pPr>
-        <w:spacing w:after="0" w:line="22" w:lineRule="atLeast"/>
-        <w:rPr>
-          <w:rFonts w:cs="Segoe UI"/>
-          <w:color w:val="1A2634"/>
-          <w:sz w:val="21"/>
-          <w:szCs w:val="21"/>
-        </w:rPr>
-      </w:pPr>
-      <w:r>
-        <w:rPr>
-          <w:rFonts w:cs="Segoe UI"/>
-          <w:color w:val="1A2634"/>
-          <w:sz w:val="21"/>
-          <w:szCs w:val="21"/>
-        </w:rPr>
-        <w:t>{#section_</w:t>
-      </w:r>
-      <w:proofErr w:type="gramStart"/>
-      <w:r>
-        <w:rPr>
-          <w:rFonts w:cs="Segoe UI"/>
-          <w:color w:val="1A2634"/>
-          <w:sz w:val="21"/>
-          <w:szCs w:val="21"/>
-        </w:rPr>
-        <w:t>content}{</w:t>
-      </w:r>
-      <w:proofErr w:type="gramEnd"/>
-      <w:r>
-        <w:rPr>
-          <w:rFonts w:cs="Segoe UI"/>
-          <w:color w:val="1A2634"/>
-          <w:sz w:val="21"/>
-          <w:szCs w:val="21"/>
-        </w:rPr>
-        <w:t>section_content}{/section_content}</w:t>
-      </w:r>
-    </w:p>
-    <w:p>
-      <w:pPr>
-        <w:spacing w:after="0" w:line="22" w:lineRule="atLeast"/>
-        <w:rPr>
-          <w:rFonts w:cs="Segoe UI"/>
-          <w:color w:val="1A2634"/>
-          <w:sz w:val="21"/>
-          <w:szCs w:val="21"/>
-        </w:rPr>
-      </w:pPr>
-      <w:r>
-        <w:rPr>
-          <w:rFonts w:cs="Segoe UI"/>
-          <w:color w:val="1A2634"/>
-          <w:sz w:val="21"/>
-          <w:szCs w:val="21"/>
-        </w:rPr>
-        <w:t>{/extra_sections}</w:t>
+        <w:t>{</w:t>
+      </w:r>
+      <w:proofErr w:type="spellStart"/>
+      <w:r>
+        <w:rPr>
+          <w:rFonts w:cs="Segoe UI"/>
+          <w:color w:val="1A2634"/>
+          <w:sz w:val="21"/>
+          <w:szCs w:val="21"/>
+        </w:rPr>
+        <w:t>section_title</w:t>
+      </w:r>
+      <w:proofErr w:type="spellEnd"/>
+      <w:r>
+        <w:rPr>
+          <w:rFonts w:cs="Segoe UI"/>
+          <w:color w:val="1A2634"/>
+          <w:sz w:val="21"/>
+          <w:szCs w:val="21"/>
+        </w:rPr>
+        <w:t>}</w:t>
+      </w:r>
+    </w:p>
+    <w:p>
+      <w:pPr>
+        <w:spacing w:after="0" w:line="22" w:lineRule="atLeast"/>
+        <w:rPr>
+          <w:rFonts w:cs="Segoe UI"/>
+          <w:color w:val="1A2634"/>
+          <w:sz w:val="21"/>
+          <w:szCs w:val="21"/>
+        </w:rPr>
+      </w:pPr>
+      <w:r>
+        <w:rPr>
+          <w:rFonts w:cs="Segoe UI"/>
+          <w:color w:val="1A2634"/>
+          <w:sz w:val="21"/>
+          <w:szCs w:val="21"/>
+        </w:rPr>
+        <w:t>{#items}</w:t>
+      </w:r>
+    </w:p>
+    <w:p>
+      <w:pPr>
+        <w:spacing w:after="0" w:line="22" w:lineRule="atLeast"/>
+        <w:ind w:left="360" w:hanging="360"/>
+        <w:rPr>
+          <w:rFonts w:cs="Segoe UI"/>
+          <w:color w:val="1A2634"/>
+          <w:sz w:val="21"/>
+          <w:szCs w:val="21"/>
+        </w:rPr>
+      </w:pPr>
+      <w:r>
+        <w:rPr>
+          <w:rFonts w:cs="Segoe UI"/>
+          <w:color w:val="1A2634"/>
+          <w:sz w:val="21"/>
+          <w:szCs w:val="21"/>
+        </w:rPr>
+        <w:t>• {.}</w:t>
+      </w:r>
+    </w:p>
+    <w:p>
+      <w:pPr>
+        <w:spacing w:after="0" w:line="22" w:lineRule="atLeast"/>
+        <w:ind w:left="360" w:hanging="360"/>
+        <w:rPr>
+          <w:rFonts w:cs="Segoe UI"/>
+          <w:color w:val="1A2634"/>
+          <w:sz w:val="21"/>
+          <w:szCs w:val="21"/>
+        </w:rPr>
+      </w:pPr>
+      <w:r>
+        <w:rPr>
+          <w:rFonts w:cs="Segoe UI"/>
+          <w:color w:val="1A2634"/>
+          <w:sz w:val="21"/>
+          <w:szCs w:val="21"/>
+        </w:rPr>
+        <w:t>{/items}</w:t>
+      </w:r>
+    </w:p>
+    <w:p>
+      <w:pPr>
+        <w:spacing w:after="0" w:line="22" w:lineRule="atLeast"/>
+        <w:rPr>
+          <w:rFonts w:cs="Segoe UI"/>
+          <w:color w:val="1A2634"/>
+          <w:sz w:val="21"/>
+          <w:szCs w:val="21"/>
+        </w:rPr>
+      </w:pPr>
+      <w:r>
+        <w:rPr>
+          <w:rFonts w:cs="Segoe UI"/>
+          <w:color w:val="1A2634"/>
+          <w:sz w:val="21"/>
+          <w:szCs w:val="21"/>
+        </w:rPr>
+        <w:t>{#section_content}</w:t>
+      </w:r>
+    </w:p>
+    <w:p>
+      <w:pPr>
+        <w:spacing w:after="0" w:line="22" w:lineRule="atLeast"/>
+        <w:rPr>
+          <w:rFonts w:cs="Segoe UI"/>
+          <w:color w:val="1A2634"/>
+          <w:sz w:val="21"/>
+          <w:szCs w:val="21"/>
+        </w:rPr>
+      </w:pPr>
+      <w:r>
+        <w:rPr>
+          <w:rFonts w:cs="Segoe UI"/>
+          <w:color w:val="1A2634"/>
+          <w:sz w:val="21"/>
+          <w:szCs w:val="21"/>
+        </w:rPr>
+        <w:t>{</w:t>
+      </w:r>
+      <w:proofErr w:type="spellStart"/>
+      <w:r>
+        <w:rPr>
+          <w:rFonts w:cs="Segoe UI"/>
+          <w:color w:val="1A2634"/>
+          <w:sz w:val="21"/>
+          <w:szCs w:val="21"/>
+        </w:rPr>
+        <w:t>section_content</w:t>
+      </w:r>
+      <w:proofErr w:type="spellEnd"/>
+      <w:r>
+        <w:rPr>
+          <w:rFonts w:cs="Segoe UI"/>
+          <w:color w:val="1A2634"/>
+          <w:sz w:val="21"/>
+          <w:szCs w:val="21"/>
+        </w:rPr>
+        <w:t>}</w:t>
+      </w:r>
+    </w:p>
+    <w:p>
+      <w:pPr>
+        <w:spacing w:after="0" w:line="22" w:lineRule="atLeast"/>
+        <w:rPr>
+          <w:rFonts w:cs="Segoe UI"/>
+          <w:color w:val="1A2634"/>
+          <w:sz w:val="21"/>
+          <w:szCs w:val="21"/>
+        </w:rPr>
+      </w:pPr>
+      <w:r>
+        <w:rPr>
+          <w:rFonts w:cs="Segoe UI"/>
+          <w:color w:val="1A2634"/>
+          <w:sz w:val="21"/>
+          <w:szCs w:val="21"/>
+        </w:rPr>
+        <w:t>{/</w:t>
+      </w:r>
+      <w:proofErr w:type="spellStart"/>
+      <w:r>
+        <w:rPr>
+          <w:rFonts w:cs="Segoe UI"/>
+          <w:color w:val="1A2634"/>
+          <w:sz w:val="21"/>
+          <w:szCs w:val="21"/>
+        </w:rPr>
+        <w:t>section_content</w:t>
+      </w:r>
+      <w:proofErr w:type="spellEnd"/>
+      <w:r>
+        <w:rPr>
+          <w:rFonts w:cs="Segoe UI"/>
+          <w:color w:val="1A2634"/>
+          <w:sz w:val="21"/>
+          <w:szCs w:val="21"/>
+        </w:rPr>
+        <w:t>}</w:t>
+      </w:r>
+    </w:p>
+    <w:p>
+      <w:pPr>
+        <w:spacing w:after="0" w:line="22" w:lineRule="atLeast"/>
+        <w:rPr>
+          <w:rFonts w:cs="Segoe UI"/>
+          <w:color w:val="1A2634"/>
+          <w:sz w:val="21"/>
+          <w:szCs w:val="21"/>
+        </w:rPr>
+      </w:pPr>
+      <w:r>
+        <w:rPr>
+          <w:rFonts w:cs="Segoe UI"/>
+          <w:color w:val="1A2634"/>
+          <w:sz w:val="21"/>
+          <w:szCs w:val="21"/>
+        </w:rPr>
+        <w:t>{/</w:t>
+      </w:r>
+      <w:proofErr w:type="spellStart"/>
+      <w:r>
+        <w:rPr>
+          <w:rFonts w:cs="Segoe UI"/>
+          <w:color w:val="1A2634"/>
+          <w:sz w:val="21"/>
+          <w:szCs w:val="21"/>
+        </w:rPr>
+        <w:t>extra_sections</w:t>
+      </w:r>
+      <w:proofErr w:type="spellEnd"/>
+      <w:r>
+        <w:rPr>
+          <w:rFonts w:cs="Segoe UI"/>
+          <w:color w:val="1A2634"/>
+          <w:sz w:val="21"/>
+          <w:szCs w:val="21"/>
+        </w:rPr>
+        <w:t>}</w:t>
       </w:r>
     </w:p>
     <w:p>
@@ -1370,9 +1891,15 @@
     <w:p>
       <w:pPr>
         <w:spacing w:after="0" w:line="22" w:lineRule="atLeast"/>
-        <w:rPr>
-          <w:rFonts w:cs="Segoe UI"/>
-          <w:color w:val="1A2634"/>
+      </w:pPr>
+      <w:r>
+        <w:t>{/HAS_REFERENCE}</w:t>
+      </w:r>
+    </w:p>
+    <w:p>
+      <w:pPr>
+        <w:spacing w:after="0" w:line="22" w:lineRule="atLeast"/>
+        <w:rPr>
           <w:sz w:val="21"/>
           <w:szCs w:val="21"/>
         </w:rPr>
@@ -1384,12 +1911,32 @@
         </w:rPr>
         <w:t>{#HAS_REFERENCES_LIST}</w:t>
       </w:r>
+    </w:p>
+    <w:p>
+      <w:pPr>
+        <w:spacing w:after="0" w:line="22" w:lineRule="atLeast"/>
+        <w:rPr>
+          <w:sz w:val="21"/>
+          <w:szCs w:val="21"/>
+        </w:rPr>
+      </w:pPr>
+      <w:r>
+        <w:t>{#references_list}</w:t>
+      </w:r>
       <w:r>
         <w:rPr>
           <w:sz w:val="21"/>
           <w:szCs w:val="21"/>
         </w:rPr>
         <w:br/>
+      </w:r>
+      <w:r>
+        <w:rPr>
+          <w:b/>
+          <w:bCs/>
+          <w:sz w:val="21"/>
+          <w:szCs w:val="21"/>
+        </w:rPr>
         <w:t>{name}</w:t>
       </w:r>
       <w:r>
@@ -1397,8 +1944,30 @@
           <w:sz w:val="21"/>
           <w:szCs w:val="21"/>
         </w:rPr>
-        <w:br/>
-        <w:t>{position}, {organization}, {location}</w:t>
+        <w:t xml:space="preserve">, </w:t>
+      </w:r>
+      <w:r>
+        <w:rPr>
+          <w:sz w:val="21"/>
+          <w:szCs w:val="21"/>
+        </w:rPr>
+        <w:t xml:space="preserve">{position}, </w:t>
+      </w:r>
+    </w:p>
+    <w:p>
+      <w:pPr>
+        <w:spacing w:after="0" w:line="22" w:lineRule="atLeast"/>
+        <w:rPr>
+          <w:sz w:val="21"/>
+          <w:szCs w:val="21"/>
+        </w:rPr>
+      </w:pPr>
+      <w:r>
+        <w:rPr>
+          <w:sz w:val="21"/>
+          <w:szCs w:val="21"/>
+        </w:rPr>
+        <w:t>{organization}, {location}</w:t>
       </w:r>
       <w:r>
         <w:rPr>
@@ -1407,6 +1976,20 @@
         </w:rPr>
         <w:br/>
         <w:t>{email}, {phone}</w:t>
+      </w:r>
+    </w:p>
+    <w:p>
+      <w:pPr>
+        <w:spacing w:after="0" w:line="22" w:lineRule="atLeast"/>
+        <w:rPr>
+          <w:rFonts w:cs="Segoe UI"/>
+          <w:color w:val="1A2634"/>
+          <w:sz w:val="21"/>
+          <w:szCs w:val="21"/>
+        </w:rPr>
+      </w:pPr>
+      <w:r>
+        <w:t>{#references_list}</w:t>
       </w:r>
       <w:r>
         <w:rPr>
@@ -1844,6 +2427,7 @@
   <w:style w:type="character" w:default="1" w:styleId="DefaultParagraphFont">
     <w:name w:val="Default Paragraph Font"/>
     <w:uiPriority w:val="1"/>
+    <w:semiHidden/>
     <w:unhideWhenUsed/>
   </w:style>
   <w:style w:type="table" w:default="1" w:styleId="TableNormal">

</xml_diff>

<commit_message>
fixed template tag problem
</commit_message>
<xml_diff>
--- a/templates/cv-template.docx
+++ b/templates/cv-template.docx
@@ -340,67 +340,7 @@
           <w:sz w:val="21"/>
           <w:szCs w:val="21"/>
         </w:rPr>
-        <w:t>{#</w:t>
-      </w:r>
-      <w:proofErr w:type="gramStart"/>
-      <w:r>
-        <w:rPr>
-          <w:rFonts w:cs="Segoe UI"/>
-          <w:color w:val="1A2634"/>
-          <w:sz w:val="21"/>
-          <w:szCs w:val="21"/>
-        </w:rPr>
-        <w:t>start}{</w:t>
-      </w:r>
-      <w:proofErr w:type="gramEnd"/>
-      <w:r>
-        <w:rPr>
-          <w:rFonts w:cs="Segoe UI"/>
-          <w:color w:val="1A2634"/>
-          <w:sz w:val="21"/>
-          <w:szCs w:val="21"/>
-        </w:rPr>
-        <w:t>start}{/start}{#end_or_present} – {</w:t>
-      </w:r>
-      <w:proofErr w:type="spellStart"/>
-      <w:r>
-        <w:rPr>
-          <w:rFonts w:cs="Segoe UI"/>
-          <w:color w:val="1A2634"/>
-          <w:sz w:val="21"/>
-          <w:szCs w:val="21"/>
-        </w:rPr>
-        <w:t>end_or_present</w:t>
-      </w:r>
-      <w:proofErr w:type="spellEnd"/>
-      <w:r>
-        <w:rPr>
-          <w:rFonts w:cs="Segoe UI"/>
-          <w:color w:val="1A2634"/>
-          <w:sz w:val="21"/>
-          <w:szCs w:val="21"/>
-        </w:rPr>
-        <w:t>}{/</w:t>
-      </w:r>
-      <w:proofErr w:type="spellStart"/>
-      <w:r>
-        <w:rPr>
-          <w:rFonts w:cs="Segoe UI"/>
-          <w:color w:val="1A2634"/>
-          <w:sz w:val="21"/>
-          <w:szCs w:val="21"/>
-        </w:rPr>
-        <w:t>end_or_present</w:t>
-      </w:r>
-      <w:proofErr w:type="spellEnd"/>
-      <w:r>
-        <w:rPr>
-          <w:rFonts w:cs="Segoe UI"/>
-          <w:color w:val="1A2634"/>
-          <w:sz w:val="21"/>
-          <w:szCs w:val="21"/>
-        </w:rPr>
-        <w:t>}</w:t>
+        <w:t>{#start}{start}{/start}{#end_or_present} – {end_or_present}{/end_or_present}</w:t>
       </w:r>
     </w:p>
     <w:p>
@@ -450,27 +390,7 @@
           <w:sz w:val="21"/>
           <w:szCs w:val="21"/>
         </w:rPr>
-        <w:t>{/</w:t>
-      </w:r>
-      <w:proofErr w:type="spellStart"/>
-      <w:r>
-        <w:rPr>
-          <w:rFonts w:cs="Segoe UI"/>
-          <w:color w:val="1A2634"/>
-          <w:sz w:val="21"/>
-          <w:szCs w:val="21"/>
-        </w:rPr>
-        <w:t>edu_competencies</w:t>
-      </w:r>
-      <w:proofErr w:type="spellEnd"/>
-      <w:r>
-        <w:rPr>
-          <w:rFonts w:cs="Segoe UI"/>
-          <w:color w:val="1A2634"/>
-          <w:sz w:val="21"/>
-          <w:szCs w:val="21"/>
-        </w:rPr>
-        <w:t>}</w:t>
+        <w:t>{/edu_competencies}</w:t>
       </w:r>
     </w:p>
     <w:p>
@@ -491,27 +411,7 @@
           <w:sz w:val="21"/>
           <w:szCs w:val="21"/>
         </w:rPr>
-        <w:t>{#edu_</w:t>
-      </w:r>
-      <w:proofErr w:type="gramStart"/>
-      <w:r>
-        <w:rPr>
-          <w:rFonts w:cs="Segoe UI"/>
-          <w:color w:val="1A2634"/>
-          <w:sz w:val="21"/>
-          <w:szCs w:val="21"/>
-        </w:rPr>
-        <w:t>detail}{</w:t>
-      </w:r>
-      <w:proofErr w:type="gramEnd"/>
-      <w:r>
-        <w:rPr>
-          <w:rFonts w:cs="Segoe UI"/>
-          <w:color w:val="1A2634"/>
-          <w:sz w:val="21"/>
-          <w:szCs w:val="21"/>
-        </w:rPr>
-        <w:t>edu_detail}</w:t>
+        <w:t>{#edu_detail}{edu_detail}</w:t>
       </w:r>
     </w:p>
     <w:p>
@@ -532,27 +432,7 @@
           <w:sz w:val="21"/>
           <w:szCs w:val="21"/>
         </w:rPr>
-        <w:t>{/</w:t>
-      </w:r>
-      <w:proofErr w:type="spellStart"/>
-      <w:r>
-        <w:rPr>
-          <w:rFonts w:cs="Segoe UI"/>
-          <w:color w:val="1A2634"/>
-          <w:sz w:val="21"/>
-          <w:szCs w:val="21"/>
-        </w:rPr>
-        <w:t>edu_detail</w:t>
-      </w:r>
-      <w:proofErr w:type="spellEnd"/>
-      <w:r>
-        <w:rPr>
-          <w:rFonts w:cs="Segoe UI"/>
-          <w:color w:val="1A2634"/>
-          <w:sz w:val="21"/>
-          <w:szCs w:val="21"/>
-        </w:rPr>
-        <w:t>}</w:t>
+        <w:t>{/edu_detail}</w:t>
       </w:r>
     </w:p>
     <w:p>
@@ -689,111 +569,27 @@
           <w:sz w:val="21"/>
           <w:szCs w:val="21"/>
         </w:rPr>
-        <w:t>{</w:t>
-      </w:r>
-      <w:proofErr w:type="spellStart"/>
-      <w:r>
-        <w:rPr>
-          <w:rFonts w:cs="Segoe UI"/>
-          <w:b/>
-          <w:bCs/>
-          <w:color w:val="1A2634"/>
-          <w:sz w:val="21"/>
-          <w:szCs w:val="21"/>
-        </w:rPr>
-        <w:t>project_title</w:t>
-      </w:r>
-      <w:proofErr w:type="spellEnd"/>
-      <w:r>
-        <w:rPr>
-          <w:rFonts w:cs="Segoe UI"/>
-          <w:b/>
-          <w:bCs/>
-          <w:color w:val="1A2634"/>
-          <w:sz w:val="21"/>
-          <w:szCs w:val="21"/>
-        </w:rPr>
-        <w:t>}</w:t>
-      </w:r>
-    </w:p>
-    <w:p>
-      <w:pPr>
-        <w:spacing w:after="0" w:line="22" w:lineRule="atLeast"/>
-        <w:rPr>
-          <w:rFonts w:cs="Segoe UI"/>
-          <w:color w:val="1A2634"/>
-          <w:sz w:val="21"/>
-          <w:szCs w:val="21"/>
-        </w:rPr>
-      </w:pPr>
-      <w:r>
-        <w:rPr>
-          <w:rFonts w:cs="Segoe UI"/>
-          <w:color w:val="1A2634"/>
-          <w:sz w:val="21"/>
-          <w:szCs w:val="21"/>
-        </w:rPr>
-        <w:t>{#</w:t>
-      </w:r>
-      <w:proofErr w:type="gramStart"/>
-      <w:r>
-        <w:rPr>
-          <w:rFonts w:cs="Segoe UI"/>
-          <w:color w:val="1A2634"/>
-          <w:sz w:val="21"/>
-          <w:szCs w:val="21"/>
-        </w:rPr>
-        <w:t>start}{</w:t>
-      </w:r>
-      <w:proofErr w:type="gramEnd"/>
-      <w:r>
-        <w:rPr>
-          <w:rFonts w:cs="Segoe UI"/>
-          <w:color w:val="1A2634"/>
-          <w:sz w:val="21"/>
-          <w:szCs w:val="21"/>
-        </w:rPr>
-        <w:t>start}{/start}{#end_or_present} – {</w:t>
-      </w:r>
-      <w:proofErr w:type="spellStart"/>
-      <w:r>
-        <w:rPr>
-          <w:rFonts w:cs="Segoe UI"/>
-          <w:color w:val="1A2634"/>
-          <w:sz w:val="21"/>
-          <w:szCs w:val="21"/>
-        </w:rPr>
-        <w:t>end_or_present</w:t>
-      </w:r>
-      <w:proofErr w:type="spellEnd"/>
-      <w:r>
-        <w:rPr>
-          <w:rFonts w:cs="Segoe UI"/>
-          <w:color w:val="1A2634"/>
-          <w:sz w:val="21"/>
-          <w:szCs w:val="21"/>
-        </w:rPr>
-        <w:t>}{/</w:t>
-      </w:r>
-      <w:proofErr w:type="spellStart"/>
-      <w:r>
-        <w:rPr>
-          <w:rFonts w:cs="Segoe UI"/>
-          <w:color w:val="1A2634"/>
-          <w:sz w:val="21"/>
-          <w:szCs w:val="21"/>
-        </w:rPr>
-        <w:t>end_or_present</w:t>
-      </w:r>
-      <w:proofErr w:type="spellEnd"/>
-      <w:r>
-        <w:rPr>
-          <w:rFonts w:cs="Segoe UI"/>
-          <w:color w:val="1A2634"/>
-          <w:sz w:val="21"/>
-          <w:szCs w:val="21"/>
-        </w:rPr>
-        <w:t>}</w:t>
+        <w:t>{project_title}</w:t>
+      </w:r>
+    </w:p>
+    <w:p>
+      <w:pPr>
+        <w:spacing w:after="0" w:line="22" w:lineRule="atLeast"/>
+        <w:rPr>
+          <w:rFonts w:cs="Segoe UI"/>
+          <w:color w:val="1A2634"/>
+          <w:sz w:val="21"/>
+          <w:szCs w:val="21"/>
+        </w:rPr>
+      </w:pPr>
+      <w:r>
+        <w:rPr>
+          <w:rFonts w:cs="Segoe UI"/>
+          <w:color w:val="1A2634"/>
+          <w:sz w:val="21"/>
+          <w:szCs w:val="21"/>
+        </w:rPr>
+        <w:t>{#start}{start}{/start}{#end_or_present} – {end_or_present}{/end_or_present}</w:t>
       </w:r>
     </w:p>
     <w:p>
@@ -833,67 +629,27 @@
           <w:sz w:val="21"/>
           <w:szCs w:val="21"/>
         </w:rPr>
-        <w:t>{</w:t>
-      </w:r>
-      <w:proofErr w:type="spellStart"/>
-      <w:r>
-        <w:rPr>
-          <w:rFonts w:cs="Segoe UI"/>
-          <w:color w:val="1A2634"/>
-          <w:sz w:val="21"/>
-          <w:szCs w:val="21"/>
-        </w:rPr>
-        <w:t>project_description</w:t>
-      </w:r>
-      <w:proofErr w:type="spellEnd"/>
-      <w:r>
-        <w:rPr>
-          <w:rFonts w:cs="Segoe UI"/>
-          <w:color w:val="1A2634"/>
-          <w:sz w:val="21"/>
-          <w:szCs w:val="21"/>
-        </w:rPr>
-        <w:t>}</w:t>
-      </w:r>
-    </w:p>
-    <w:p>
-      <w:pPr>
-        <w:spacing w:after="0" w:line="22" w:lineRule="atLeast"/>
-        <w:rPr>
-          <w:rFonts w:cs="Segoe UI"/>
-          <w:color w:val="1A2634"/>
-          <w:sz w:val="21"/>
-          <w:szCs w:val="21"/>
-        </w:rPr>
-      </w:pPr>
-      <w:r>
-        <w:rPr>
-          <w:rFonts w:cs="Segoe UI"/>
-          <w:color w:val="1A2634"/>
-          <w:sz w:val="21"/>
-          <w:szCs w:val="21"/>
-        </w:rPr>
-        <w:t>{/</w:t>
-      </w:r>
-      <w:proofErr w:type="spellStart"/>
-      <w:r>
-        <w:rPr>
-          <w:rFonts w:cs="Segoe UI"/>
-          <w:color w:val="1A2634"/>
-          <w:sz w:val="21"/>
-          <w:szCs w:val="21"/>
-        </w:rPr>
-        <w:t>project_description</w:t>
-      </w:r>
-      <w:proofErr w:type="spellEnd"/>
-      <w:r>
-        <w:rPr>
-          <w:rFonts w:cs="Segoe UI"/>
-          <w:color w:val="1A2634"/>
-          <w:sz w:val="21"/>
-          <w:szCs w:val="21"/>
-        </w:rPr>
-        <w:t>}</w:t>
+        <w:t>{project_description}</w:t>
+      </w:r>
+    </w:p>
+    <w:p>
+      <w:pPr>
+        <w:spacing w:after="0" w:line="22" w:lineRule="atLeast"/>
+        <w:rPr>
+          <w:rFonts w:cs="Segoe UI"/>
+          <w:color w:val="1A2634"/>
+          <w:sz w:val="21"/>
+          <w:szCs w:val="21"/>
+        </w:rPr>
+      </w:pPr>
+      <w:r>
+        <w:rPr>
+          <w:rFonts w:cs="Segoe UI"/>
+          <w:color w:val="1A2634"/>
+          <w:sz w:val="21"/>
+          <w:szCs w:val="21"/>
+        </w:rPr>
+        <w:t>{/project_description}</w:t>
       </w:r>
     </w:p>
     <w:p>
@@ -955,27 +711,7 @@
           <w:sz w:val="21"/>
           <w:szCs w:val="21"/>
         </w:rPr>
-        <w:t>{/</w:t>
-      </w:r>
-      <w:proofErr w:type="spellStart"/>
-      <w:r>
-        <w:rPr>
-          <w:rFonts w:cs="Segoe UI"/>
-          <w:color w:val="1A2634"/>
-          <w:sz w:val="21"/>
-          <w:szCs w:val="21"/>
-        </w:rPr>
-        <w:t>project_tasks</w:t>
-      </w:r>
-      <w:proofErr w:type="spellEnd"/>
-      <w:r>
-        <w:rPr>
-          <w:rFonts w:cs="Segoe UI"/>
-          <w:color w:val="1A2634"/>
-          <w:sz w:val="21"/>
-          <w:szCs w:val="21"/>
-        </w:rPr>
-        <w:t>}</w:t>
+        <w:t>{/project_tasks}</w:t>
       </w:r>
     </w:p>
     <w:p>
@@ -1166,67 +902,7 @@
           <w:sz w:val="21"/>
           <w:szCs w:val="21"/>
         </w:rPr>
-        <w:t>{#</w:t>
-      </w:r>
-      <w:proofErr w:type="gramStart"/>
-      <w:r>
-        <w:rPr>
-          <w:rFonts w:cs="Segoe UI"/>
-          <w:color w:val="1A2634"/>
-          <w:sz w:val="21"/>
-          <w:szCs w:val="21"/>
-        </w:rPr>
-        <w:t>start}{</w:t>
-      </w:r>
-      <w:proofErr w:type="gramEnd"/>
-      <w:r>
-        <w:rPr>
-          <w:rFonts w:cs="Segoe UI"/>
-          <w:color w:val="1A2634"/>
-          <w:sz w:val="21"/>
-          <w:szCs w:val="21"/>
-        </w:rPr>
-        <w:t>start}{/start}{#end_or_present} – {</w:t>
-      </w:r>
-      <w:proofErr w:type="spellStart"/>
-      <w:r>
-        <w:rPr>
-          <w:rFonts w:cs="Segoe UI"/>
-          <w:color w:val="1A2634"/>
-          <w:sz w:val="21"/>
-          <w:szCs w:val="21"/>
-        </w:rPr>
-        <w:t>end_or_present</w:t>
-      </w:r>
-      <w:proofErr w:type="spellEnd"/>
-      <w:r>
-        <w:rPr>
-          <w:rFonts w:cs="Segoe UI"/>
-          <w:color w:val="1A2634"/>
-          <w:sz w:val="21"/>
-          <w:szCs w:val="21"/>
-        </w:rPr>
-        <w:t>}{/</w:t>
-      </w:r>
-      <w:proofErr w:type="spellStart"/>
-      <w:r>
-        <w:rPr>
-          <w:rFonts w:cs="Segoe UI"/>
-          <w:color w:val="1A2634"/>
-          <w:sz w:val="21"/>
-          <w:szCs w:val="21"/>
-        </w:rPr>
-        <w:t>end_or_present</w:t>
-      </w:r>
-      <w:proofErr w:type="spellEnd"/>
-      <w:r>
-        <w:rPr>
-          <w:rFonts w:cs="Segoe UI"/>
-          <w:color w:val="1A2634"/>
-          <w:sz w:val="21"/>
-          <w:szCs w:val="21"/>
-        </w:rPr>
-        <w:t>}</w:t>
+        <w:t>{#start}{start}{/start}{#end_or_present} – {end_or_present}{/end_or_present}</w:t>
       </w:r>
     </w:p>
     <w:p>
@@ -1267,67 +943,27 @@
           <w:szCs w:val="21"/>
         </w:rPr>
         <w:lastRenderedPageBreak/>
-        <w:t>{</w:t>
-      </w:r>
-      <w:proofErr w:type="spellStart"/>
-      <w:r>
-        <w:rPr>
-          <w:rFonts w:cs="Segoe UI"/>
-          <w:color w:val="1A2634"/>
-          <w:sz w:val="21"/>
-          <w:szCs w:val="21"/>
-        </w:rPr>
-        <w:t>role_summary</w:t>
-      </w:r>
-      <w:proofErr w:type="spellEnd"/>
-      <w:r>
-        <w:rPr>
-          <w:rFonts w:cs="Segoe UI"/>
-          <w:color w:val="1A2634"/>
-          <w:sz w:val="21"/>
-          <w:szCs w:val="21"/>
-        </w:rPr>
-        <w:t>}</w:t>
-      </w:r>
-    </w:p>
-    <w:p>
-      <w:pPr>
-        <w:spacing w:after="0" w:line="22" w:lineRule="atLeast"/>
-        <w:rPr>
-          <w:rFonts w:cs="Segoe UI"/>
-          <w:color w:val="1A2634"/>
-          <w:sz w:val="21"/>
-          <w:szCs w:val="21"/>
-        </w:rPr>
-      </w:pPr>
-      <w:r>
-        <w:rPr>
-          <w:rFonts w:cs="Segoe UI"/>
-          <w:color w:val="1A2634"/>
-          <w:sz w:val="21"/>
-          <w:szCs w:val="21"/>
-        </w:rPr>
-        <w:t>{/</w:t>
-      </w:r>
-      <w:proofErr w:type="spellStart"/>
-      <w:r>
-        <w:rPr>
-          <w:rFonts w:cs="Segoe UI"/>
-          <w:color w:val="1A2634"/>
-          <w:sz w:val="21"/>
-          <w:szCs w:val="21"/>
-        </w:rPr>
-        <w:t>role_summary</w:t>
-      </w:r>
-      <w:proofErr w:type="spellEnd"/>
-      <w:r>
-        <w:rPr>
-          <w:rFonts w:cs="Segoe UI"/>
-          <w:color w:val="1A2634"/>
-          <w:sz w:val="21"/>
-          <w:szCs w:val="21"/>
-        </w:rPr>
-        <w:t>}</w:t>
+        <w:t>{role_summary}</w:t>
+      </w:r>
+    </w:p>
+    <w:p>
+      <w:pPr>
+        <w:spacing w:after="0" w:line="22" w:lineRule="atLeast"/>
+        <w:rPr>
+          <w:rFonts w:cs="Segoe UI"/>
+          <w:color w:val="1A2634"/>
+          <w:sz w:val="21"/>
+          <w:szCs w:val="21"/>
+        </w:rPr>
+      </w:pPr>
+      <w:r>
+        <w:rPr>
+          <w:rFonts w:cs="Segoe UI"/>
+          <w:color w:val="1A2634"/>
+          <w:sz w:val="21"/>
+          <w:szCs w:val="21"/>
+        </w:rPr>
+        <w:t>{/role_summary}</w:t>
       </w:r>
     </w:p>
     <w:p>
@@ -1599,27 +1235,7 @@
           <w:sz w:val="21"/>
           <w:szCs w:val="21"/>
         </w:rPr>
-        <w:t>{</w:t>
-      </w:r>
-      <w:proofErr w:type="spellStart"/>
-      <w:r>
-        <w:rPr>
-          <w:rFonts w:cs="Segoe UI"/>
-          <w:color w:val="1A2634"/>
-          <w:sz w:val="21"/>
-          <w:szCs w:val="21"/>
-        </w:rPr>
-        <w:t>section_title</w:t>
-      </w:r>
-      <w:proofErr w:type="spellEnd"/>
-      <w:r>
-        <w:rPr>
-          <w:rFonts w:cs="Segoe UI"/>
-          <w:color w:val="1A2634"/>
-          <w:sz w:val="21"/>
-          <w:szCs w:val="21"/>
-        </w:rPr>
-        <w:t>}</w:t>
+        <w:t>{section_title}</w:t>
       </w:r>
     </w:p>
     <w:p>
@@ -1721,107 +1337,47 @@
           <w:sz w:val="21"/>
           <w:szCs w:val="21"/>
         </w:rPr>
-        <w:t>{</w:t>
-      </w:r>
-      <w:proofErr w:type="spellStart"/>
-      <w:r>
-        <w:rPr>
-          <w:rFonts w:cs="Segoe UI"/>
-          <w:color w:val="1A2634"/>
-          <w:sz w:val="21"/>
-          <w:szCs w:val="21"/>
-        </w:rPr>
-        <w:t>section_content</w:t>
-      </w:r>
-      <w:proofErr w:type="spellEnd"/>
-      <w:r>
-        <w:rPr>
-          <w:rFonts w:cs="Segoe UI"/>
-          <w:color w:val="1A2634"/>
-          <w:sz w:val="21"/>
-          <w:szCs w:val="21"/>
-        </w:rPr>
-        <w:t>}</w:t>
-      </w:r>
-    </w:p>
-    <w:p>
-      <w:pPr>
-        <w:spacing w:after="0" w:line="22" w:lineRule="atLeast"/>
-        <w:rPr>
-          <w:rFonts w:cs="Segoe UI"/>
-          <w:color w:val="1A2634"/>
-          <w:sz w:val="21"/>
-          <w:szCs w:val="21"/>
-        </w:rPr>
-      </w:pPr>
-      <w:r>
-        <w:rPr>
-          <w:rFonts w:cs="Segoe UI"/>
-          <w:color w:val="1A2634"/>
-          <w:sz w:val="21"/>
-          <w:szCs w:val="21"/>
-        </w:rPr>
-        <w:t>{/</w:t>
-      </w:r>
-      <w:proofErr w:type="spellStart"/>
-      <w:r>
-        <w:rPr>
-          <w:rFonts w:cs="Segoe UI"/>
-          <w:color w:val="1A2634"/>
-          <w:sz w:val="21"/>
-          <w:szCs w:val="21"/>
-        </w:rPr>
-        <w:t>section_content</w:t>
-      </w:r>
-      <w:proofErr w:type="spellEnd"/>
-      <w:r>
-        <w:rPr>
-          <w:rFonts w:cs="Segoe UI"/>
-          <w:color w:val="1A2634"/>
-          <w:sz w:val="21"/>
-          <w:szCs w:val="21"/>
-        </w:rPr>
-        <w:t>}</w:t>
-      </w:r>
-    </w:p>
-    <w:p>
-      <w:pPr>
-        <w:spacing w:after="0" w:line="22" w:lineRule="atLeast"/>
-        <w:rPr>
-          <w:rFonts w:cs="Segoe UI"/>
-          <w:color w:val="1A2634"/>
-          <w:sz w:val="21"/>
-          <w:szCs w:val="21"/>
-        </w:rPr>
-      </w:pPr>
-      <w:r>
-        <w:rPr>
-          <w:rFonts w:cs="Segoe UI"/>
-          <w:color w:val="1A2634"/>
-          <w:sz w:val="21"/>
-          <w:szCs w:val="21"/>
-        </w:rPr>
-        <w:t>{/</w:t>
-      </w:r>
-      <w:proofErr w:type="spellStart"/>
-      <w:r>
-        <w:rPr>
-          <w:rFonts w:cs="Segoe UI"/>
-          <w:color w:val="1A2634"/>
-          <w:sz w:val="21"/>
-          <w:szCs w:val="21"/>
-        </w:rPr>
-        <w:t>extra_sections</w:t>
-      </w:r>
-      <w:proofErr w:type="spellEnd"/>
-      <w:r>
-        <w:rPr>
-          <w:rFonts w:cs="Segoe UI"/>
-          <w:color w:val="1A2634"/>
-          <w:sz w:val="21"/>
-          <w:szCs w:val="21"/>
-        </w:rPr>
-        <w:t>}</w:t>
+        <w:t>{section_content}</w:t>
+      </w:r>
+    </w:p>
+    <w:p>
+      <w:pPr>
+        <w:spacing w:after="0" w:line="22" w:lineRule="atLeast"/>
+        <w:rPr>
+          <w:rFonts w:cs="Segoe UI"/>
+          <w:color w:val="1A2634"/>
+          <w:sz w:val="21"/>
+          <w:szCs w:val="21"/>
+        </w:rPr>
+      </w:pPr>
+      <w:r>
+        <w:rPr>
+          <w:rFonts w:cs="Segoe UI"/>
+          <w:color w:val="1A2634"/>
+          <w:sz w:val="21"/>
+          <w:szCs w:val="21"/>
+        </w:rPr>
+        <w:t>{/section_content}</w:t>
+      </w:r>
+    </w:p>
+    <w:p>
+      <w:pPr>
+        <w:spacing w:after="0" w:line="22" w:lineRule="atLeast"/>
+        <w:rPr>
+          <w:rFonts w:cs="Segoe UI"/>
+          <w:color w:val="1A2634"/>
+          <w:sz w:val="21"/>
+          <w:szCs w:val="21"/>
+        </w:rPr>
+      </w:pPr>
+      <w:r>
+        <w:rPr>
+          <w:rFonts w:cs="Segoe UI"/>
+          <w:color w:val="1A2634"/>
+          <w:sz w:val="21"/>
+          <w:szCs w:val="21"/>
+        </w:rPr>
+        <w:t>{/extra_sections}</w:t>
       </w:r>
     </w:p>
     <w:p>
@@ -1871,31 +1427,7 @@
         <w:t>REFERENCES</w:t>
       </w:r>
     </w:p>
-    <w:p>
-      <w:pPr>
-        <w:spacing w:after="0" w:line="22" w:lineRule="atLeast"/>
-        <w:rPr>
-          <w:sz w:val="21"/>
-          <w:szCs w:val="21"/>
-        </w:rPr>
-      </w:pPr>
-      <w:r>
-        <w:rPr>
-          <w:sz w:val="21"/>
-          <w:szCs w:val="21"/>
-        </w:rPr>
-        <w:t>{REFERENCE_SECTION}</w:t>
-      </w:r>
-    </w:p>
     <w:bookmarkEnd w:id="0"/>
-    <w:p>
-      <w:pPr>
-        <w:spacing w:after="0" w:line="22" w:lineRule="atLeast"/>
-      </w:pPr>
-      <w:r>
-        <w:t>{/HAS_REFERENCE}</w:t>
-      </w:r>
-    </w:p>
     <w:p>
       <w:pPr>
         <w:spacing w:after="0" w:line="22" w:lineRule="atLeast"/>
@@ -1981,22 +1513,50 @@
     <w:p>
       <w:pPr>
         <w:spacing w:after="0" w:line="22" w:lineRule="atLeast"/>
-        <w:rPr>
-          <w:rFonts w:cs="Segoe UI"/>
-          <w:color w:val="1A2634"/>
-          <w:sz w:val="21"/>
-          <w:szCs w:val="21"/>
-        </w:rPr>
       </w:pPr>
       <w:r>
         <w:t>{#references_list}</w:t>
       </w:r>
-      <w:r>
-        <w:rPr>
-          <w:sz w:val="21"/>
-          <w:szCs w:val="21"/>
-        </w:rPr>
-        <w:br/>
+    </w:p>
+    <w:p>
+      <w:pPr>
+        <w:spacing w:after="0" w:line="22" w:lineRule="atLeast"/>
+        <w:rPr>
+          <w:sz w:val="21"/>
+          <w:szCs w:val="21"/>
+        </w:rPr>
+      </w:pPr>
+      <w:r>
+        <w:rPr>
+          <w:sz w:val="21"/>
+          <w:szCs w:val="21"/>
+        </w:rPr>
+        <w:t>{REFERENCE_SECTION}</w:t>
+      </w:r>
+    </w:p>
+    <w:p>
+      <w:pPr>
+        <w:spacing w:after="0" w:line="22" w:lineRule="atLeast"/>
+      </w:pPr>
+      <w:r>
+        <w:t>{/HAS_REFERENCE}</w:t>
+      </w:r>
+    </w:p>
+    <w:p>
+      <w:pPr>
+        <w:spacing w:after="0" w:line="22" w:lineRule="atLeast"/>
+        <w:rPr>
+          <w:rFonts w:cs="Segoe UI"/>
+          <w:color w:val="1A2634"/>
+          <w:sz w:val="21"/>
+          <w:szCs w:val="21"/>
+        </w:rPr>
+      </w:pPr>
+      <w:r>
+        <w:rPr>
+          <w:sz w:val="21"/>
+          <w:szCs w:val="21"/>
+        </w:rPr>
         <w:t>{/HAS_REFERENCES_LIST}</w:t>
       </w:r>
       <w:r>

</xml_diff>

<commit_message>
Fix Docxtemplater references section loop tags
</commit_message>
<xml_diff>
--- a/templates/cv-template.docx
+++ b/templates/cv-template.docx
@@ -340,7 +340,67 @@
           <w:sz w:val="21"/>
           <w:szCs w:val="21"/>
         </w:rPr>
-        <w:t>{#start}{start}{/start}{#end_or_present} – {end_or_present}{/end_or_present}</w:t>
+        <w:t>{#</w:t>
+      </w:r>
+      <w:proofErr w:type="gramStart"/>
+      <w:r>
+        <w:rPr>
+          <w:rFonts w:cs="Segoe UI"/>
+          <w:color w:val="1A2634"/>
+          <w:sz w:val="21"/>
+          <w:szCs w:val="21"/>
+        </w:rPr>
+        <w:t>start}{</w:t>
+      </w:r>
+      <w:proofErr w:type="gramEnd"/>
+      <w:r>
+        <w:rPr>
+          <w:rFonts w:cs="Segoe UI"/>
+          <w:color w:val="1A2634"/>
+          <w:sz w:val="21"/>
+          <w:szCs w:val="21"/>
+        </w:rPr>
+        <w:t>start}{/start}{#end_or_present} – {</w:t>
+      </w:r>
+      <w:proofErr w:type="spellStart"/>
+      <w:r>
+        <w:rPr>
+          <w:rFonts w:cs="Segoe UI"/>
+          <w:color w:val="1A2634"/>
+          <w:sz w:val="21"/>
+          <w:szCs w:val="21"/>
+        </w:rPr>
+        <w:t>end_or_present</w:t>
+      </w:r>
+      <w:proofErr w:type="spellEnd"/>
+      <w:r>
+        <w:rPr>
+          <w:rFonts w:cs="Segoe UI"/>
+          <w:color w:val="1A2634"/>
+          <w:sz w:val="21"/>
+          <w:szCs w:val="21"/>
+        </w:rPr>
+        <w:t>}{/</w:t>
+      </w:r>
+      <w:proofErr w:type="spellStart"/>
+      <w:r>
+        <w:rPr>
+          <w:rFonts w:cs="Segoe UI"/>
+          <w:color w:val="1A2634"/>
+          <w:sz w:val="21"/>
+          <w:szCs w:val="21"/>
+        </w:rPr>
+        <w:t>end_or_present</w:t>
+      </w:r>
+      <w:proofErr w:type="spellEnd"/>
+      <w:r>
+        <w:rPr>
+          <w:rFonts w:cs="Segoe UI"/>
+          <w:color w:val="1A2634"/>
+          <w:sz w:val="21"/>
+          <w:szCs w:val="21"/>
+        </w:rPr>
+        <w:t>}</w:t>
       </w:r>
     </w:p>
     <w:p>
@@ -390,7 +450,27 @@
           <w:sz w:val="21"/>
           <w:szCs w:val="21"/>
         </w:rPr>
-        <w:t>{/edu_competencies}</w:t>
+        <w:t>{/</w:t>
+      </w:r>
+      <w:proofErr w:type="spellStart"/>
+      <w:r>
+        <w:rPr>
+          <w:rFonts w:cs="Segoe UI"/>
+          <w:color w:val="1A2634"/>
+          <w:sz w:val="21"/>
+          <w:szCs w:val="21"/>
+        </w:rPr>
+        <w:t>edu_competencies</w:t>
+      </w:r>
+      <w:proofErr w:type="spellEnd"/>
+      <w:r>
+        <w:rPr>
+          <w:rFonts w:cs="Segoe UI"/>
+          <w:color w:val="1A2634"/>
+          <w:sz w:val="21"/>
+          <w:szCs w:val="21"/>
+        </w:rPr>
+        <w:t>}</w:t>
       </w:r>
     </w:p>
     <w:p>
@@ -411,7 +491,27 @@
           <w:sz w:val="21"/>
           <w:szCs w:val="21"/>
         </w:rPr>
-        <w:t>{#edu_detail}{edu_detail}</w:t>
+        <w:t>{#edu_</w:t>
+      </w:r>
+      <w:proofErr w:type="gramStart"/>
+      <w:r>
+        <w:rPr>
+          <w:rFonts w:cs="Segoe UI"/>
+          <w:color w:val="1A2634"/>
+          <w:sz w:val="21"/>
+          <w:szCs w:val="21"/>
+        </w:rPr>
+        <w:t>detail}{</w:t>
+      </w:r>
+      <w:proofErr w:type="gramEnd"/>
+      <w:r>
+        <w:rPr>
+          <w:rFonts w:cs="Segoe UI"/>
+          <w:color w:val="1A2634"/>
+          <w:sz w:val="21"/>
+          <w:szCs w:val="21"/>
+        </w:rPr>
+        <w:t>edu_detail}</w:t>
       </w:r>
     </w:p>
     <w:p>
@@ -432,7 +532,27 @@
           <w:sz w:val="21"/>
           <w:szCs w:val="21"/>
         </w:rPr>
-        <w:t>{/edu_detail}</w:t>
+        <w:t>{/</w:t>
+      </w:r>
+      <w:proofErr w:type="spellStart"/>
+      <w:r>
+        <w:rPr>
+          <w:rFonts w:cs="Segoe UI"/>
+          <w:color w:val="1A2634"/>
+          <w:sz w:val="21"/>
+          <w:szCs w:val="21"/>
+        </w:rPr>
+        <w:t>edu_detail</w:t>
+      </w:r>
+      <w:proofErr w:type="spellEnd"/>
+      <w:r>
+        <w:rPr>
+          <w:rFonts w:cs="Segoe UI"/>
+          <w:color w:val="1A2634"/>
+          <w:sz w:val="21"/>
+          <w:szCs w:val="21"/>
+        </w:rPr>
+        <w:t>}</w:t>
       </w:r>
     </w:p>
     <w:p>
@@ -569,27 +689,111 @@
           <w:sz w:val="21"/>
           <w:szCs w:val="21"/>
         </w:rPr>
-        <w:t>{project_title}</w:t>
-      </w:r>
-    </w:p>
-    <w:p>
-      <w:pPr>
-        <w:spacing w:after="0" w:line="22" w:lineRule="atLeast"/>
-        <w:rPr>
-          <w:rFonts w:cs="Segoe UI"/>
-          <w:color w:val="1A2634"/>
-          <w:sz w:val="21"/>
-          <w:szCs w:val="21"/>
-        </w:rPr>
-      </w:pPr>
-      <w:r>
-        <w:rPr>
-          <w:rFonts w:cs="Segoe UI"/>
-          <w:color w:val="1A2634"/>
-          <w:sz w:val="21"/>
-          <w:szCs w:val="21"/>
-        </w:rPr>
-        <w:t>{#start}{start}{/start}{#end_or_present} – {end_or_present}{/end_or_present}</w:t>
+        <w:t>{</w:t>
+      </w:r>
+      <w:proofErr w:type="spellStart"/>
+      <w:r>
+        <w:rPr>
+          <w:rFonts w:cs="Segoe UI"/>
+          <w:b/>
+          <w:bCs/>
+          <w:color w:val="1A2634"/>
+          <w:sz w:val="21"/>
+          <w:szCs w:val="21"/>
+        </w:rPr>
+        <w:t>project_title</w:t>
+      </w:r>
+      <w:proofErr w:type="spellEnd"/>
+      <w:r>
+        <w:rPr>
+          <w:rFonts w:cs="Segoe UI"/>
+          <w:b/>
+          <w:bCs/>
+          <w:color w:val="1A2634"/>
+          <w:sz w:val="21"/>
+          <w:szCs w:val="21"/>
+        </w:rPr>
+        <w:t>}</w:t>
+      </w:r>
+    </w:p>
+    <w:p>
+      <w:pPr>
+        <w:spacing w:after="0" w:line="22" w:lineRule="atLeast"/>
+        <w:rPr>
+          <w:rFonts w:cs="Segoe UI"/>
+          <w:color w:val="1A2634"/>
+          <w:sz w:val="21"/>
+          <w:szCs w:val="21"/>
+        </w:rPr>
+      </w:pPr>
+      <w:r>
+        <w:rPr>
+          <w:rFonts w:cs="Segoe UI"/>
+          <w:color w:val="1A2634"/>
+          <w:sz w:val="21"/>
+          <w:szCs w:val="21"/>
+        </w:rPr>
+        <w:t>{#</w:t>
+      </w:r>
+      <w:proofErr w:type="gramStart"/>
+      <w:r>
+        <w:rPr>
+          <w:rFonts w:cs="Segoe UI"/>
+          <w:color w:val="1A2634"/>
+          <w:sz w:val="21"/>
+          <w:szCs w:val="21"/>
+        </w:rPr>
+        <w:t>start}{</w:t>
+      </w:r>
+      <w:proofErr w:type="gramEnd"/>
+      <w:r>
+        <w:rPr>
+          <w:rFonts w:cs="Segoe UI"/>
+          <w:color w:val="1A2634"/>
+          <w:sz w:val="21"/>
+          <w:szCs w:val="21"/>
+        </w:rPr>
+        <w:t>start}{/start}{#end_or_present} – {</w:t>
+      </w:r>
+      <w:proofErr w:type="spellStart"/>
+      <w:r>
+        <w:rPr>
+          <w:rFonts w:cs="Segoe UI"/>
+          <w:color w:val="1A2634"/>
+          <w:sz w:val="21"/>
+          <w:szCs w:val="21"/>
+        </w:rPr>
+        <w:t>end_or_present</w:t>
+      </w:r>
+      <w:proofErr w:type="spellEnd"/>
+      <w:r>
+        <w:rPr>
+          <w:rFonts w:cs="Segoe UI"/>
+          <w:color w:val="1A2634"/>
+          <w:sz w:val="21"/>
+          <w:szCs w:val="21"/>
+        </w:rPr>
+        <w:t>}{/</w:t>
+      </w:r>
+      <w:proofErr w:type="spellStart"/>
+      <w:r>
+        <w:rPr>
+          <w:rFonts w:cs="Segoe UI"/>
+          <w:color w:val="1A2634"/>
+          <w:sz w:val="21"/>
+          <w:szCs w:val="21"/>
+        </w:rPr>
+        <w:t>end_or_present</w:t>
+      </w:r>
+      <w:proofErr w:type="spellEnd"/>
+      <w:r>
+        <w:rPr>
+          <w:rFonts w:cs="Segoe UI"/>
+          <w:color w:val="1A2634"/>
+          <w:sz w:val="21"/>
+          <w:szCs w:val="21"/>
+        </w:rPr>
+        <w:t>}</w:t>
       </w:r>
     </w:p>
     <w:p>
@@ -629,27 +833,67 @@
           <w:sz w:val="21"/>
           <w:szCs w:val="21"/>
         </w:rPr>
-        <w:t>{project_description}</w:t>
-      </w:r>
-    </w:p>
-    <w:p>
-      <w:pPr>
-        <w:spacing w:after="0" w:line="22" w:lineRule="atLeast"/>
-        <w:rPr>
-          <w:rFonts w:cs="Segoe UI"/>
-          <w:color w:val="1A2634"/>
-          <w:sz w:val="21"/>
-          <w:szCs w:val="21"/>
-        </w:rPr>
-      </w:pPr>
-      <w:r>
-        <w:rPr>
-          <w:rFonts w:cs="Segoe UI"/>
-          <w:color w:val="1A2634"/>
-          <w:sz w:val="21"/>
-          <w:szCs w:val="21"/>
-        </w:rPr>
-        <w:t>{/project_description}</w:t>
+        <w:t>{</w:t>
+      </w:r>
+      <w:proofErr w:type="spellStart"/>
+      <w:r>
+        <w:rPr>
+          <w:rFonts w:cs="Segoe UI"/>
+          <w:color w:val="1A2634"/>
+          <w:sz w:val="21"/>
+          <w:szCs w:val="21"/>
+        </w:rPr>
+        <w:t>project_description</w:t>
+      </w:r>
+      <w:proofErr w:type="spellEnd"/>
+      <w:r>
+        <w:rPr>
+          <w:rFonts w:cs="Segoe UI"/>
+          <w:color w:val="1A2634"/>
+          <w:sz w:val="21"/>
+          <w:szCs w:val="21"/>
+        </w:rPr>
+        <w:t>}</w:t>
+      </w:r>
+    </w:p>
+    <w:p>
+      <w:pPr>
+        <w:spacing w:after="0" w:line="22" w:lineRule="atLeast"/>
+        <w:rPr>
+          <w:rFonts w:cs="Segoe UI"/>
+          <w:color w:val="1A2634"/>
+          <w:sz w:val="21"/>
+          <w:szCs w:val="21"/>
+        </w:rPr>
+      </w:pPr>
+      <w:r>
+        <w:rPr>
+          <w:rFonts w:cs="Segoe UI"/>
+          <w:color w:val="1A2634"/>
+          <w:sz w:val="21"/>
+          <w:szCs w:val="21"/>
+        </w:rPr>
+        <w:t>{/</w:t>
+      </w:r>
+      <w:proofErr w:type="spellStart"/>
+      <w:r>
+        <w:rPr>
+          <w:rFonts w:cs="Segoe UI"/>
+          <w:color w:val="1A2634"/>
+          <w:sz w:val="21"/>
+          <w:szCs w:val="21"/>
+        </w:rPr>
+        <w:t>project_description</w:t>
+      </w:r>
+      <w:proofErr w:type="spellEnd"/>
+      <w:r>
+        <w:rPr>
+          <w:rFonts w:cs="Segoe UI"/>
+          <w:color w:val="1A2634"/>
+          <w:sz w:val="21"/>
+          <w:szCs w:val="21"/>
+        </w:rPr>
+        <w:t>}</w:t>
       </w:r>
     </w:p>
     <w:p>
@@ -711,7 +955,27 @@
           <w:sz w:val="21"/>
           <w:szCs w:val="21"/>
         </w:rPr>
-        <w:t>{/project_tasks}</w:t>
+        <w:t>{/</w:t>
+      </w:r>
+      <w:proofErr w:type="spellStart"/>
+      <w:r>
+        <w:rPr>
+          <w:rFonts w:cs="Segoe UI"/>
+          <w:color w:val="1A2634"/>
+          <w:sz w:val="21"/>
+          <w:szCs w:val="21"/>
+        </w:rPr>
+        <w:t>project_tasks</w:t>
+      </w:r>
+      <w:proofErr w:type="spellEnd"/>
+      <w:r>
+        <w:rPr>
+          <w:rFonts w:cs="Segoe UI"/>
+          <w:color w:val="1A2634"/>
+          <w:sz w:val="21"/>
+          <w:szCs w:val="21"/>
+        </w:rPr>
+        <w:t>}</w:t>
       </w:r>
     </w:p>
     <w:p>
@@ -902,7 +1166,67 @@
           <w:sz w:val="21"/>
           <w:szCs w:val="21"/>
         </w:rPr>
-        <w:t>{#start}{start}{/start}{#end_or_present} – {end_or_present}{/end_or_present}</w:t>
+        <w:t>{#</w:t>
+      </w:r>
+      <w:proofErr w:type="gramStart"/>
+      <w:r>
+        <w:rPr>
+          <w:rFonts w:cs="Segoe UI"/>
+          <w:color w:val="1A2634"/>
+          <w:sz w:val="21"/>
+          <w:szCs w:val="21"/>
+        </w:rPr>
+        <w:t>start}{</w:t>
+      </w:r>
+      <w:proofErr w:type="gramEnd"/>
+      <w:r>
+        <w:rPr>
+          <w:rFonts w:cs="Segoe UI"/>
+          <w:color w:val="1A2634"/>
+          <w:sz w:val="21"/>
+          <w:szCs w:val="21"/>
+        </w:rPr>
+        <w:t>start}{/start}{#end_or_present} – {</w:t>
+      </w:r>
+      <w:proofErr w:type="spellStart"/>
+      <w:r>
+        <w:rPr>
+          <w:rFonts w:cs="Segoe UI"/>
+          <w:color w:val="1A2634"/>
+          <w:sz w:val="21"/>
+          <w:szCs w:val="21"/>
+        </w:rPr>
+        <w:t>end_or_present</w:t>
+      </w:r>
+      <w:proofErr w:type="spellEnd"/>
+      <w:r>
+        <w:rPr>
+          <w:rFonts w:cs="Segoe UI"/>
+          <w:color w:val="1A2634"/>
+          <w:sz w:val="21"/>
+          <w:szCs w:val="21"/>
+        </w:rPr>
+        <w:t>}{/</w:t>
+      </w:r>
+      <w:proofErr w:type="spellStart"/>
+      <w:r>
+        <w:rPr>
+          <w:rFonts w:cs="Segoe UI"/>
+          <w:color w:val="1A2634"/>
+          <w:sz w:val="21"/>
+          <w:szCs w:val="21"/>
+        </w:rPr>
+        <w:t>end_or_present</w:t>
+      </w:r>
+      <w:proofErr w:type="spellEnd"/>
+      <w:r>
+        <w:rPr>
+          <w:rFonts w:cs="Segoe UI"/>
+          <w:color w:val="1A2634"/>
+          <w:sz w:val="21"/>
+          <w:szCs w:val="21"/>
+        </w:rPr>
+        <w:t>}</w:t>
       </w:r>
     </w:p>
     <w:p>
@@ -943,27 +1267,67 @@
           <w:szCs w:val="21"/>
         </w:rPr>
         <w:lastRenderedPageBreak/>
-        <w:t>{role_summary}</w:t>
-      </w:r>
-    </w:p>
-    <w:p>
-      <w:pPr>
-        <w:spacing w:after="0" w:line="22" w:lineRule="atLeast"/>
-        <w:rPr>
-          <w:rFonts w:cs="Segoe UI"/>
-          <w:color w:val="1A2634"/>
-          <w:sz w:val="21"/>
-          <w:szCs w:val="21"/>
-        </w:rPr>
-      </w:pPr>
-      <w:r>
-        <w:rPr>
-          <w:rFonts w:cs="Segoe UI"/>
-          <w:color w:val="1A2634"/>
-          <w:sz w:val="21"/>
-          <w:szCs w:val="21"/>
-        </w:rPr>
-        <w:t>{/role_summary}</w:t>
+        <w:t>{</w:t>
+      </w:r>
+      <w:proofErr w:type="spellStart"/>
+      <w:r>
+        <w:rPr>
+          <w:rFonts w:cs="Segoe UI"/>
+          <w:color w:val="1A2634"/>
+          <w:sz w:val="21"/>
+          <w:szCs w:val="21"/>
+        </w:rPr>
+        <w:t>role_summary</w:t>
+      </w:r>
+      <w:proofErr w:type="spellEnd"/>
+      <w:r>
+        <w:rPr>
+          <w:rFonts w:cs="Segoe UI"/>
+          <w:color w:val="1A2634"/>
+          <w:sz w:val="21"/>
+          <w:szCs w:val="21"/>
+        </w:rPr>
+        <w:t>}</w:t>
+      </w:r>
+    </w:p>
+    <w:p>
+      <w:pPr>
+        <w:spacing w:after="0" w:line="22" w:lineRule="atLeast"/>
+        <w:rPr>
+          <w:rFonts w:cs="Segoe UI"/>
+          <w:color w:val="1A2634"/>
+          <w:sz w:val="21"/>
+          <w:szCs w:val="21"/>
+        </w:rPr>
+      </w:pPr>
+      <w:r>
+        <w:rPr>
+          <w:rFonts w:cs="Segoe UI"/>
+          <w:color w:val="1A2634"/>
+          <w:sz w:val="21"/>
+          <w:szCs w:val="21"/>
+        </w:rPr>
+        <w:t>{/</w:t>
+      </w:r>
+      <w:proofErr w:type="spellStart"/>
+      <w:r>
+        <w:rPr>
+          <w:rFonts w:cs="Segoe UI"/>
+          <w:color w:val="1A2634"/>
+          <w:sz w:val="21"/>
+          <w:szCs w:val="21"/>
+        </w:rPr>
+        <w:t>role_summary</w:t>
+      </w:r>
+      <w:proofErr w:type="spellEnd"/>
+      <w:r>
+        <w:rPr>
+          <w:rFonts w:cs="Segoe UI"/>
+          <w:color w:val="1A2634"/>
+          <w:sz w:val="21"/>
+          <w:szCs w:val="21"/>
+        </w:rPr>
+        <w:t>}</w:t>
       </w:r>
     </w:p>
     <w:p>
@@ -1235,7 +1599,27 @@
           <w:sz w:val="21"/>
           <w:szCs w:val="21"/>
         </w:rPr>
-        <w:t>{section_title}</w:t>
+        <w:t>{</w:t>
+      </w:r>
+      <w:proofErr w:type="spellStart"/>
+      <w:r>
+        <w:rPr>
+          <w:rFonts w:cs="Segoe UI"/>
+          <w:color w:val="1A2634"/>
+          <w:sz w:val="21"/>
+          <w:szCs w:val="21"/>
+        </w:rPr>
+        <w:t>section_title</w:t>
+      </w:r>
+      <w:proofErr w:type="spellEnd"/>
+      <w:r>
+        <w:rPr>
+          <w:rFonts w:cs="Segoe UI"/>
+          <w:color w:val="1A2634"/>
+          <w:sz w:val="21"/>
+          <w:szCs w:val="21"/>
+        </w:rPr>
+        <w:t>}</w:t>
       </w:r>
     </w:p>
     <w:p>
@@ -1337,47 +1721,107 @@
           <w:sz w:val="21"/>
           <w:szCs w:val="21"/>
         </w:rPr>
-        <w:t>{section_content}</w:t>
-      </w:r>
-    </w:p>
-    <w:p>
-      <w:pPr>
-        <w:spacing w:after="0" w:line="22" w:lineRule="atLeast"/>
-        <w:rPr>
-          <w:rFonts w:cs="Segoe UI"/>
-          <w:color w:val="1A2634"/>
-          <w:sz w:val="21"/>
-          <w:szCs w:val="21"/>
-        </w:rPr>
-      </w:pPr>
-      <w:r>
-        <w:rPr>
-          <w:rFonts w:cs="Segoe UI"/>
-          <w:color w:val="1A2634"/>
-          <w:sz w:val="21"/>
-          <w:szCs w:val="21"/>
-        </w:rPr>
-        <w:t>{/section_content}</w:t>
-      </w:r>
-    </w:p>
-    <w:p>
-      <w:pPr>
-        <w:spacing w:after="0" w:line="22" w:lineRule="atLeast"/>
-        <w:rPr>
-          <w:rFonts w:cs="Segoe UI"/>
-          <w:color w:val="1A2634"/>
-          <w:sz w:val="21"/>
-          <w:szCs w:val="21"/>
-        </w:rPr>
-      </w:pPr>
-      <w:r>
-        <w:rPr>
-          <w:rFonts w:cs="Segoe UI"/>
-          <w:color w:val="1A2634"/>
-          <w:sz w:val="21"/>
-          <w:szCs w:val="21"/>
-        </w:rPr>
-        <w:t>{/extra_sections}</w:t>
+        <w:t>{</w:t>
+      </w:r>
+      <w:proofErr w:type="spellStart"/>
+      <w:r>
+        <w:rPr>
+          <w:rFonts w:cs="Segoe UI"/>
+          <w:color w:val="1A2634"/>
+          <w:sz w:val="21"/>
+          <w:szCs w:val="21"/>
+        </w:rPr>
+        <w:t>section_content</w:t>
+      </w:r>
+      <w:proofErr w:type="spellEnd"/>
+      <w:r>
+        <w:rPr>
+          <w:rFonts w:cs="Segoe UI"/>
+          <w:color w:val="1A2634"/>
+          <w:sz w:val="21"/>
+          <w:szCs w:val="21"/>
+        </w:rPr>
+        <w:t>}</w:t>
+      </w:r>
+    </w:p>
+    <w:p>
+      <w:pPr>
+        <w:spacing w:after="0" w:line="22" w:lineRule="atLeast"/>
+        <w:rPr>
+          <w:rFonts w:cs="Segoe UI"/>
+          <w:color w:val="1A2634"/>
+          <w:sz w:val="21"/>
+          <w:szCs w:val="21"/>
+        </w:rPr>
+      </w:pPr>
+      <w:r>
+        <w:rPr>
+          <w:rFonts w:cs="Segoe UI"/>
+          <w:color w:val="1A2634"/>
+          <w:sz w:val="21"/>
+          <w:szCs w:val="21"/>
+        </w:rPr>
+        <w:t>{/</w:t>
+      </w:r>
+      <w:proofErr w:type="spellStart"/>
+      <w:r>
+        <w:rPr>
+          <w:rFonts w:cs="Segoe UI"/>
+          <w:color w:val="1A2634"/>
+          <w:sz w:val="21"/>
+          <w:szCs w:val="21"/>
+        </w:rPr>
+        <w:t>section_content</w:t>
+      </w:r>
+      <w:proofErr w:type="spellEnd"/>
+      <w:r>
+        <w:rPr>
+          <w:rFonts w:cs="Segoe UI"/>
+          <w:color w:val="1A2634"/>
+          <w:sz w:val="21"/>
+          <w:szCs w:val="21"/>
+        </w:rPr>
+        <w:t>}</w:t>
+      </w:r>
+    </w:p>
+    <w:p>
+      <w:pPr>
+        <w:spacing w:after="0" w:line="22" w:lineRule="atLeast"/>
+        <w:rPr>
+          <w:rFonts w:cs="Segoe UI"/>
+          <w:color w:val="1A2634"/>
+          <w:sz w:val="21"/>
+          <w:szCs w:val="21"/>
+        </w:rPr>
+      </w:pPr>
+      <w:r>
+        <w:rPr>
+          <w:rFonts w:cs="Segoe UI"/>
+          <w:color w:val="1A2634"/>
+          <w:sz w:val="21"/>
+          <w:szCs w:val="21"/>
+        </w:rPr>
+        <w:t>{/</w:t>
+      </w:r>
+      <w:proofErr w:type="spellStart"/>
+      <w:r>
+        <w:rPr>
+          <w:rFonts w:cs="Segoe UI"/>
+          <w:color w:val="1A2634"/>
+          <w:sz w:val="21"/>
+          <w:szCs w:val="21"/>
+        </w:rPr>
+        <w:t>extra_sections</w:t>
+      </w:r>
+      <w:proofErr w:type="spellEnd"/>
+      <w:r>
+        <w:rPr>
+          <w:rFonts w:cs="Segoe UI"/>
+          <w:color w:val="1A2634"/>
+          <w:sz w:val="21"/>
+          <w:szCs w:val="21"/>
+        </w:rPr>
+        <w:t>}</w:t>
       </w:r>
     </w:p>
     <w:p>
@@ -1432,6 +1876,24 @@
       <w:pPr>
         <w:spacing w:after="0" w:line="22" w:lineRule="atLeast"/>
         <w:rPr>
+          <w:rFonts w:cs="Segoe UI"/>
+          <w:color w:val="1A2634"/>
+          <w:sz w:val="21"/>
+          <w:szCs w:val="21"/>
+        </w:rPr>
+      </w:pPr>
+      <w:r>
+        <w:rPr>
+          <w:sz w:val="21"/>
+          <w:szCs w:val="21"/>
+        </w:rPr>
+        <w:t>{/HAS_REFERENCE}</w:t>
+      </w:r>
+    </w:p>
+    <w:p>
+      <w:pPr>
+        <w:spacing w:after="0" w:line="22" w:lineRule="atLeast"/>
+        <w:rPr>
           <w:sz w:val="21"/>
           <w:szCs w:val="21"/>
         </w:rPr>
@@ -1531,6 +1993,20 @@
           <w:sz w:val="21"/>
           <w:szCs w:val="21"/>
         </w:rPr>
+        <w:t>{/HAS_REFERENCES_LIST}</w:t>
+      </w:r>
+      <w:r>
+        <w:rPr>
+          <w:sz w:val="21"/>
+          <w:szCs w:val="21"/>
+        </w:rPr>
+        <w:br/>
+      </w:r>
+      <w:r>
+        <w:rPr>
+          <w:sz w:val="21"/>
+          <w:szCs w:val="21"/>
+        </w:rPr>
         <w:t>{REFERENCE_SECTION}</w:t>
       </w:r>
     </w:p>
@@ -1552,21 +2028,6 @@
           <w:szCs w:val="21"/>
         </w:rPr>
       </w:pPr>
-      <w:r>
-        <w:rPr>
-          <w:sz w:val="21"/>
-          <w:szCs w:val="21"/>
-        </w:rPr>
-        <w:t>{/HAS_REFERENCES_LIST}</w:t>
-      </w:r>
-      <w:r>
-        <w:rPr>
-          <w:sz w:val="21"/>
-          <w:szCs w:val="21"/>
-        </w:rPr>
-        <w:br/>
-        <w:t>{/HAS_REFERENCE}</w:t>
-      </w:r>
     </w:p>
     <w:sectPr>
       <w:pgSz w:w="11909" w:h="16834" w:code="9"/>

</xml_diff>

<commit_message>
Fix references loop tags in DOCX template
</commit_message>
<xml_diff>
--- a/templates/cv-template.docx
+++ b/templates/cv-template.docx
@@ -1876,24 +1876,6 @@
       <w:pPr>
         <w:spacing w:after="0" w:line="22" w:lineRule="atLeast"/>
         <w:rPr>
-          <w:rFonts w:cs="Segoe UI"/>
-          <w:color w:val="1A2634"/>
-          <w:sz w:val="21"/>
-          <w:szCs w:val="21"/>
-        </w:rPr>
-      </w:pPr>
-      <w:r>
-        <w:rPr>
-          <w:sz w:val="21"/>
-          <w:szCs w:val="21"/>
-        </w:rPr>
-        <w:t>{/HAS_REFERENCE}</w:t>
-      </w:r>
-    </w:p>
-    <w:p>
-      <w:pPr>
-        <w:spacing w:after="0" w:line="22" w:lineRule="atLeast"/>
-        <w:rPr>
           <w:sz w:val="21"/>
           <w:szCs w:val="21"/>
         </w:rPr>
@@ -1905,16 +1887,12 @@
         </w:rPr>
         <w:t>{#HAS_REFERENCES_LIST}</w:t>
       </w:r>
-    </w:p>
-    <w:p>
-      <w:pPr>
-        <w:spacing w:after="0" w:line="22" w:lineRule="atLeast"/>
-        <w:rPr>
-          <w:sz w:val="21"/>
-          <w:szCs w:val="21"/>
-        </w:rPr>
-      </w:pPr>
-      <w:r>
+      <w:r>
+        <w:rPr>
+          <w:sz w:val="21"/>
+          <w:szCs w:val="21"/>
+        </w:rPr>
+        <w:br/>
         <w:t>{#references_list}</w:t>
       </w:r>
       <w:r>
@@ -1938,29 +1916,14 @@
           <w:sz w:val="21"/>
           <w:szCs w:val="21"/>
         </w:rPr>
-        <w:t xml:space="preserve">, </w:t>
-      </w:r>
-      <w:r>
-        <w:rPr>
-          <w:sz w:val="21"/>
-          <w:szCs w:val="21"/>
-        </w:rPr>
-        <w:t xml:space="preserve">{position}, </w:t>
-      </w:r>
-    </w:p>
-    <w:p>
-      <w:pPr>
-        <w:spacing w:after="0" w:line="22" w:lineRule="atLeast"/>
-        <w:rPr>
-          <w:sz w:val="21"/>
-          <w:szCs w:val="21"/>
-        </w:rPr>
-      </w:pPr>
-      <w:r>
-        <w:rPr>
-          <w:sz w:val="21"/>
-          <w:szCs w:val="21"/>
-        </w:rPr>
+        <w:t>, {position}</w:t>
+      </w:r>
+      <w:r>
+        <w:rPr>
+          <w:sz w:val="21"/>
+          <w:szCs w:val="21"/>
+        </w:rPr>
+        <w:br/>
         <w:t>{organization}, {location}</w:t>
       </w:r>
       <w:r>
@@ -1975,33 +1938,51 @@
     <w:p>
       <w:pPr>
         <w:spacing w:after="0" w:line="22" w:lineRule="atLeast"/>
-      </w:pPr>
-      <w:r>
-        <w:t>{#references_list}</w:t>
-      </w:r>
-    </w:p>
-    <w:p>
-      <w:pPr>
-        <w:spacing w:after="0" w:line="22" w:lineRule="atLeast"/>
-        <w:rPr>
-          <w:sz w:val="21"/>
-          <w:szCs w:val="21"/>
-        </w:rPr>
-      </w:pPr>
-      <w:r>
-        <w:rPr>
-          <w:sz w:val="21"/>
-          <w:szCs w:val="21"/>
-        </w:rPr>
+        <w:rPr>
+          <w:sz w:val="21"/>
+          <w:szCs w:val="21"/>
+        </w:rPr>
+      </w:pPr>
+      <w:r>
+        <w:rPr>
+          <w:sz w:val="21"/>
+          <w:szCs w:val="21"/>
+        </w:rPr>
+        <w:t>{/</w:t>
+      </w:r>
+      <w:proofErr w:type="spellStart"/>
+      <w:r>
+        <w:rPr>
+          <w:sz w:val="21"/>
+          <w:szCs w:val="21"/>
+        </w:rPr>
+        <w:t>references_list</w:t>
+      </w:r>
+      <w:proofErr w:type="spellEnd"/>
+      <w:r>
+        <w:rPr>
+          <w:sz w:val="21"/>
+          <w:szCs w:val="21"/>
+        </w:rPr>
+        <w:t>}</w:t>
+      </w:r>
+      <w:r>
+        <w:rPr>
+          <w:sz w:val="21"/>
+          <w:szCs w:val="21"/>
+        </w:rPr>
+        <w:br/>
         <w:t>{/HAS_REFERENCES_LIST}</w:t>
       </w:r>
-      <w:r>
-        <w:rPr>
-          <w:sz w:val="21"/>
-          <w:szCs w:val="21"/>
-        </w:rPr>
-        <w:br/>
-      </w:r>
+    </w:p>
+    <w:p>
+      <w:pPr>
+        <w:spacing w:after="0" w:line="22" w:lineRule="atLeast"/>
+        <w:rPr>
+          <w:sz w:val="21"/>
+          <w:szCs w:val="21"/>
+        </w:rPr>
+      </w:pPr>
       <w:r>
         <w:rPr>
           <w:sz w:val="21"/>
@@ -2013,21 +1994,18 @@
     <w:p>
       <w:pPr>
         <w:spacing w:after="0" w:line="22" w:lineRule="atLeast"/>
-      </w:pPr>
-      <w:r>
+        <w:rPr>
+          <w:sz w:val="21"/>
+          <w:szCs w:val="21"/>
+        </w:rPr>
+      </w:pPr>
+      <w:r>
+        <w:rPr>
+          <w:sz w:val="21"/>
+          <w:szCs w:val="21"/>
+        </w:rPr>
         <w:t>{/HAS_REFERENCE}</w:t>
       </w:r>
-    </w:p>
-    <w:p>
-      <w:pPr>
-        <w:spacing w:after="0" w:line="22" w:lineRule="atLeast"/>
-        <w:rPr>
-          <w:rFonts w:cs="Segoe UI"/>
-          <w:color w:val="1A2634"/>
-          <w:sz w:val="21"/>
-          <w:szCs w:val="21"/>
-        </w:rPr>
-      </w:pPr>
     </w:p>
     <w:sectPr>
       <w:pgSz w:w="11909" w:h="16834" w:code="9"/>
@@ -2448,7 +2426,6 @@
   <w:style w:type="character" w:default="1" w:styleId="DefaultParagraphFont">
     <w:name w:val="Default Paragraph Font"/>
     <w:uiPriority w:val="1"/>
-    <w:semiHidden/>
     <w:unhideWhenUsed/>
   </w:style>
   <w:style w:type="table" w:default="1" w:styleId="TableNormal">

</xml_diff>

<commit_message>
Fix DOCX spacing and conditional reference rendering
</commit_message>
<xml_diff>
--- a/templates/cv-template.docx
+++ b/templates/cv-template.docx
@@ -98,7 +98,7 @@
         <w:pBdr>
           <w:bottom w:val="single" w:sz="8" w:space="1" w:color="auto"/>
         </w:pBdr>
-        <w:spacing w:after="0"/>
+        <w:spacing w:before="200" w:after="0"/>
       </w:pPr>
       <w:r>
         <w:t>{#HAS_SKILLS}</w:t>
@@ -109,7 +109,7 @@
         <w:pBdr>
           <w:bottom w:val="single" w:sz="8" w:space="1" w:color="auto"/>
         </w:pBdr>
-        <w:spacing w:before="200" w:after="60"/>
+        <w:spacing w:after="60"/>
         <w:rPr>
           <w:rFonts w:cs="Segoe UI"/>
           <w:b/>
@@ -189,7 +189,7 @@
         <w:pBdr>
           <w:bottom w:val="single" w:sz="8" w:space="1" w:color="auto"/>
         </w:pBdr>
-        <w:spacing w:after="0"/>
+        <w:spacing w:before="200" w:after="0"/>
         <w:rPr>
           <w:sz w:val="21"/>
           <w:szCs w:val="21"/>
@@ -208,7 +208,7 @@
         <w:pBdr>
           <w:bottom w:val="single" w:sz="8" w:space="1" w:color="auto"/>
         </w:pBdr>
-        <w:spacing w:before="200" w:after="60"/>
+        <w:spacing w:after="60"/>
         <w:rPr>
           <w:rFonts w:cs="Segoe UI"/>
           <w:b/>
@@ -581,7 +581,7 @@
         <w:pBdr>
           <w:bottom w:val="single" w:sz="8" w:space="1" w:color="auto"/>
         </w:pBdr>
-        <w:spacing w:after="0"/>
+        <w:spacing w:before="200" w:after="0"/>
         <w:rPr>
           <w:sz w:val="21"/>
           <w:szCs w:val="21"/>
@@ -600,7 +600,7 @@
         <w:pBdr>
           <w:bottom w:val="single" w:sz="8" w:space="1" w:color="auto"/>
         </w:pBdr>
-        <w:spacing w:before="200" w:after="60"/>
+        <w:spacing w:after="60"/>
         <w:rPr>
           <w:rFonts w:cs="Segoe UI"/>
           <w:b/>
@@ -647,355 +647,355 @@
     <w:p>
       <w:pPr>
         <w:spacing w:after="0" w:line="22" w:lineRule="atLeast"/>
+        <w:rPr>
+          <w:sz w:val="21"/>
+          <w:szCs w:val="21"/>
+        </w:rPr>
+      </w:pPr>
+      <w:r>
+        <w:rPr>
+          <w:sz w:val="21"/>
+          <w:szCs w:val="21"/>
+        </w:rPr>
+        <w:t>{#projects}</w:t>
+      </w:r>
+    </w:p>
+    <w:p>
+      <w:pPr>
+        <w:spacing w:after="0" w:line="22" w:lineRule="atLeast"/>
+        <w:rPr>
+          <w:rFonts w:cs="Segoe UI"/>
+          <w:b/>
+          <w:bCs/>
+          <w:color w:val="1A2634"/>
+          <w:sz w:val="21"/>
+          <w:szCs w:val="21"/>
+        </w:rPr>
+      </w:pPr>
+      <w:r>
+        <w:rPr>
+          <w:rFonts w:cs="Segoe UI"/>
+          <w:b/>
+          <w:bCs/>
+          <w:color w:val="1A2634"/>
+          <w:sz w:val="21"/>
+          <w:szCs w:val="21"/>
+        </w:rPr>
+        <w:t>{</w:t>
+      </w:r>
+      <w:proofErr w:type="spellStart"/>
+      <w:r>
+        <w:rPr>
+          <w:rFonts w:cs="Segoe UI"/>
+          <w:b/>
+          <w:bCs/>
+          <w:color w:val="1A2634"/>
+          <w:sz w:val="21"/>
+          <w:szCs w:val="21"/>
+        </w:rPr>
+        <w:t>project_title</w:t>
+      </w:r>
+      <w:proofErr w:type="spellEnd"/>
+      <w:r>
+        <w:rPr>
+          <w:rFonts w:cs="Segoe UI"/>
+          <w:b/>
+          <w:bCs/>
+          <w:color w:val="1A2634"/>
+          <w:sz w:val="21"/>
+          <w:szCs w:val="21"/>
+        </w:rPr>
+        <w:t>}</w:t>
+      </w:r>
+    </w:p>
+    <w:p>
+      <w:pPr>
+        <w:spacing w:after="0" w:line="22" w:lineRule="atLeast"/>
+        <w:rPr>
+          <w:rFonts w:cs="Segoe UI"/>
+          <w:color w:val="1A2634"/>
+          <w:sz w:val="21"/>
+          <w:szCs w:val="21"/>
+        </w:rPr>
+      </w:pPr>
+      <w:r>
+        <w:rPr>
+          <w:rFonts w:cs="Segoe UI"/>
+          <w:color w:val="1A2634"/>
+          <w:sz w:val="21"/>
+          <w:szCs w:val="21"/>
+        </w:rPr>
+        <w:t>{#</w:t>
+      </w:r>
+      <w:proofErr w:type="gramStart"/>
+      <w:r>
+        <w:rPr>
+          <w:rFonts w:cs="Segoe UI"/>
+          <w:color w:val="1A2634"/>
+          <w:sz w:val="21"/>
+          <w:szCs w:val="21"/>
+        </w:rPr>
+        <w:t>start}{</w:t>
+      </w:r>
+      <w:proofErr w:type="gramEnd"/>
+      <w:r>
+        <w:rPr>
+          <w:rFonts w:cs="Segoe UI"/>
+          <w:color w:val="1A2634"/>
+          <w:sz w:val="21"/>
+          <w:szCs w:val="21"/>
+        </w:rPr>
+        <w:t>start}{/start}{#end_or_present} – {</w:t>
+      </w:r>
+      <w:proofErr w:type="spellStart"/>
+      <w:r>
+        <w:rPr>
+          <w:rFonts w:cs="Segoe UI"/>
+          <w:color w:val="1A2634"/>
+          <w:sz w:val="21"/>
+          <w:szCs w:val="21"/>
+        </w:rPr>
+        <w:t>end_or_present</w:t>
+      </w:r>
+      <w:proofErr w:type="spellEnd"/>
+      <w:r>
+        <w:rPr>
+          <w:rFonts w:cs="Segoe UI"/>
+          <w:color w:val="1A2634"/>
+          <w:sz w:val="21"/>
+          <w:szCs w:val="21"/>
+        </w:rPr>
+        <w:t>}{/</w:t>
+      </w:r>
+      <w:proofErr w:type="spellStart"/>
+      <w:r>
+        <w:rPr>
+          <w:rFonts w:cs="Segoe UI"/>
+          <w:color w:val="1A2634"/>
+          <w:sz w:val="21"/>
+          <w:szCs w:val="21"/>
+        </w:rPr>
+        <w:t>end_or_present</w:t>
+      </w:r>
+      <w:proofErr w:type="spellEnd"/>
+      <w:r>
+        <w:rPr>
+          <w:rFonts w:cs="Segoe UI"/>
+          <w:color w:val="1A2634"/>
+          <w:sz w:val="21"/>
+          <w:szCs w:val="21"/>
+        </w:rPr>
+        <w:t>}</w:t>
+      </w:r>
+    </w:p>
+    <w:p>
+      <w:pPr>
+        <w:spacing w:after="0" w:line="22" w:lineRule="atLeast"/>
+        <w:rPr>
+          <w:rFonts w:cs="Segoe UI"/>
+          <w:color w:val="1A2634"/>
+          <w:sz w:val="21"/>
+          <w:szCs w:val="21"/>
+        </w:rPr>
+      </w:pPr>
+      <w:r>
+        <w:rPr>
+          <w:rFonts w:cs="Segoe UI"/>
+          <w:color w:val="1A2634"/>
+          <w:sz w:val="21"/>
+          <w:szCs w:val="21"/>
+        </w:rPr>
+        <w:t>{#project_description}</w:t>
+      </w:r>
+    </w:p>
+    <w:p>
+      <w:pPr>
+        <w:spacing w:after="0" w:line="22" w:lineRule="atLeast"/>
+        <w:rPr>
+          <w:rFonts w:cs="Segoe UI"/>
+          <w:color w:val="1A2634"/>
+          <w:sz w:val="21"/>
+          <w:szCs w:val="21"/>
+        </w:rPr>
+      </w:pPr>
+      <w:r>
+        <w:rPr>
+          <w:rFonts w:cs="Segoe UI"/>
+          <w:color w:val="1A2634"/>
+          <w:sz w:val="21"/>
+          <w:szCs w:val="21"/>
+        </w:rPr>
+        <w:t>{</w:t>
+      </w:r>
+      <w:proofErr w:type="spellStart"/>
+      <w:r>
+        <w:rPr>
+          <w:rFonts w:cs="Segoe UI"/>
+          <w:color w:val="1A2634"/>
+          <w:sz w:val="21"/>
+          <w:szCs w:val="21"/>
+        </w:rPr>
+        <w:t>project_description</w:t>
+      </w:r>
+      <w:proofErr w:type="spellEnd"/>
+      <w:r>
+        <w:rPr>
+          <w:rFonts w:cs="Segoe UI"/>
+          <w:color w:val="1A2634"/>
+          <w:sz w:val="21"/>
+          <w:szCs w:val="21"/>
+        </w:rPr>
+        <w:t>}</w:t>
+      </w:r>
+    </w:p>
+    <w:p>
+      <w:pPr>
+        <w:spacing w:after="0" w:line="22" w:lineRule="atLeast"/>
+        <w:rPr>
+          <w:rFonts w:cs="Segoe UI"/>
+          <w:color w:val="1A2634"/>
+          <w:sz w:val="21"/>
+          <w:szCs w:val="21"/>
+        </w:rPr>
+      </w:pPr>
+      <w:r>
+        <w:rPr>
+          <w:rFonts w:cs="Segoe UI"/>
+          <w:color w:val="1A2634"/>
+          <w:sz w:val="21"/>
+          <w:szCs w:val="21"/>
+        </w:rPr>
+        <w:t>{/</w:t>
+      </w:r>
+      <w:proofErr w:type="spellStart"/>
+      <w:r>
+        <w:rPr>
+          <w:rFonts w:cs="Segoe UI"/>
+          <w:color w:val="1A2634"/>
+          <w:sz w:val="21"/>
+          <w:szCs w:val="21"/>
+        </w:rPr>
+        <w:t>project_description</w:t>
+      </w:r>
+      <w:proofErr w:type="spellEnd"/>
+      <w:r>
+        <w:rPr>
+          <w:rFonts w:cs="Segoe UI"/>
+          <w:color w:val="1A2634"/>
+          <w:sz w:val="21"/>
+          <w:szCs w:val="21"/>
+        </w:rPr>
+        <w:t>}</w:t>
+      </w:r>
+    </w:p>
+    <w:p>
+      <w:pPr>
+        <w:spacing w:after="0" w:line="22" w:lineRule="atLeast"/>
+        <w:rPr>
+          <w:rFonts w:cs="Segoe UI"/>
+          <w:color w:val="1A2634"/>
+          <w:sz w:val="21"/>
+          <w:szCs w:val="21"/>
+        </w:rPr>
+      </w:pPr>
+      <w:r>
+        <w:rPr>
+          <w:rFonts w:cs="Segoe UI"/>
+          <w:color w:val="1A2634"/>
+          <w:sz w:val="21"/>
+          <w:szCs w:val="21"/>
+        </w:rPr>
+        <w:t>{#project_tasks}</w:t>
+      </w:r>
+    </w:p>
+    <w:p>
+      <w:pPr>
+        <w:spacing w:after="0" w:line="22" w:lineRule="atLeast"/>
+        <w:ind w:left="360" w:hanging="360"/>
+        <w:rPr>
+          <w:rFonts w:cs="Segoe UI"/>
+          <w:color w:val="1A2634"/>
+          <w:sz w:val="21"/>
+          <w:szCs w:val="21"/>
+        </w:rPr>
+      </w:pPr>
+      <w:r>
+        <w:rPr>
+          <w:rFonts w:cs="Segoe UI"/>
+          <w:color w:val="1A2634"/>
+          <w:sz w:val="21"/>
+          <w:szCs w:val="21"/>
+        </w:rPr>
+        <w:t>• {.}</w:t>
+      </w:r>
+    </w:p>
+    <w:p>
+      <w:pPr>
+        <w:spacing w:after="0" w:line="22" w:lineRule="atLeast"/>
+        <w:ind w:left="360" w:hanging="360"/>
+        <w:rPr>
+          <w:rFonts w:cs="Segoe UI"/>
+          <w:color w:val="1A2634"/>
+          <w:sz w:val="21"/>
+          <w:szCs w:val="21"/>
+        </w:rPr>
+      </w:pPr>
+      <w:r>
+        <w:rPr>
+          <w:rFonts w:cs="Segoe UI"/>
+          <w:color w:val="1A2634"/>
+          <w:sz w:val="21"/>
+          <w:szCs w:val="21"/>
+        </w:rPr>
+        <w:t>{/</w:t>
+      </w:r>
+      <w:proofErr w:type="spellStart"/>
+      <w:r>
+        <w:rPr>
+          <w:rFonts w:cs="Segoe UI"/>
+          <w:color w:val="1A2634"/>
+          <w:sz w:val="21"/>
+          <w:szCs w:val="21"/>
+        </w:rPr>
+        <w:t>project_tasks</w:t>
+      </w:r>
+      <w:proofErr w:type="spellEnd"/>
+      <w:r>
+        <w:rPr>
+          <w:rFonts w:cs="Segoe UI"/>
+          <w:color w:val="1A2634"/>
+          <w:sz w:val="21"/>
+          <w:szCs w:val="21"/>
+        </w:rPr>
+        <w:t>}</w:t>
+      </w:r>
+    </w:p>
+    <w:p>
+      <w:pPr>
+        <w:spacing w:after="0" w:line="22" w:lineRule="atLeast"/>
+        <w:rPr>
+          <w:rFonts w:cs="Segoe UI"/>
+          <w:color w:val="1A2634"/>
+          <w:sz w:val="21"/>
+          <w:szCs w:val="21"/>
+        </w:rPr>
+      </w:pPr>
+      <w:r>
+        <w:rPr>
+          <w:rFonts w:cs="Segoe UI"/>
+          <w:color w:val="1A2634"/>
+          <w:sz w:val="21"/>
+          <w:szCs w:val="21"/>
+        </w:rPr>
+        <w:t>{/projects}</w:t>
+      </w:r>
+    </w:p>
+    <w:p>
+      <w:pPr>
+        <w:spacing w:after="0" w:line="22" w:lineRule="atLeast"/>
       </w:pPr>
       <w:r>
         <w:t>{/HAS_PROJECTS}</w:t>
-      </w:r>
-    </w:p>
-    <w:p>
-      <w:pPr>
-        <w:spacing w:after="0" w:line="22" w:lineRule="atLeast"/>
-        <w:rPr>
-          <w:sz w:val="21"/>
-          <w:szCs w:val="21"/>
-        </w:rPr>
-      </w:pPr>
-      <w:r>
-        <w:rPr>
-          <w:sz w:val="21"/>
-          <w:szCs w:val="21"/>
-        </w:rPr>
-        <w:t>{#projects}</w:t>
-      </w:r>
-    </w:p>
-    <w:p>
-      <w:pPr>
-        <w:spacing w:after="0" w:line="22" w:lineRule="atLeast"/>
-        <w:rPr>
-          <w:rFonts w:cs="Segoe UI"/>
-          <w:b/>
-          <w:bCs/>
-          <w:color w:val="1A2634"/>
-          <w:sz w:val="21"/>
-          <w:szCs w:val="21"/>
-        </w:rPr>
-      </w:pPr>
-      <w:r>
-        <w:rPr>
-          <w:rFonts w:cs="Segoe UI"/>
-          <w:b/>
-          <w:bCs/>
-          <w:color w:val="1A2634"/>
-          <w:sz w:val="21"/>
-          <w:szCs w:val="21"/>
-        </w:rPr>
-        <w:t>{</w:t>
-      </w:r>
-      <w:proofErr w:type="spellStart"/>
-      <w:r>
-        <w:rPr>
-          <w:rFonts w:cs="Segoe UI"/>
-          <w:b/>
-          <w:bCs/>
-          <w:color w:val="1A2634"/>
-          <w:sz w:val="21"/>
-          <w:szCs w:val="21"/>
-        </w:rPr>
-        <w:t>project_title</w:t>
-      </w:r>
-      <w:proofErr w:type="spellEnd"/>
-      <w:r>
-        <w:rPr>
-          <w:rFonts w:cs="Segoe UI"/>
-          <w:b/>
-          <w:bCs/>
-          <w:color w:val="1A2634"/>
-          <w:sz w:val="21"/>
-          <w:szCs w:val="21"/>
-        </w:rPr>
-        <w:t>}</w:t>
-      </w:r>
-    </w:p>
-    <w:p>
-      <w:pPr>
-        <w:spacing w:after="0" w:line="22" w:lineRule="atLeast"/>
-        <w:rPr>
-          <w:rFonts w:cs="Segoe UI"/>
-          <w:color w:val="1A2634"/>
-          <w:sz w:val="21"/>
-          <w:szCs w:val="21"/>
-        </w:rPr>
-      </w:pPr>
-      <w:r>
-        <w:rPr>
-          <w:rFonts w:cs="Segoe UI"/>
-          <w:color w:val="1A2634"/>
-          <w:sz w:val="21"/>
-          <w:szCs w:val="21"/>
-        </w:rPr>
-        <w:t>{#</w:t>
-      </w:r>
-      <w:proofErr w:type="gramStart"/>
-      <w:r>
-        <w:rPr>
-          <w:rFonts w:cs="Segoe UI"/>
-          <w:color w:val="1A2634"/>
-          <w:sz w:val="21"/>
-          <w:szCs w:val="21"/>
-        </w:rPr>
-        <w:t>start}{</w:t>
-      </w:r>
-      <w:proofErr w:type="gramEnd"/>
-      <w:r>
-        <w:rPr>
-          <w:rFonts w:cs="Segoe UI"/>
-          <w:color w:val="1A2634"/>
-          <w:sz w:val="21"/>
-          <w:szCs w:val="21"/>
-        </w:rPr>
-        <w:t>start}{/start}{#end_or_present} – {</w:t>
-      </w:r>
-      <w:proofErr w:type="spellStart"/>
-      <w:r>
-        <w:rPr>
-          <w:rFonts w:cs="Segoe UI"/>
-          <w:color w:val="1A2634"/>
-          <w:sz w:val="21"/>
-          <w:szCs w:val="21"/>
-        </w:rPr>
-        <w:t>end_or_present</w:t>
-      </w:r>
-      <w:proofErr w:type="spellEnd"/>
-      <w:r>
-        <w:rPr>
-          <w:rFonts w:cs="Segoe UI"/>
-          <w:color w:val="1A2634"/>
-          <w:sz w:val="21"/>
-          <w:szCs w:val="21"/>
-        </w:rPr>
-        <w:t>}{/</w:t>
-      </w:r>
-      <w:proofErr w:type="spellStart"/>
-      <w:r>
-        <w:rPr>
-          <w:rFonts w:cs="Segoe UI"/>
-          <w:color w:val="1A2634"/>
-          <w:sz w:val="21"/>
-          <w:szCs w:val="21"/>
-        </w:rPr>
-        <w:t>end_or_present</w:t>
-      </w:r>
-      <w:proofErr w:type="spellEnd"/>
-      <w:r>
-        <w:rPr>
-          <w:rFonts w:cs="Segoe UI"/>
-          <w:color w:val="1A2634"/>
-          <w:sz w:val="21"/>
-          <w:szCs w:val="21"/>
-        </w:rPr>
-        <w:t>}</w:t>
-      </w:r>
-    </w:p>
-    <w:p>
-      <w:pPr>
-        <w:spacing w:after="0" w:line="22" w:lineRule="atLeast"/>
-        <w:rPr>
-          <w:rFonts w:cs="Segoe UI"/>
-          <w:color w:val="1A2634"/>
-          <w:sz w:val="21"/>
-          <w:szCs w:val="21"/>
-        </w:rPr>
-      </w:pPr>
-      <w:r>
-        <w:rPr>
-          <w:rFonts w:cs="Segoe UI"/>
-          <w:color w:val="1A2634"/>
-          <w:sz w:val="21"/>
-          <w:szCs w:val="21"/>
-        </w:rPr>
-        <w:t>{#project_description}</w:t>
-      </w:r>
-    </w:p>
-    <w:p>
-      <w:pPr>
-        <w:spacing w:after="0" w:line="22" w:lineRule="atLeast"/>
-        <w:rPr>
-          <w:rFonts w:cs="Segoe UI"/>
-          <w:color w:val="1A2634"/>
-          <w:sz w:val="21"/>
-          <w:szCs w:val="21"/>
-        </w:rPr>
-      </w:pPr>
-      <w:r>
-        <w:rPr>
-          <w:rFonts w:cs="Segoe UI"/>
-          <w:color w:val="1A2634"/>
-          <w:sz w:val="21"/>
-          <w:szCs w:val="21"/>
-        </w:rPr>
-        <w:t>{</w:t>
-      </w:r>
-      <w:proofErr w:type="spellStart"/>
-      <w:r>
-        <w:rPr>
-          <w:rFonts w:cs="Segoe UI"/>
-          <w:color w:val="1A2634"/>
-          <w:sz w:val="21"/>
-          <w:szCs w:val="21"/>
-        </w:rPr>
-        <w:t>project_description</w:t>
-      </w:r>
-      <w:proofErr w:type="spellEnd"/>
-      <w:r>
-        <w:rPr>
-          <w:rFonts w:cs="Segoe UI"/>
-          <w:color w:val="1A2634"/>
-          <w:sz w:val="21"/>
-          <w:szCs w:val="21"/>
-        </w:rPr>
-        <w:t>}</w:t>
-      </w:r>
-    </w:p>
-    <w:p>
-      <w:pPr>
-        <w:spacing w:after="0" w:line="22" w:lineRule="atLeast"/>
-        <w:rPr>
-          <w:rFonts w:cs="Segoe UI"/>
-          <w:color w:val="1A2634"/>
-          <w:sz w:val="21"/>
-          <w:szCs w:val="21"/>
-        </w:rPr>
-      </w:pPr>
-      <w:r>
-        <w:rPr>
-          <w:rFonts w:cs="Segoe UI"/>
-          <w:color w:val="1A2634"/>
-          <w:sz w:val="21"/>
-          <w:szCs w:val="21"/>
-        </w:rPr>
-        <w:t>{/</w:t>
-      </w:r>
-      <w:proofErr w:type="spellStart"/>
-      <w:r>
-        <w:rPr>
-          <w:rFonts w:cs="Segoe UI"/>
-          <w:color w:val="1A2634"/>
-          <w:sz w:val="21"/>
-          <w:szCs w:val="21"/>
-        </w:rPr>
-        <w:t>project_description</w:t>
-      </w:r>
-      <w:proofErr w:type="spellEnd"/>
-      <w:r>
-        <w:rPr>
-          <w:rFonts w:cs="Segoe UI"/>
-          <w:color w:val="1A2634"/>
-          <w:sz w:val="21"/>
-          <w:szCs w:val="21"/>
-        </w:rPr>
-        <w:t>}</w:t>
-      </w:r>
-    </w:p>
-    <w:p>
-      <w:pPr>
-        <w:spacing w:after="0" w:line="22" w:lineRule="atLeast"/>
-        <w:rPr>
-          <w:rFonts w:cs="Segoe UI"/>
-          <w:color w:val="1A2634"/>
-          <w:sz w:val="21"/>
-          <w:szCs w:val="21"/>
-        </w:rPr>
-      </w:pPr>
-      <w:r>
-        <w:rPr>
-          <w:rFonts w:cs="Segoe UI"/>
-          <w:color w:val="1A2634"/>
-          <w:sz w:val="21"/>
-          <w:szCs w:val="21"/>
-        </w:rPr>
-        <w:t>{#project_tasks}</w:t>
-      </w:r>
-    </w:p>
-    <w:p>
-      <w:pPr>
-        <w:spacing w:after="0" w:line="22" w:lineRule="atLeast"/>
-        <w:ind w:left="360" w:hanging="360"/>
-        <w:rPr>
-          <w:rFonts w:cs="Segoe UI"/>
-          <w:color w:val="1A2634"/>
-          <w:sz w:val="21"/>
-          <w:szCs w:val="21"/>
-        </w:rPr>
-      </w:pPr>
-      <w:r>
-        <w:rPr>
-          <w:rFonts w:cs="Segoe UI"/>
-          <w:color w:val="1A2634"/>
-          <w:sz w:val="21"/>
-          <w:szCs w:val="21"/>
-        </w:rPr>
-        <w:t>• {.}</w:t>
-      </w:r>
-    </w:p>
-    <w:p>
-      <w:pPr>
-        <w:spacing w:after="0" w:line="22" w:lineRule="atLeast"/>
-        <w:ind w:left="360" w:hanging="360"/>
-        <w:rPr>
-          <w:rFonts w:cs="Segoe UI"/>
-          <w:color w:val="1A2634"/>
-          <w:sz w:val="21"/>
-          <w:szCs w:val="21"/>
-        </w:rPr>
-      </w:pPr>
-      <w:r>
-        <w:rPr>
-          <w:rFonts w:cs="Segoe UI"/>
-          <w:color w:val="1A2634"/>
-          <w:sz w:val="21"/>
-          <w:szCs w:val="21"/>
-        </w:rPr>
-        <w:t>{/</w:t>
-      </w:r>
-      <w:proofErr w:type="spellStart"/>
-      <w:r>
-        <w:rPr>
-          <w:rFonts w:cs="Segoe UI"/>
-          <w:color w:val="1A2634"/>
-          <w:sz w:val="21"/>
-          <w:szCs w:val="21"/>
-        </w:rPr>
-        <w:t>project_tasks</w:t>
-      </w:r>
-      <w:proofErr w:type="spellEnd"/>
-      <w:r>
-        <w:rPr>
-          <w:rFonts w:cs="Segoe UI"/>
-          <w:color w:val="1A2634"/>
-          <w:sz w:val="21"/>
-          <w:szCs w:val="21"/>
-        </w:rPr>
-        <w:t>}</w:t>
-      </w:r>
-    </w:p>
-    <w:p>
-      <w:pPr>
-        <w:spacing w:after="0" w:line="22" w:lineRule="atLeast"/>
-        <w:rPr>
-          <w:rFonts w:cs="Segoe UI"/>
-          <w:color w:val="1A2634"/>
-          <w:sz w:val="21"/>
-          <w:szCs w:val="21"/>
-        </w:rPr>
-      </w:pPr>
-      <w:r>
-        <w:rPr>
-          <w:rFonts w:cs="Segoe UI"/>
-          <w:color w:val="1A2634"/>
-          <w:sz w:val="21"/>
-          <w:szCs w:val="21"/>
-        </w:rPr>
-        <w:t>{/projects}</w:t>
       </w:r>
     </w:p>
     <w:p>
@@ -1003,7 +1003,7 @@
         <w:pBdr>
           <w:bottom w:val="single" w:sz="8" w:space="1" w:color="auto"/>
         </w:pBdr>
-        <w:spacing w:after="0"/>
+        <w:spacing w:before="200" w:after="0"/>
         <w:rPr>
           <w:sz w:val="21"/>
           <w:szCs w:val="21"/>
@@ -1022,7 +1022,7 @@
         <w:pBdr>
           <w:bottom w:val="single" w:sz="8" w:space="1" w:color="auto"/>
         </w:pBdr>
-        <w:spacing w:before="200" w:after="60"/>
+        <w:spacing w:after="60"/>
         <w:rPr>
           <w:rFonts w:cs="Segoe UI"/>
           <w:b/>
@@ -1368,7 +1368,28 @@
           <w:sz w:val="21"/>
           <w:szCs w:val="21"/>
         </w:rPr>
-        <w:t>• {.}{/tasks}</w:t>
+        <w:t>• {.}</w:t>
+      </w:r>
+    </w:p>
+    <w:p>
+      <w:pPr>
+        <w:spacing w:after="0" w:line="22" w:lineRule="atLeast"/>
+        <w:ind w:left="360" w:hanging="360"/>
+        <w:rPr>
+          <w:rFonts w:cs="Segoe UI"/>
+          <w:color w:val="1A2634"/>
+          <w:sz w:val="21"/>
+          <w:szCs w:val="21"/>
+        </w:rPr>
+      </w:pPr>
+      <w:r>
+        <w:rPr>
+          <w:rFonts w:cs="Segoe UI"/>
+          <w:color w:val="1A2634"/>
+          <w:sz w:val="21"/>
+          <w:szCs w:val="21"/>
+        </w:rPr>
+        <w:t>{/tasks}</w:t>
       </w:r>
     </w:p>
     <w:p>
@@ -1396,7 +1417,7 @@
         <w:pBdr>
           <w:bottom w:val="single" w:sz="8" w:space="1" w:color="auto"/>
         </w:pBdr>
-        <w:spacing w:after="0"/>
+        <w:spacing w:before="200" w:after="0"/>
         <w:rPr>
           <w:sz w:val="21"/>
           <w:szCs w:val="21"/>
@@ -1415,7 +1436,7 @@
         <w:pBdr>
           <w:bottom w:val="single" w:sz="8" w:space="1" w:color="auto"/>
         </w:pBdr>
-        <w:spacing w:before="200" w:after="120"/>
+        <w:spacing w:after="120"/>
         <w:rPr>
           <w:rFonts w:cs="Segoe UI"/>
           <w:b/>
@@ -1474,8 +1495,6 @@
         <w:spacing w:after="0" w:line="22" w:lineRule="atLeast"/>
         <w:ind w:left="360" w:hanging="360"/>
         <w:rPr>
-          <w:rFonts w:cs="Segoe UI"/>
-          <w:color w:val="1A2634"/>
           <w:sz w:val="21"/>
           <w:szCs w:val="21"/>
         </w:rPr>
@@ -1487,6 +1506,18 @@
         </w:rPr>
         <w:t>• {.}</w:t>
       </w:r>
+    </w:p>
+    <w:p>
+      <w:pPr>
+        <w:spacing w:after="0" w:line="22" w:lineRule="atLeast"/>
+        <w:ind w:left="360" w:hanging="360"/>
+        <w:rPr>
+          <w:rFonts w:cs="Segoe UI"/>
+          <w:color w:val="1A2634"/>
+          <w:sz w:val="21"/>
+          <w:szCs w:val="21"/>
+        </w:rPr>
+      </w:pPr>
       <w:r>
         <w:rPr>
           <w:rFonts w:cs="Segoe UI"/>
@@ -1502,7 +1533,7 @@
         <w:pBdr>
           <w:bottom w:val="single" w:sz="8" w:space="1" w:color="auto"/>
         </w:pBdr>
-        <w:spacing w:after="0"/>
+        <w:spacing w:before="200" w:after="0"/>
         <w:rPr>
           <w:sz w:val="21"/>
           <w:szCs w:val="21"/>
@@ -1521,7 +1552,7 @@
         <w:pBdr>
           <w:bottom w:val="single" w:sz="8" w:space="1" w:color="auto"/>
         </w:pBdr>
-        <w:spacing w:before="200" w:after="120"/>
+        <w:spacing w:after="120"/>
         <w:rPr>
           <w:rFonts w:cs="Segoe UI"/>
           <w:b/>
@@ -1561,24 +1592,6 @@
           <w:sz w:val="21"/>
           <w:szCs w:val="21"/>
         </w:rPr>
-        <w:t>{/HAS_EXTRA}</w:t>
-      </w:r>
-      <w:r>
-        <w:rPr>
-          <w:rFonts w:cs="Segoe UI"/>
-          <w:color w:val="1A2634"/>
-          <w:sz w:val="21"/>
-          <w:szCs w:val="21"/>
-        </w:rPr>
-        <w:br/>
-      </w:r>
-      <w:r>
-        <w:rPr>
-          <w:rFonts w:cs="Segoe UI"/>
-          <w:color w:val="1A2634"/>
-          <w:sz w:val="21"/>
-          <w:szCs w:val="21"/>
-        </w:rPr>
         <w:t>{#extra_sections}</w:t>
       </w:r>
     </w:p>
@@ -1826,7 +1839,7 @@
     </w:p>
     <w:p>
       <w:pPr>
-        <w:spacing w:after="0" w:line="22" w:lineRule="atLeast"/>
+        <w:spacing w:before="200" w:after="0" w:line="22" w:lineRule="atLeast"/>
         <w:rPr>
           <w:rFonts w:cs="Segoe UI"/>
           <w:color w:val="1A2634"/>
@@ -1849,7 +1862,7 @@
         <w:pBdr>
           <w:bottom w:val="single" w:sz="8" w:space="1" w:color="auto"/>
         </w:pBdr>
-        <w:spacing w:before="200" w:after="60"/>
+        <w:spacing w:after="60"/>
         <w:rPr>
           <w:rFonts w:cs="Segoe UI"/>
           <w:b/>
@@ -1988,8 +2001,24 @@
           <w:sz w:val="21"/>
           <w:szCs w:val="21"/>
         </w:rPr>
+        <w:t>{^HAS_REFERENCES_LIST}</w:t>
+      </w:r>
+      <w:r>
+        <w:rPr>
+          <w:sz w:val="21"/>
+          <w:szCs w:val="21"/>
+        </w:rPr>
+        <w:br/>
         <w:t>{REFERENCE_SECTION}</w:t>
       </w:r>
+      <w:r>
+        <w:rPr>
+          <w:sz w:val="21"/>
+          <w:szCs w:val="21"/>
+        </w:rPr>
+        <w:br/>
+        <w:t>{/HAS_REFERENCES_LIST}</w:t>
+      </w:r>
     </w:p>
     <w:p>
       <w:pPr>
@@ -2006,6 +2035,15 @@
         </w:rPr>
         <w:t>{/HAS_REFERENCE}</w:t>
       </w:r>
+    </w:p>
+    <w:p>
+      <w:pPr>
+        <w:spacing w:after="0" w:line="22" w:lineRule="atLeast"/>
+        <w:rPr>
+          <w:sz w:val="21"/>
+          <w:szCs w:val="21"/>
+        </w:rPr>
+      </w:pPr>
     </w:p>
     <w:sectPr>
       <w:pgSz w:w="11909" w:h="16834" w:code="9"/>
@@ -2426,6 +2464,7 @@
   <w:style w:type="character" w:default="1" w:styleId="DefaultParagraphFont">
     <w:name w:val="Default Paragraph Font"/>
     <w:uiPriority w:val="1"/>
+    <w:semiHidden/>
     <w:unhideWhenUsed/>
   </w:style>
   <w:style w:type="table" w:default="1" w:styleId="TableNormal">

</xml_diff>

<commit_message>
Fix HAS_EXTRA loop in CV template
</commit_message>
<xml_diff>
--- a/templates/cv-template.docx
+++ b/templates/cv-template.docx
@@ -340,67 +340,7 @@
           <w:sz w:val="21"/>
           <w:szCs w:val="21"/>
         </w:rPr>
-        <w:t>{#</w:t>
-      </w:r>
-      <w:proofErr w:type="gramStart"/>
-      <w:r>
-        <w:rPr>
-          <w:rFonts w:cs="Segoe UI"/>
-          <w:color w:val="1A2634"/>
-          <w:sz w:val="21"/>
-          <w:szCs w:val="21"/>
-        </w:rPr>
-        <w:t>start}{</w:t>
-      </w:r>
-      <w:proofErr w:type="gramEnd"/>
-      <w:r>
-        <w:rPr>
-          <w:rFonts w:cs="Segoe UI"/>
-          <w:color w:val="1A2634"/>
-          <w:sz w:val="21"/>
-          <w:szCs w:val="21"/>
-        </w:rPr>
-        <w:t>start}{/start}{#end_or_present} – {</w:t>
-      </w:r>
-      <w:proofErr w:type="spellStart"/>
-      <w:r>
-        <w:rPr>
-          <w:rFonts w:cs="Segoe UI"/>
-          <w:color w:val="1A2634"/>
-          <w:sz w:val="21"/>
-          <w:szCs w:val="21"/>
-        </w:rPr>
-        <w:t>end_or_present</w:t>
-      </w:r>
-      <w:proofErr w:type="spellEnd"/>
-      <w:r>
-        <w:rPr>
-          <w:rFonts w:cs="Segoe UI"/>
-          <w:color w:val="1A2634"/>
-          <w:sz w:val="21"/>
-          <w:szCs w:val="21"/>
-        </w:rPr>
-        <w:t>}{/</w:t>
-      </w:r>
-      <w:proofErr w:type="spellStart"/>
-      <w:r>
-        <w:rPr>
-          <w:rFonts w:cs="Segoe UI"/>
-          <w:color w:val="1A2634"/>
-          <w:sz w:val="21"/>
-          <w:szCs w:val="21"/>
-        </w:rPr>
-        <w:t>end_or_present</w:t>
-      </w:r>
-      <w:proofErr w:type="spellEnd"/>
-      <w:r>
-        <w:rPr>
-          <w:rFonts w:cs="Segoe UI"/>
-          <w:color w:val="1A2634"/>
-          <w:sz w:val="21"/>
-          <w:szCs w:val="21"/>
-        </w:rPr>
-        <w:t>}</w:t>
+        <w:t>{#start}{start}{/start}{#end_or_present} – {end_or_present}{/end_or_present}</w:t>
       </w:r>
     </w:p>
     <w:p>
@@ -450,27 +390,7 @@
           <w:sz w:val="21"/>
           <w:szCs w:val="21"/>
         </w:rPr>
-        <w:t>{/</w:t>
-      </w:r>
-      <w:proofErr w:type="spellStart"/>
-      <w:r>
-        <w:rPr>
-          <w:rFonts w:cs="Segoe UI"/>
-          <w:color w:val="1A2634"/>
-          <w:sz w:val="21"/>
-          <w:szCs w:val="21"/>
-        </w:rPr>
-        <w:t>edu_competencies</w:t>
-      </w:r>
-      <w:proofErr w:type="spellEnd"/>
-      <w:r>
-        <w:rPr>
-          <w:rFonts w:cs="Segoe UI"/>
-          <w:color w:val="1A2634"/>
-          <w:sz w:val="21"/>
-          <w:szCs w:val="21"/>
-        </w:rPr>
-        <w:t>}</w:t>
+        <w:t>{/edu_competencies}</w:t>
       </w:r>
     </w:p>
     <w:p>
@@ -491,27 +411,7 @@
           <w:sz w:val="21"/>
           <w:szCs w:val="21"/>
         </w:rPr>
-        <w:t>{#edu_</w:t>
-      </w:r>
-      <w:proofErr w:type="gramStart"/>
-      <w:r>
-        <w:rPr>
-          <w:rFonts w:cs="Segoe UI"/>
-          <w:color w:val="1A2634"/>
-          <w:sz w:val="21"/>
-          <w:szCs w:val="21"/>
-        </w:rPr>
-        <w:t>detail}{</w:t>
-      </w:r>
-      <w:proofErr w:type="gramEnd"/>
-      <w:r>
-        <w:rPr>
-          <w:rFonts w:cs="Segoe UI"/>
-          <w:color w:val="1A2634"/>
-          <w:sz w:val="21"/>
-          <w:szCs w:val="21"/>
-        </w:rPr>
-        <w:t>edu_detail}</w:t>
+        <w:t>{#edu_detail}{edu_detail}</w:t>
       </w:r>
     </w:p>
     <w:p>
@@ -532,27 +432,7 @@
           <w:sz w:val="21"/>
           <w:szCs w:val="21"/>
         </w:rPr>
-        <w:t>{/</w:t>
-      </w:r>
-      <w:proofErr w:type="spellStart"/>
-      <w:r>
-        <w:rPr>
-          <w:rFonts w:cs="Segoe UI"/>
-          <w:color w:val="1A2634"/>
-          <w:sz w:val="21"/>
-          <w:szCs w:val="21"/>
-        </w:rPr>
-        <w:t>edu_detail</w:t>
-      </w:r>
-      <w:proofErr w:type="spellEnd"/>
-      <w:r>
-        <w:rPr>
-          <w:rFonts w:cs="Segoe UI"/>
-          <w:color w:val="1A2634"/>
-          <w:sz w:val="21"/>
-          <w:szCs w:val="21"/>
-        </w:rPr>
-        <w:t>}</w:t>
+        <w:t>{/edu_detail}</w:t>
       </w:r>
     </w:p>
     <w:p>
@@ -681,111 +561,27 @@
           <w:sz w:val="21"/>
           <w:szCs w:val="21"/>
         </w:rPr>
-        <w:t>{</w:t>
-      </w:r>
-      <w:proofErr w:type="spellStart"/>
-      <w:r>
-        <w:rPr>
-          <w:rFonts w:cs="Segoe UI"/>
-          <w:b/>
-          <w:bCs/>
-          <w:color w:val="1A2634"/>
-          <w:sz w:val="21"/>
-          <w:szCs w:val="21"/>
-        </w:rPr>
-        <w:t>project_title</w:t>
-      </w:r>
-      <w:proofErr w:type="spellEnd"/>
-      <w:r>
-        <w:rPr>
-          <w:rFonts w:cs="Segoe UI"/>
-          <w:b/>
-          <w:bCs/>
-          <w:color w:val="1A2634"/>
-          <w:sz w:val="21"/>
-          <w:szCs w:val="21"/>
-        </w:rPr>
-        <w:t>}</w:t>
-      </w:r>
-    </w:p>
-    <w:p>
-      <w:pPr>
-        <w:spacing w:after="0" w:line="22" w:lineRule="atLeast"/>
-        <w:rPr>
-          <w:rFonts w:cs="Segoe UI"/>
-          <w:color w:val="1A2634"/>
-          <w:sz w:val="21"/>
-          <w:szCs w:val="21"/>
-        </w:rPr>
-      </w:pPr>
-      <w:r>
-        <w:rPr>
-          <w:rFonts w:cs="Segoe UI"/>
-          <w:color w:val="1A2634"/>
-          <w:sz w:val="21"/>
-          <w:szCs w:val="21"/>
-        </w:rPr>
-        <w:t>{#</w:t>
-      </w:r>
-      <w:proofErr w:type="gramStart"/>
-      <w:r>
-        <w:rPr>
-          <w:rFonts w:cs="Segoe UI"/>
-          <w:color w:val="1A2634"/>
-          <w:sz w:val="21"/>
-          <w:szCs w:val="21"/>
-        </w:rPr>
-        <w:t>start}{</w:t>
-      </w:r>
-      <w:proofErr w:type="gramEnd"/>
-      <w:r>
-        <w:rPr>
-          <w:rFonts w:cs="Segoe UI"/>
-          <w:color w:val="1A2634"/>
-          <w:sz w:val="21"/>
-          <w:szCs w:val="21"/>
-        </w:rPr>
-        <w:t>start}{/start}{#end_or_present} – {</w:t>
-      </w:r>
-      <w:proofErr w:type="spellStart"/>
-      <w:r>
-        <w:rPr>
-          <w:rFonts w:cs="Segoe UI"/>
-          <w:color w:val="1A2634"/>
-          <w:sz w:val="21"/>
-          <w:szCs w:val="21"/>
-        </w:rPr>
-        <w:t>end_or_present</w:t>
-      </w:r>
-      <w:proofErr w:type="spellEnd"/>
-      <w:r>
-        <w:rPr>
-          <w:rFonts w:cs="Segoe UI"/>
-          <w:color w:val="1A2634"/>
-          <w:sz w:val="21"/>
-          <w:szCs w:val="21"/>
-        </w:rPr>
-        <w:t>}{/</w:t>
-      </w:r>
-      <w:proofErr w:type="spellStart"/>
-      <w:r>
-        <w:rPr>
-          <w:rFonts w:cs="Segoe UI"/>
-          <w:color w:val="1A2634"/>
-          <w:sz w:val="21"/>
-          <w:szCs w:val="21"/>
-        </w:rPr>
-        <w:t>end_or_present</w:t>
-      </w:r>
-      <w:proofErr w:type="spellEnd"/>
-      <w:r>
-        <w:rPr>
-          <w:rFonts w:cs="Segoe UI"/>
-          <w:color w:val="1A2634"/>
-          <w:sz w:val="21"/>
-          <w:szCs w:val="21"/>
-        </w:rPr>
-        <w:t>}</w:t>
+        <w:t>{project_title}</w:t>
+      </w:r>
+    </w:p>
+    <w:p>
+      <w:pPr>
+        <w:spacing w:after="0" w:line="22" w:lineRule="atLeast"/>
+        <w:rPr>
+          <w:rFonts w:cs="Segoe UI"/>
+          <w:color w:val="1A2634"/>
+          <w:sz w:val="21"/>
+          <w:szCs w:val="21"/>
+        </w:rPr>
+      </w:pPr>
+      <w:r>
+        <w:rPr>
+          <w:rFonts w:cs="Segoe UI"/>
+          <w:color w:val="1A2634"/>
+          <w:sz w:val="21"/>
+          <w:szCs w:val="21"/>
+        </w:rPr>
+        <w:t>{#start}{start}{/start}{#end_or_present} – {end_or_present}{/end_or_present}</w:t>
       </w:r>
     </w:p>
     <w:p>
@@ -825,67 +621,27 @@
           <w:sz w:val="21"/>
           <w:szCs w:val="21"/>
         </w:rPr>
-        <w:t>{</w:t>
-      </w:r>
-      <w:proofErr w:type="spellStart"/>
-      <w:r>
-        <w:rPr>
-          <w:rFonts w:cs="Segoe UI"/>
-          <w:color w:val="1A2634"/>
-          <w:sz w:val="21"/>
-          <w:szCs w:val="21"/>
-        </w:rPr>
-        <w:t>project_description</w:t>
-      </w:r>
-      <w:proofErr w:type="spellEnd"/>
-      <w:r>
-        <w:rPr>
-          <w:rFonts w:cs="Segoe UI"/>
-          <w:color w:val="1A2634"/>
-          <w:sz w:val="21"/>
-          <w:szCs w:val="21"/>
-        </w:rPr>
-        <w:t>}</w:t>
-      </w:r>
-    </w:p>
-    <w:p>
-      <w:pPr>
-        <w:spacing w:after="0" w:line="22" w:lineRule="atLeast"/>
-        <w:rPr>
-          <w:rFonts w:cs="Segoe UI"/>
-          <w:color w:val="1A2634"/>
-          <w:sz w:val="21"/>
-          <w:szCs w:val="21"/>
-        </w:rPr>
-      </w:pPr>
-      <w:r>
-        <w:rPr>
-          <w:rFonts w:cs="Segoe UI"/>
-          <w:color w:val="1A2634"/>
-          <w:sz w:val="21"/>
-          <w:szCs w:val="21"/>
-        </w:rPr>
-        <w:t>{/</w:t>
-      </w:r>
-      <w:proofErr w:type="spellStart"/>
-      <w:r>
-        <w:rPr>
-          <w:rFonts w:cs="Segoe UI"/>
-          <w:color w:val="1A2634"/>
-          <w:sz w:val="21"/>
-          <w:szCs w:val="21"/>
-        </w:rPr>
-        <w:t>project_description</w:t>
-      </w:r>
-      <w:proofErr w:type="spellEnd"/>
-      <w:r>
-        <w:rPr>
-          <w:rFonts w:cs="Segoe UI"/>
-          <w:color w:val="1A2634"/>
-          <w:sz w:val="21"/>
-          <w:szCs w:val="21"/>
-        </w:rPr>
-        <w:t>}</w:t>
+        <w:t>{project_description}</w:t>
+      </w:r>
+    </w:p>
+    <w:p>
+      <w:pPr>
+        <w:spacing w:after="0" w:line="22" w:lineRule="atLeast"/>
+        <w:rPr>
+          <w:rFonts w:cs="Segoe UI"/>
+          <w:color w:val="1A2634"/>
+          <w:sz w:val="21"/>
+          <w:szCs w:val="21"/>
+        </w:rPr>
+      </w:pPr>
+      <w:r>
+        <w:rPr>
+          <w:rFonts w:cs="Segoe UI"/>
+          <w:color w:val="1A2634"/>
+          <w:sz w:val="21"/>
+          <w:szCs w:val="21"/>
+        </w:rPr>
+        <w:t>{/project_description}</w:t>
       </w:r>
     </w:p>
     <w:p>
@@ -947,27 +703,7 @@
           <w:sz w:val="21"/>
           <w:szCs w:val="21"/>
         </w:rPr>
-        <w:t>{/</w:t>
-      </w:r>
-      <w:proofErr w:type="spellStart"/>
-      <w:r>
-        <w:rPr>
-          <w:rFonts w:cs="Segoe UI"/>
-          <w:color w:val="1A2634"/>
-          <w:sz w:val="21"/>
-          <w:szCs w:val="21"/>
-        </w:rPr>
-        <w:t>project_tasks</w:t>
-      </w:r>
-      <w:proofErr w:type="spellEnd"/>
-      <w:r>
-        <w:rPr>
-          <w:rFonts w:cs="Segoe UI"/>
-          <w:color w:val="1A2634"/>
-          <w:sz w:val="21"/>
-          <w:szCs w:val="21"/>
-        </w:rPr>
-        <w:t>}</w:t>
+        <w:t>{/project_tasks}</w:t>
       </w:r>
     </w:p>
     <w:p>
@@ -1166,67 +902,7 @@
           <w:sz w:val="21"/>
           <w:szCs w:val="21"/>
         </w:rPr>
-        <w:t>{#</w:t>
-      </w:r>
-      <w:proofErr w:type="gramStart"/>
-      <w:r>
-        <w:rPr>
-          <w:rFonts w:cs="Segoe UI"/>
-          <w:color w:val="1A2634"/>
-          <w:sz w:val="21"/>
-          <w:szCs w:val="21"/>
-        </w:rPr>
-        <w:t>start}{</w:t>
-      </w:r>
-      <w:proofErr w:type="gramEnd"/>
-      <w:r>
-        <w:rPr>
-          <w:rFonts w:cs="Segoe UI"/>
-          <w:color w:val="1A2634"/>
-          <w:sz w:val="21"/>
-          <w:szCs w:val="21"/>
-        </w:rPr>
-        <w:t>start}{/start}{#end_or_present} – {</w:t>
-      </w:r>
-      <w:proofErr w:type="spellStart"/>
-      <w:r>
-        <w:rPr>
-          <w:rFonts w:cs="Segoe UI"/>
-          <w:color w:val="1A2634"/>
-          <w:sz w:val="21"/>
-          <w:szCs w:val="21"/>
-        </w:rPr>
-        <w:t>end_or_present</w:t>
-      </w:r>
-      <w:proofErr w:type="spellEnd"/>
-      <w:r>
-        <w:rPr>
-          <w:rFonts w:cs="Segoe UI"/>
-          <w:color w:val="1A2634"/>
-          <w:sz w:val="21"/>
-          <w:szCs w:val="21"/>
-        </w:rPr>
-        <w:t>}{/</w:t>
-      </w:r>
-      <w:proofErr w:type="spellStart"/>
-      <w:r>
-        <w:rPr>
-          <w:rFonts w:cs="Segoe UI"/>
-          <w:color w:val="1A2634"/>
-          <w:sz w:val="21"/>
-          <w:szCs w:val="21"/>
-        </w:rPr>
-        <w:t>end_or_present</w:t>
-      </w:r>
-      <w:proofErr w:type="spellEnd"/>
-      <w:r>
-        <w:rPr>
-          <w:rFonts w:cs="Segoe UI"/>
-          <w:color w:val="1A2634"/>
-          <w:sz w:val="21"/>
-          <w:szCs w:val="21"/>
-        </w:rPr>
-        <w:t>}</w:t>
+        <w:t>{#start}{start}{/start}{#end_or_present} – {end_or_present}{/end_or_present}</w:t>
       </w:r>
     </w:p>
     <w:p>
@@ -1267,67 +943,27 @@
           <w:szCs w:val="21"/>
         </w:rPr>
         <w:lastRenderedPageBreak/>
-        <w:t>{</w:t>
-      </w:r>
-      <w:proofErr w:type="spellStart"/>
-      <w:r>
-        <w:rPr>
-          <w:rFonts w:cs="Segoe UI"/>
-          <w:color w:val="1A2634"/>
-          <w:sz w:val="21"/>
-          <w:szCs w:val="21"/>
-        </w:rPr>
-        <w:t>role_summary</w:t>
-      </w:r>
-      <w:proofErr w:type="spellEnd"/>
-      <w:r>
-        <w:rPr>
-          <w:rFonts w:cs="Segoe UI"/>
-          <w:color w:val="1A2634"/>
-          <w:sz w:val="21"/>
-          <w:szCs w:val="21"/>
-        </w:rPr>
-        <w:t>}</w:t>
-      </w:r>
-    </w:p>
-    <w:p>
-      <w:pPr>
-        <w:spacing w:after="0" w:line="22" w:lineRule="atLeast"/>
-        <w:rPr>
-          <w:rFonts w:cs="Segoe UI"/>
-          <w:color w:val="1A2634"/>
-          <w:sz w:val="21"/>
-          <w:szCs w:val="21"/>
-        </w:rPr>
-      </w:pPr>
-      <w:r>
-        <w:rPr>
-          <w:rFonts w:cs="Segoe UI"/>
-          <w:color w:val="1A2634"/>
-          <w:sz w:val="21"/>
-          <w:szCs w:val="21"/>
-        </w:rPr>
-        <w:t>{/</w:t>
-      </w:r>
-      <w:proofErr w:type="spellStart"/>
-      <w:r>
-        <w:rPr>
-          <w:rFonts w:cs="Segoe UI"/>
-          <w:color w:val="1A2634"/>
-          <w:sz w:val="21"/>
-          <w:szCs w:val="21"/>
-        </w:rPr>
-        <w:t>role_summary</w:t>
-      </w:r>
-      <w:proofErr w:type="spellEnd"/>
-      <w:r>
-        <w:rPr>
-          <w:rFonts w:cs="Segoe UI"/>
-          <w:color w:val="1A2634"/>
-          <w:sz w:val="21"/>
-          <w:szCs w:val="21"/>
-        </w:rPr>
-        <w:t>}</w:t>
+        <w:t>{role_summary}</w:t>
+      </w:r>
+    </w:p>
+    <w:p>
+      <w:pPr>
+        <w:spacing w:after="0" w:line="22" w:lineRule="atLeast"/>
+        <w:rPr>
+          <w:rFonts w:cs="Segoe UI"/>
+          <w:color w:val="1A2634"/>
+          <w:sz w:val="21"/>
+          <w:szCs w:val="21"/>
+        </w:rPr>
+      </w:pPr>
+      <w:r>
+        <w:rPr>
+          <w:rFonts w:cs="Segoe UI"/>
+          <w:color w:val="1A2634"/>
+          <w:sz w:val="21"/>
+          <w:szCs w:val="21"/>
+        </w:rPr>
+        <w:t>{/role_summary}</w:t>
       </w:r>
     </w:p>
     <w:p>
@@ -1577,15 +1213,23 @@
     <w:p>
       <w:pPr>
         <w:spacing w:after="0" w:line="22" w:lineRule="atLeast"/>
-        <w:rPr>
-          <w:rFonts w:cs="Segoe UI"/>
-          <w:color w:val="1A2634"/>
-          <w:sz w:val="21"/>
-          <w:szCs w:val="21"/>
-        </w:rPr>
       </w:pPr>
       <w:bookmarkStart w:id="0" w:name="_Hlk230844847"/>
       <w:r>
+        <w:t>{/HAS_EXTRA}</w:t>
+      </w:r>
+    </w:p>
+    <w:p>
+      <w:pPr>
+        <w:spacing w:after="0" w:line="22" w:lineRule="atLeast"/>
+        <w:rPr>
+          <w:rFonts w:cs="Segoe UI"/>
+          <w:color w:val="1A2634"/>
+          <w:sz w:val="21"/>
+          <w:szCs w:val="21"/>
+        </w:rPr>
+      </w:pPr>
+      <w:r>
         <w:rPr>
           <w:rFonts w:cs="Segoe UI"/>
           <w:color w:val="1A2634"/>
@@ -1612,27 +1256,7 @@
           <w:sz w:val="21"/>
           <w:szCs w:val="21"/>
         </w:rPr>
-        <w:t>{</w:t>
-      </w:r>
-      <w:proofErr w:type="spellStart"/>
-      <w:r>
-        <w:rPr>
-          <w:rFonts w:cs="Segoe UI"/>
-          <w:color w:val="1A2634"/>
-          <w:sz w:val="21"/>
-          <w:szCs w:val="21"/>
-        </w:rPr>
-        <w:t>section_title</w:t>
-      </w:r>
-      <w:proofErr w:type="spellEnd"/>
-      <w:r>
-        <w:rPr>
-          <w:rFonts w:cs="Segoe UI"/>
-          <w:color w:val="1A2634"/>
-          <w:sz w:val="21"/>
-          <w:szCs w:val="21"/>
-        </w:rPr>
-        <w:t>}</w:t>
+        <w:t>{section_title}</w:t>
       </w:r>
     </w:p>
     <w:p>
@@ -1734,107 +1358,47 @@
           <w:sz w:val="21"/>
           <w:szCs w:val="21"/>
         </w:rPr>
-        <w:t>{</w:t>
-      </w:r>
-      <w:proofErr w:type="spellStart"/>
-      <w:r>
-        <w:rPr>
-          <w:rFonts w:cs="Segoe UI"/>
-          <w:color w:val="1A2634"/>
-          <w:sz w:val="21"/>
-          <w:szCs w:val="21"/>
-        </w:rPr>
-        <w:t>section_content</w:t>
-      </w:r>
-      <w:proofErr w:type="spellEnd"/>
-      <w:r>
-        <w:rPr>
-          <w:rFonts w:cs="Segoe UI"/>
-          <w:color w:val="1A2634"/>
-          <w:sz w:val="21"/>
-          <w:szCs w:val="21"/>
-        </w:rPr>
-        <w:t>}</w:t>
-      </w:r>
-    </w:p>
-    <w:p>
-      <w:pPr>
-        <w:spacing w:after="0" w:line="22" w:lineRule="atLeast"/>
-        <w:rPr>
-          <w:rFonts w:cs="Segoe UI"/>
-          <w:color w:val="1A2634"/>
-          <w:sz w:val="21"/>
-          <w:szCs w:val="21"/>
-        </w:rPr>
-      </w:pPr>
-      <w:r>
-        <w:rPr>
-          <w:rFonts w:cs="Segoe UI"/>
-          <w:color w:val="1A2634"/>
-          <w:sz w:val="21"/>
-          <w:szCs w:val="21"/>
-        </w:rPr>
-        <w:t>{/</w:t>
-      </w:r>
-      <w:proofErr w:type="spellStart"/>
-      <w:r>
-        <w:rPr>
-          <w:rFonts w:cs="Segoe UI"/>
-          <w:color w:val="1A2634"/>
-          <w:sz w:val="21"/>
-          <w:szCs w:val="21"/>
-        </w:rPr>
-        <w:t>section_content</w:t>
-      </w:r>
-      <w:proofErr w:type="spellEnd"/>
-      <w:r>
-        <w:rPr>
-          <w:rFonts w:cs="Segoe UI"/>
-          <w:color w:val="1A2634"/>
-          <w:sz w:val="21"/>
-          <w:szCs w:val="21"/>
-        </w:rPr>
-        <w:t>}</w:t>
-      </w:r>
-    </w:p>
-    <w:p>
-      <w:pPr>
-        <w:spacing w:after="0" w:line="22" w:lineRule="atLeast"/>
-        <w:rPr>
-          <w:rFonts w:cs="Segoe UI"/>
-          <w:color w:val="1A2634"/>
-          <w:sz w:val="21"/>
-          <w:szCs w:val="21"/>
-        </w:rPr>
-      </w:pPr>
-      <w:r>
-        <w:rPr>
-          <w:rFonts w:cs="Segoe UI"/>
-          <w:color w:val="1A2634"/>
-          <w:sz w:val="21"/>
-          <w:szCs w:val="21"/>
-        </w:rPr>
-        <w:t>{/</w:t>
-      </w:r>
-      <w:proofErr w:type="spellStart"/>
-      <w:r>
-        <w:rPr>
-          <w:rFonts w:cs="Segoe UI"/>
-          <w:color w:val="1A2634"/>
-          <w:sz w:val="21"/>
-          <w:szCs w:val="21"/>
-        </w:rPr>
-        <w:t>extra_sections</w:t>
-      </w:r>
-      <w:proofErr w:type="spellEnd"/>
-      <w:r>
-        <w:rPr>
-          <w:rFonts w:cs="Segoe UI"/>
-          <w:color w:val="1A2634"/>
-          <w:sz w:val="21"/>
-          <w:szCs w:val="21"/>
-        </w:rPr>
-        <w:t>}</w:t>
+        <w:t>{section_content}</w:t>
+      </w:r>
+    </w:p>
+    <w:p>
+      <w:pPr>
+        <w:spacing w:after="0" w:line="22" w:lineRule="atLeast"/>
+        <w:rPr>
+          <w:rFonts w:cs="Segoe UI"/>
+          <w:color w:val="1A2634"/>
+          <w:sz w:val="21"/>
+          <w:szCs w:val="21"/>
+        </w:rPr>
+      </w:pPr>
+      <w:r>
+        <w:rPr>
+          <w:rFonts w:cs="Segoe UI"/>
+          <w:color w:val="1A2634"/>
+          <w:sz w:val="21"/>
+          <w:szCs w:val="21"/>
+        </w:rPr>
+        <w:t>{/section_content}</w:t>
+      </w:r>
+    </w:p>
+    <w:p>
+      <w:pPr>
+        <w:spacing w:after="0" w:line="22" w:lineRule="atLeast"/>
+        <w:rPr>
+          <w:rFonts w:cs="Segoe UI"/>
+          <w:color w:val="1A2634"/>
+          <w:sz w:val="21"/>
+          <w:szCs w:val="21"/>
+        </w:rPr>
+      </w:pPr>
+      <w:r>
+        <w:rPr>
+          <w:rFonts w:cs="Segoe UI"/>
+          <w:color w:val="1A2634"/>
+          <w:sz w:val="21"/>
+          <w:szCs w:val="21"/>
+        </w:rPr>
+        <w:t>{/extra_sections}</w:t>
       </w:r>
     </w:p>
     <w:p>
@@ -1961,23 +1525,7 @@
           <w:sz w:val="21"/>
           <w:szCs w:val="21"/>
         </w:rPr>
-        <w:t>{/</w:t>
-      </w:r>
-      <w:proofErr w:type="spellStart"/>
-      <w:r>
-        <w:rPr>
-          <w:sz w:val="21"/>
-          <w:szCs w:val="21"/>
-        </w:rPr>
-        <w:t>references_list</w:t>
-      </w:r>
-      <w:proofErr w:type="spellEnd"/>
-      <w:r>
-        <w:rPr>
-          <w:sz w:val="21"/>
-          <w:szCs w:val="21"/>
-        </w:rPr>
-        <w:t>}</w:t>
+        <w:t>{/references_list}</w:t>
       </w:r>
       <w:r>
         <w:rPr>

</xml_diff>

<commit_message>
Improve CV formatting and section styling
</commit_message>
<xml_diff>
--- a/templates/cv-template.docx
+++ b/templates/cv-template.docx
@@ -1961,7 +1961,21 @@
           <w:szCs w:val="21"/>
         </w:rPr>
         <w:br/>
-        <w:t>{email}, {phone}</w:t>
+      </w:r>
+      <w:r>
+        <w:rPr>
+          <w:color w:val="0070C0"/>
+          <w:sz w:val="21"/>
+          <w:szCs w:val="21"/>
+        </w:rPr>
+        <w:t>{email}</w:t>
+      </w:r>
+      <w:r>
+        <w:rPr>
+          <w:sz w:val="21"/>
+          <w:szCs w:val="21"/>
+        </w:rPr>
+        <w:t>, {phone}</w:t>
       </w:r>
     </w:p>
     <w:p>

</xml_diff>